<commit_message>
Update manual files with streaming data usage notice and comparison
</commit_message>
<xml_diff>
--- a/Cloud_BookReader_Manual.docx
+++ b/Cloud_BookReader_Manual.docx
@@ -13,7 +13,7 @@
           <w:color w:val="111827"/>
           <w:sz w:val="34"/>
         </w:rPr>
-        <w:t>【完全無料】Googleドライブの自炊本を全デバイスで爆速ストリーミング！「Cloud BookReader」の導入＆操作マニュアル</w:t>
+        <w:t>【完全無料】Googleドライブの自炊マンガ・書籍を全デバイスで爆速ストリーミング！「Cloud BookReader」の使い方ガイド</w:t>
       </w:r>
     </w:p>
     <w:p>
@@ -21,16 +21,16 @@
         <w:spacing w:after="90" w:line="288" w:lineRule="auto"/>
       </w:pPr>
       <w:r>
-        <w:t>Googleドライブに保存してある自炊マンガや書籍（PDF / ZIP / CBZ / EPUB）を、</w:t>
+        <w:t>Googleドライブに保存してある自炊マンガや電子書籍（PDF / ZIP / CBZ / EPUB）を、</w:t>
       </w:r>
       <w:r>
         <w:rPr>
           <w:b/>
         </w:rPr>
-        <w:t>ダウンロード待ち時間ゼロ・容量消費ゼロ</w:t>
+        <w:t>ダウンロード待ち時間ゼロ・端末の容量消費ゼロ</w:t>
       </w:r>
       <w:r>
-        <w:t xml:space="preserve"> で快適に読めるWebリーダーアプリ </w:t>
+        <w:t xml:space="preserve"> で快適に読めるWebリーダーサービス </w:t>
       </w:r>
       <w:r>
         <w:rPr>
@@ -47,7 +47,7 @@
         <w:spacing w:after="90" w:line="288" w:lineRule="auto"/>
       </w:pPr>
       <w:r>
-        <w:t>スマートフォン、タブレット、PCなどあらゆる端末からアクセスでき、</w:t>
+        <w:t>スマートフォン、タブレット、PCなどあらゆるデバイスに対応し、</w:t>
       </w:r>
       <w:r>
         <w:rPr>
@@ -64,16 +64,49 @@
         <w:spacing w:after="90" w:line="288" w:lineRule="auto"/>
       </w:pPr>
       <w:r>
-        <w:t>この記事では、Cloud BookReaderの魅力と、</w:t>
+        <w:t>面倒なアプリのインストールやアカウント登録、API設定などは一切不要。</w:t>
       </w:r>
       <w:r>
         <w:rPr>
           <w:b/>
         </w:rPr>
-        <w:t>完全無料・サーバー管理不要で自分の専用本棚を作成する手順</w:t>
+        <w:t>Googleアカウントでログインして自分の本棚フォルダを選ぶだけ（約10秒）</w:t>
       </w:r>
       <w:r>
-        <w:t xml:space="preserve"> をわかりやすく解説します。</w:t>
+        <w:t xml:space="preserve"> で、誰でも今すぐ無料で利用できます。</w:t>
+      </w:r>
+    </w:p>
+    <w:p>
+      <w:pPr>
+        <w:spacing w:after="80"/>
+      </w:pPr>
+    </w:p>
+    <w:p>
+      <w:pPr>
+        <w:spacing w:before="240" w:after="100"/>
+      </w:pPr>
+      <w:r>
+        <w:rPr>
+          <w:rFonts w:ascii="Yu Gothic" w:hAnsi="Yu Gothic" w:eastAsia="Yu Gothic"/>
+          <w:b/>
+          <w:color w:val="1D4ED8"/>
+          <w:sz w:val="27"/>
+        </w:rPr>
+        <w:t>🌐 サービスURL（今すぐ無料で使えます）</w:t>
+      </w:r>
+    </w:p>
+    <w:p>
+      <w:pPr>
+        <w:spacing w:after="90" w:line="288" w:lineRule="auto"/>
+      </w:pPr>
+      <w:r>
+        <w:t xml:space="preserve">👉 </w:t>
+      </w:r>
+      <w:r>
+        <w:rPr>
+          <w:b/>
+        </w:rPr>
+        <w:t>[https://cloud-bookreader.vercel.app](https://cloud-bookreader.vercel.app)</w:t>
       </w:r>
     </w:p>
     <w:p>
@@ -100,28 +133,13 @@
         <w:spacing w:after="90" w:line="288" w:lineRule="auto"/>
       </w:pPr>
       <w:r>
-        <w:t>!</w:t>
-      </w:r>
-      <w:r>
-        <w:rPr>
-          <w:color w:val="1D4ED8"/>
-          <w:u w:val="single"/>
-        </w:rPr>
-        <w:t>Cloud BookReader 本棚イメージ (https://raw.githubusercontent.com/ryo22-jp/Cloud-Bookreader/master/public/icon-512.png)</w:t>
-      </w:r>
-    </w:p>
-    <w:p>
-      <w:pPr>
-        <w:spacing w:after="90" w:line="288" w:lineRule="auto"/>
-      </w:pPr>
-      <w:r>
         <w:t xml:space="preserve">従来の電子書籍リーダーアプリのように </w:t>
       </w:r>
       <w:r>
         <w:rPr>
           <w:b/>
         </w:rPr>
-        <w:t>「端末に本を丸ごとダウンロードして空き容量を圧迫する」</w:t>
+        <w:t>「何百メガもある本をスマホに丸ごとダウンロードして空き容量を圧迫する」</w:t>
       </w:r>
       <w:r>
         <w:t xml:space="preserve"> 必要はもうありません。</w:t>
@@ -150,7 +168,7 @@
         <w:rPr>
           <w:b/>
         </w:rPr>
-        <w:t>⚡ ダウンロード待ち0秒（HTTP Range Request ストリーミング）</w:t>
+        <w:t>⚡ ダウンロード待ち0秒（HTTP Range Request ストリーミング技術）</w:t>
       </w:r>
     </w:p>
     <w:p>
@@ -159,7 +177,7 @@
         <w:spacing w:after="50"/>
       </w:pPr>
       <w:r>
-        <w:t>500MBを超える大容量のPDFやZIPマンガでも、</w:t>
+        <w:t>500MBを超える高画質PDFやZIPマンガでも、</w:t>
       </w:r>
       <w:r>
         <w:rPr>
@@ -168,7 +186,7 @@
         <w:t>「今開いているページだけ」</w:t>
       </w:r>
       <w:r>
-        <w:t xml:space="preserve"> をGoogleドライブから瞬時に取得。ギガを無駄遣いせず、開いた瞬間に読書が始まります。</w:t>
+        <w:t xml:space="preserve"> をGoogleドライブから瞬時に取得。端末容量を一切消費せず、開いた瞬間に読書が始まります。</w:t>
       </w:r>
     </w:p>
     <w:p>
@@ -200,7 +218,7 @@
         <w:t>appDataFolder</w:t>
       </w:r>
       <w:r>
-        <w:t>）に自動保存。マルチデバイスで完全に同期されます。</w:t>
+        <w:t>）に自動保存。PC・スマホ・タブレット間で自動同期されます。</w:t>
       </w:r>
     </w:p>
     <w:p>
@@ -290,7 +308,7 @@
         <w:rPr>
           <w:b/>
         </w:rPr>
-        <w:t>🎨 上質な2つの読書空間</w:t>
+        <w:t>🎨 目に優しい2つの読書空間</w:t>
       </w:r>
     </w:p>
     <w:p>
@@ -332,7 +350,7 @@
         <w:rPr>
           <w:b/>
         </w:rPr>
-        <w:t>🔒 完全無料＆最高峰のプライバシー保護</w:t>
+        <w:t>🛡️ あなたの本棚フォルダ以外には一切アクセスしない安全設計</w:t>
       </w:r>
     </w:p>
     <w:p>
@@ -341,16 +359,27 @@
         <w:spacing w:after="50"/>
       </w:pPr>
       <w:r>
-        <w:t>あなた専用の無料VercelアカウントとGoogleアカウントのみで動作するため、</w:t>
+        <w:t>Googleの最新セキュリティ（</w:t>
+      </w:r>
+      <w:r>
+        <w:rPr>
+          <w:rFonts w:ascii="Consolas" w:hAnsi="Consolas"/>
+          <w:color w:val="C0392B"/>
+          <w:sz w:val="19"/>
+        </w:rPr>
+        <w:t>drive.file</w:t>
+      </w:r>
+      <w:r>
+        <w:t xml:space="preserve"> スコープ）を採用。あなたが「本棚」として指定したフォルダ以外（プライベートな写真や仕事の書類など）には </w:t>
       </w:r>
       <w:r>
         <w:rPr>
           <w:b/>
         </w:rPr>
-        <w:t>第三者のサーバーにあなたの本や個人データが渡ることは物理的に一切ありません</w:t>
+        <w:t>システム上一切アクセスできない安心設計</w:t>
       </w:r>
       <w:r>
-        <w:t>。</w:t>
+        <w:t xml:space="preserve"> です。</w:t>
       </w:r>
     </w:p>
     <w:p>
@@ -369,7 +398,7 @@
           <w:color w:val="1D4ED8"/>
           <w:sz w:val="27"/>
         </w:rPr>
-        <w:t>🚀 5分でできる！自分専用の本棚を作る手順</w:t>
+        <w:t>⚠️ ご利用時の注意点・デメリット（通信について）</w:t>
       </w:r>
     </w:p>
     <w:p>
@@ -377,16 +406,231 @@
         <w:spacing w:after="90" w:line="288" w:lineRule="auto"/>
       </w:pPr>
       <w:r>
-        <w:t xml:space="preserve">導入は </w:t>
+        <w:t xml:space="preserve">本アプリをご利用いただくにあたり、一般的なダウンロード型リーダーアプリとの違いとして </w:t>
       </w:r>
       <w:r>
         <w:rPr>
           <w:b/>
         </w:rPr>
-        <w:t>「Googleの無料キー取得」→「ボタンを1回クリックしてデプロイ」</w:t>
+        <w:t>事前に知っておいていただきたい注意点（デメリット）</w:t>
       </w:r>
       <w:r>
-        <w:t xml:space="preserve"> の簡単2ステップです。</w:t>
+        <w:t xml:space="preserve"> がございます。</w:t>
+      </w:r>
+    </w:p>
+    <w:p>
+      <w:pPr>
+        <w:spacing w:before="180" w:after="60"/>
+      </w:pPr>
+      <w:r>
+        <w:rPr>
+          <w:rFonts w:ascii="Yu Gothic" w:hAnsi="Yu Gothic" w:eastAsia="Yu Gothic"/>
+          <w:b/>
+          <w:color w:val="374151"/>
+          <w:sz w:val="23"/>
+        </w:rPr>
+        <w:t>📡 読書中はリアルタイムでデータ通信が発生します（オフライン非対応）</w:t>
+      </w:r>
+    </w:p>
+    <w:p>
+      <w:pPr>
+        <w:pStyle w:val="ListBullet"/>
+        <w:spacing w:after="50"/>
+      </w:pPr>
+      <w:r>
+        <w:rPr>
+          <w:b/>
+        </w:rPr>
+        <w:t>一般的なリーダーアプリ</w:t>
+      </w:r>
+      <w:r>
+        <w:t>:</w:t>
+      </w:r>
+    </w:p>
+    <w:p>
+      <w:pPr>
+        <w:pStyle w:val="ListBullet"/>
+        <w:spacing w:after="50"/>
+      </w:pPr>
+      <w:r>
+        <w:t xml:space="preserve">自宅のWi-Fi環境で本を端末に丸ごと事前ダウンロードしておけば、外出中は </w:t>
+      </w:r>
+      <w:r>
+        <w:rPr>
+          <w:b/>
+        </w:rPr>
+        <w:t>「完全オフライン（通信量ゼロ・機内モード等）」</w:t>
+      </w:r>
+      <w:r>
+        <w:t xml:space="preserve"> で読書できます。</w:t>
+      </w:r>
+    </w:p>
+    <w:p>
+      <w:pPr>
+        <w:pStyle w:val="ListBullet"/>
+        <w:spacing w:after="50"/>
+      </w:pPr>
+      <w:r>
+        <w:rPr>
+          <w:b/>
+        </w:rPr>
+        <w:t>本アプリ（Cloud BookReader）</w:t>
+      </w:r>
+      <w:r>
+        <w:t>:</w:t>
+      </w:r>
+    </w:p>
+    <w:p>
+      <w:pPr>
+        <w:pStyle w:val="ListBullet"/>
+        <w:spacing w:after="50"/>
+      </w:pPr>
+      <w:r>
+        <w:t xml:space="preserve">端末の空き容量を圧迫せず、事前ダウンロードの待ち時間をなくすために </w:t>
+      </w:r>
+      <w:r>
+        <w:rPr>
+          <w:b/>
+        </w:rPr>
+        <w:t>「読んでいるページだけをGoogleドライブから都度ストリーミング取得する」</w:t>
+      </w:r>
+      <w:r>
+        <w:t xml:space="preserve"> 仕組みを採用しています。</w:t>
+      </w:r>
+    </w:p>
+    <w:p>
+      <w:pPr>
+        <w:pStyle w:val="ListBullet"/>
+        <w:spacing w:after="50"/>
+      </w:pPr>
+      <w:r>
+        <w:t>そのため、</w:t>
+      </w:r>
+      <w:r>
+        <w:rPr>
+          <w:b/>
+        </w:rPr>
+        <w:t>外出先での読書中もページをめくるごとにデータ通信が発生</w:t>
+      </w:r>
+      <w:r>
+        <w:t xml:space="preserve"> します（電波の届かない地下や機内モードでは閲覧できません）。</w:t>
+      </w:r>
+    </w:p>
+    <w:p>
+      <w:pPr>
+        <w:spacing w:before="180" w:after="60"/>
+      </w:pPr>
+      <w:r>
+        <w:rPr>
+          <w:rFonts w:ascii="Yu Gothic" w:hAnsi="Yu Gothic" w:eastAsia="Yu Gothic"/>
+          <w:b/>
+          <w:color w:val="374151"/>
+          <w:sz w:val="23"/>
+        </w:rPr>
+        <w:t>💡 通信量の目安とおすすめの使い分け</w:t>
+      </w:r>
+    </w:p>
+    <w:p>
+      <w:pPr>
+        <w:pStyle w:val="ListBullet"/>
+        <w:spacing w:after="50"/>
+      </w:pPr>
+      <w:r>
+        <w:rPr>
+          <w:b/>
+        </w:rPr>
+        <w:t>通信量について</w:t>
+      </w:r>
+      <w:r>
+        <w:t>:</w:t>
+      </w:r>
+    </w:p>
+    <w:p>
+      <w:pPr>
+        <w:pStyle w:val="ListBullet"/>
+        <w:spacing w:after="50"/>
+      </w:pPr>
+      <w:r>
+        <w:t>当アプリは「開いたページ画像のみ」をピンポイントで取得するため、YouTube等の動画視聴に比べれば通信量は非常に軽量（コミック1冊あたり数十MB程度）ですが、</w:t>
+      </w:r>
+      <w:r>
+        <w:rPr>
+          <w:b/>
+        </w:rPr>
+        <w:t>毎月のスマートフォンのギガ数（通信制限）が気になる方はご注意ください</w:t>
+      </w:r>
+      <w:r>
+        <w:t>。</w:t>
+      </w:r>
+    </w:p>
+    <w:p>
+      <w:pPr>
+        <w:pStyle w:val="ListBullet"/>
+        <w:spacing w:after="50"/>
+      </w:pPr>
+      <w:r>
+        <w:rPr>
+          <w:b/>
+        </w:rPr>
+        <w:t>こんな方におすすめ</w:t>
+      </w:r>
+      <w:r>
+        <w:t>:</w:t>
+      </w:r>
+    </w:p>
+    <w:p>
+      <w:pPr>
+        <w:pStyle w:val="ListBullet"/>
+        <w:spacing w:after="50"/>
+      </w:pPr>
+      <w:r>
+        <w:t xml:space="preserve">⭕ </w:t>
+      </w:r>
+      <w:r>
+        <w:rPr>
+          <w:b/>
+        </w:rPr>
+        <w:t>Cloud BookReader が向いている方</w:t>
+      </w:r>
+      <w:r>
+        <w:t>: 「スマホの容量がカツカツで重い本を何冊も保存できない」「事前ダウンロードなしで気分に合わせてすぐ読みたい」「PCとスマホで続きをシームレスに読みたい」方。</w:t>
+      </w:r>
+    </w:p>
+    <w:p>
+      <w:pPr>
+        <w:pStyle w:val="ListBullet"/>
+        <w:spacing w:after="50"/>
+      </w:pPr>
+      <w:r>
+        <w:t xml:space="preserve">⚠️ </w:t>
+      </w:r>
+      <w:r>
+        <w:rPr>
+          <w:b/>
+        </w:rPr>
+        <w:t>一般的なダウンロード型アプリが向いている方</w:t>
+      </w:r>
+      <w:r>
+        <w:t>: 「飛行機や地下鉄など電波のない場所で読みたい」「外出中はスマートフォンの通信量を1MBも使いたくない」方。</w:t>
+      </w:r>
+    </w:p>
+    <w:p>
+      <w:pPr>
+        <w:spacing w:after="80"/>
+      </w:pPr>
+    </w:p>
+    <w:p>
+      <w:pPr>
+        <w:spacing w:before="240" w:after="100"/>
+      </w:pPr>
+      <w:r>
+        <w:rPr>
+          <w:rFonts w:ascii="Yu Gothic" w:hAnsi="Yu Gothic" w:eastAsia="Yu Gothic"/>
+          <w:b/>
+          <w:color w:val="1D4ED8"/>
+          <w:sz w:val="27"/>
+        </w:rPr>
+        <w:t>🚀 かんたん3ステップ！使い方ガイド（所要時間：10秒）</w:t>
       </w:r>
     </w:p>
     <w:p>
@@ -402,15 +646,12 @@
         </w:rPr>
         <w:t>flowchart LR</w:t>
         <w:br/>
-        <w:t xml:space="preserve">    A["① Google Cloudで&lt;br/&gt;APIキーを取得（無料）"] --&gt; B["② 『Vercelで本棚を作成』&lt;br/&gt;ボタンをクリック"]</w:t>
+        <w:t xml:space="preserve">    A["① サイトにアクセス&lt;br/&gt;https://cloud-bookreader.vercel.app"] --&gt; B["② Googleでログイン"]</w:t>
         <w:br/>
-        <w:t xml:space="preserve">    B --&gt; C["③ あなた専用の&lt;br/&gt;クラウド本棚が完成！"]</w:t>
+        <w:t xml:space="preserve">    B --&gt; C["③ 本棚フォルダを1つ選択"]</w:t>
+        <w:br/>
+        <w:t xml:space="preserve">    C --&gt; D["🎉 いつでもどこでも&lt;br/&gt;快適読書スタート！"]</w:t>
       </w:r>
-    </w:p>
-    <w:p>
-      <w:pPr>
-        <w:spacing w:after="80"/>
-      </w:pPr>
     </w:p>
     <w:p>
       <w:pPr>
@@ -423,15 +664,26 @@
           <w:color w:val="374151"/>
           <w:sz w:val="23"/>
         </w:rPr>
-        <w:t>ステップ1: Google Cloud で無料APIキーを取得する</w:t>
+        <w:t>ステップ1: サイトにアクセスしてログイン</w:t>
       </w:r>
     </w:p>
     <w:p>
       <w:pPr>
-        <w:spacing w:after="90" w:line="288" w:lineRule="auto"/>
+        <w:pStyle w:val="ListNumber"/>
+        <w:spacing w:after="50"/>
       </w:pPr>
       <w:r>
-        <w:t>Googleドライブ内のファイルをアプリから安全に読み込むための「鍵（Client ID / Secret）」をGoogleから無料で取得します。</w:t>
+        <w:t xml:space="preserve">ブラウザで </w:t>
+      </w:r>
+      <w:r>
+        <w:rPr>
+          <w:color w:val="1D4ED8"/>
+          <w:u w:val="single"/>
+        </w:rPr>
+        <w:t>https://cloud-bookreader.vercel.app (https://cloud-bookreader.vercel.app)</w:t>
+      </w:r>
+      <w:r>
+        <w:t xml:space="preserve"> を開きます。</w:t>
       </w:r>
     </w:p>
     <w:p>
@@ -441,279 +693,13 @@
       </w:pPr>
       <w:r>
         <w:rPr>
-          <w:color w:val="1D4ED8"/>
-          <w:u w:val="single"/>
+          <w:b/>
         </w:rPr>
-        <w:t>Google Cloud Console (https://console.cloud.google.com/)</w:t>
+        <w:t>「Googleアカウントでログイン」</w:t>
       </w:r>
       <w:r>
-        <w:t xml:space="preserve"> にアクセスし、Googleアカウントでログインします。</w:t>
+        <w:t xml:space="preserve"> をクリックし、ご自身のGoogleアカウントを選択してログインします。</w:t>
       </w:r>
-    </w:p>
-    <w:p>
-      <w:pPr>
-        <w:pStyle w:val="ListNumber"/>
-        <w:spacing w:after="50"/>
-      </w:pPr>
-      <w:r>
-        <w:t xml:space="preserve">画面上部のプロジェクト選択から </w:t>
-      </w:r>
-      <w:r>
-        <w:rPr>
-          <w:b/>
-        </w:rPr>
-        <w:t>「新しいプロジェクト」</w:t>
-      </w:r>
-      <w:r>
-        <w:t xml:space="preserve"> を作成します（プロジェクト名は「MyBookReader」など何でもOK）。</w:t>
-      </w:r>
-    </w:p>
-    <w:p>
-      <w:pPr>
-        <w:pStyle w:val="ListNumber"/>
-        <w:spacing w:after="50"/>
-      </w:pPr>
-      <w:r>
-        <w:t xml:space="preserve">左メニューの </w:t>
-      </w:r>
-      <w:r>
-        <w:rPr>
-          <w:b/>
-        </w:rPr>
-        <w:t>「APIとサービス」→「ライブラリ」</w:t>
-      </w:r>
-      <w:r>
-        <w:t xml:space="preserve"> を開き、検索窓で </w:t>
-      </w:r>
-      <w:r>
-        <w:rPr>
-          <w:b/>
-        </w:rPr>
-        <w:t>`Google Drive API`</w:t>
-      </w:r>
-      <w:r>
-        <w:t xml:space="preserve"> を検索して </w:t>
-      </w:r>
-      <w:r>
-        <w:rPr>
-          <w:b/>
-        </w:rPr>
-        <w:t>「有効にする」</w:t>
-      </w:r>
-      <w:r>
-        <w:t xml:space="preserve"> をクリックします。</w:t>
-      </w:r>
-    </w:p>
-    <w:p>
-      <w:pPr>
-        <w:pStyle w:val="ListNumber"/>
-        <w:spacing w:after="50"/>
-      </w:pPr>
-      <w:r>
-        <w:t xml:space="preserve">左メニューの </w:t>
-      </w:r>
-      <w:r>
-        <w:rPr>
-          <w:b/>
-        </w:rPr>
-        <w:t>「OAuth 同意画面」</w:t>
-      </w:r>
-      <w:r>
-        <w:t xml:space="preserve"> を開きます：</w:t>
-      </w:r>
-    </w:p>
-    <w:p>
-      <w:pPr>
-        <w:pStyle w:val="ListBullet"/>
-        <w:spacing w:after="50"/>
-      </w:pPr>
-      <w:r>
-        <w:t xml:space="preserve">User Type: </w:t>
-      </w:r>
-      <w:r>
-        <w:rPr>
-          <w:b/>
-        </w:rPr>
-        <w:t>「外部」</w:t>
-      </w:r>
-      <w:r>
-        <w:t xml:space="preserve"> を選択して「作成」。</w:t>
-      </w:r>
-    </w:p>
-    <w:p>
-      <w:pPr>
-        <w:pStyle w:val="ListBullet"/>
-        <w:spacing w:after="50"/>
-      </w:pPr>
-      <w:r>
-        <w:t xml:space="preserve">アプリ名（例: </w:t>
-      </w:r>
-      <w:r>
-        <w:rPr>
-          <w:rFonts w:ascii="Consolas" w:hAnsi="Consolas"/>
-          <w:color w:val="C0392B"/>
-          <w:sz w:val="19"/>
-        </w:rPr>
-        <w:t>CloudReader</w:t>
-      </w:r>
-      <w:r>
-        <w:t>）、ユーザーサポートメール、デベロッパーの連絡先メールを入力して「保存して次へ」。</w:t>
-      </w:r>
-    </w:p>
-    <w:p>
-      <w:pPr>
-        <w:pStyle w:val="ListBullet"/>
-        <w:spacing w:after="50"/>
-      </w:pPr>
-      <w:r>
-        <w:rPr>
-          <w:b/>
-        </w:rPr>
-        <w:t>スコープの追加</w:t>
-      </w:r>
-      <w:r>
-        <w:t>: 「スコープを追加または削除」を押し、</w:t>
-      </w:r>
-      <w:r>
-        <w:rPr>
-          <w:rFonts w:ascii="Consolas" w:hAnsi="Consolas"/>
-          <w:color w:val="C0392B"/>
-          <w:sz w:val="19"/>
-        </w:rPr>
-        <w:t>.../auth/drive.readonly</w:t>
-      </w:r>
-      <w:r>
-        <w:t xml:space="preserve">（ドライブの読み取り専用）と </w:t>
-      </w:r>
-      <w:r>
-        <w:rPr>
-          <w:rFonts w:ascii="Consolas" w:hAnsi="Consolas"/>
-          <w:color w:val="C0392B"/>
-          <w:sz w:val="19"/>
-        </w:rPr>
-        <w:t>.../auth/drive.appdata</w:t>
-      </w:r>
-      <w:r>
-        <w:t>（しおり保存用）にチェックを入れて保存します。</w:t>
-      </w:r>
-    </w:p>
-    <w:p>
-      <w:pPr>
-        <w:pStyle w:val="ListBullet"/>
-        <w:spacing w:after="50"/>
-      </w:pPr>
-      <w:r>
-        <w:rPr>
-          <w:b/>
-        </w:rPr>
-        <w:t>テストユーザー</w:t>
-      </w:r>
-      <w:r>
-        <w:t>: 「＋ ADD USERS」を押し、</w:t>
-      </w:r>
-      <w:r>
-        <w:rPr>
-          <w:b/>
-        </w:rPr>
-        <w:t>ご自身のGmailアドレス</w:t>
-      </w:r>
-      <w:r>
-        <w:t xml:space="preserve"> を追加して保存します。</w:t>
-      </w:r>
-    </w:p>
-    <w:p>
-      <w:pPr>
-        <w:pStyle w:val="ListNumber"/>
-        <w:spacing w:after="50"/>
-      </w:pPr>
-      <w:r>
-        <w:t xml:space="preserve">左メニューの </w:t>
-      </w:r>
-      <w:r>
-        <w:rPr>
-          <w:b/>
-        </w:rPr>
-        <w:t>「認証情報」→「認証情報を作成」→「OAuth クライアント ID」</w:t>
-      </w:r>
-      <w:r>
-        <w:t xml:space="preserve"> をクリックします：</w:t>
-      </w:r>
-    </w:p>
-    <w:p>
-      <w:pPr>
-        <w:pStyle w:val="ListBullet"/>
-        <w:spacing w:after="50"/>
-      </w:pPr>
-      <w:r>
-        <w:t xml:space="preserve">アプリケーションの種類: </w:t>
-      </w:r>
-      <w:r>
-        <w:rPr>
-          <w:b/>
-        </w:rPr>
-        <w:t>「ウェブ アプリケーション」</w:t>
-      </w:r>
-      <w:r>
-        <w:t xml:space="preserve"> を選択。</w:t>
-      </w:r>
-    </w:p>
-    <w:p>
-      <w:pPr>
-        <w:pStyle w:val="ListBullet"/>
-        <w:spacing w:after="50"/>
-      </w:pPr>
-      <w:r>
-        <w:t xml:space="preserve">名前: </w:t>
-      </w:r>
-      <w:r>
-        <w:rPr>
-          <w:rFonts w:ascii="Consolas" w:hAnsi="Consolas"/>
-          <w:color w:val="C0392B"/>
-          <w:sz w:val="19"/>
-        </w:rPr>
-        <w:t>CloudReader Client</w:t>
-      </w:r>
-      <w:r>
-        <w:t>（任意）</w:t>
-      </w:r>
-    </w:p>
-    <w:p>
-      <w:pPr>
-        <w:pStyle w:val="ListBullet"/>
-        <w:spacing w:after="50"/>
-      </w:pPr>
-      <w:r>
-        <w:rPr>
-          <w:b/>
-        </w:rPr>
-        <w:t>「作成」</w:t>
-      </w:r>
-      <w:r>
-        <w:t xml:space="preserve"> を押すと、画面に </w:t>
-      </w:r>
-      <w:r>
-        <w:rPr>
-          <w:b/>
-        </w:rPr>
-        <w:t>「クライアント ID」</w:t>
-      </w:r>
-      <w:r>
-        <w:t xml:space="preserve"> と </w:t>
-      </w:r>
-      <w:r>
-        <w:rPr>
-          <w:b/>
-        </w:rPr>
-        <w:t>「クライアント シークレット」</w:t>
-      </w:r>
-      <w:r>
-        <w:t xml:space="preserve"> が表示されますので、メモしておきます。</w:t>
-      </w:r>
-    </w:p>
-    <w:p>
-      <w:pPr>
-        <w:spacing w:after="80"/>
-      </w:pPr>
     </w:p>
     <w:p>
       <w:pPr>
@@ -726,46 +712,7 @@
           <w:color w:val="374151"/>
           <w:sz w:val="23"/>
         </w:rPr>
-        <w:t>ステップ2: Vercel にワンクリックデプロイ（完全無料）</w:t>
-      </w:r>
-    </w:p>
-    <w:p>
-      <w:pPr>
-        <w:spacing w:after="90" w:line="288" w:lineRule="auto"/>
-      </w:pPr>
-      <w:r>
-        <w:t>下のボタンをクリックすると、世界最高峰のクラウドプラットフォーム「Vercel」にあなた専用のリーダーが自動構築されます。</w:t>
-      </w:r>
-    </w:p>
-    <w:p>
-      <w:pPr>
-        <w:spacing w:after="90" w:line="288" w:lineRule="auto"/>
-      </w:pPr>
-      <w:r>
-        <w:t>&lt;div align="center" style="margin: 24px 0;"&gt;</w:t>
-      </w:r>
-    </w:p>
-    <w:p>
-      <w:pPr>
-        <w:spacing w:after="90" w:line="288" w:lineRule="auto"/>
-      </w:pPr>
-      <w:r>
-        <w:rPr>
-          <w:color w:val="1D4ED8"/>
-          <w:u w:val="single"/>
-        </w:rPr>
-        <w:t>![Deploy with Vercel (https://vercel.com/button)</w:t>
-      </w:r>
-      <w:r>
-        <w:t>](https://vercel.com/new/clone?repository-url=https%3A%2F%2Fgithub.com%2Fryo22-jp%2FCloud-Bookreader&amp;env=GOOGLE_CLIENT_ID,GOOGLE_CLIENT_SECRET,NEXTAUTH_SECRET&amp;envDescription=Google%20Cloud%20Console%E3%81%A7%E5%8F%96%E5%BE%97%E3%81%97%E3%81%9F%E3%82%AF%E3%83%A9%E3%82%A4%E3%82%A0%E3%83%B3%E3%83%88ID%E3%80%81%E3%82%B7%E3%83%BC%E3%82%AF%E3%83%AC%E3%83%83%E3%83%88%E3%80%81%E4%BB%BB%E6%84%8F%E3%81%AE%E3%83%A9%E3%83%B3%E3%83%80%E3%83%A0%E6%96%87%E5%AD%97%E5%88%97(NEXTAUTH_SECRET)%E3%82%92%E5%85%A5%E5%8A%9B%E3%81%97%E3%81%A6%E3%81%8F%E3%81%A0%E3%81%95%E3%81%84%E3%80%82)</w:t>
-      </w:r>
-    </w:p>
-    <w:p>
-      <w:pPr>
-        <w:spacing w:after="90" w:line="288" w:lineRule="auto"/>
-      </w:pPr>
-      <w:r>
-        <w:t>&lt;/div&gt;</w:t>
+        <w:t>ステップ2: 本棚にするフォルダを選択（初回のみ）</w:t>
       </w:r>
     </w:p>
     <w:p>
@@ -774,7 +721,16 @@
         <w:spacing w:after="50"/>
       </w:pPr>
       <w:r>
-        <w:t>Vercelのアカウント（無料）にGitHubでログインします。</w:t>
+        <w:t xml:space="preserve">画面中央の </w:t>
+      </w:r>
+      <w:r>
+        <w:rPr>
+          <w:b/>
+        </w:rPr>
+        <w:t>「Googleドライブから本棚フォルダを選択」</w:t>
+      </w:r>
+      <w:r>
+        <w:t xml:space="preserve"> ボタンをクリックします。</w:t>
       </w:r>
     </w:p>
     <w:p>
@@ -783,110 +739,17 @@
         <w:spacing w:after="50"/>
       </w:pPr>
       <w:r>
-        <w:t xml:space="preserve">画面の </w:t>
+        <w:t xml:space="preserve">Google公式のフォルダ選択画面が開きますので、マンガや書籍が入っている </w:t>
       </w:r>
       <w:r>
         <w:rPr>
           <w:b/>
         </w:rPr>
-        <w:t>「Environment Variables（環境変数）」</w:t>
+        <w:t>「マンガ」や「自炊本」フォルダを選択して「選択」</w:t>
       </w:r>
       <w:r>
-        <w:t xml:space="preserve"> に、ステップ1で取得した値を入力します：</w:t>
+        <w:t xml:space="preserve"> を押します。</w:t>
       </w:r>
-    </w:p>
-    <w:p>
-      <w:pPr>
-        <w:pStyle w:val="ListBullet"/>
-        <w:spacing w:after="50"/>
-      </w:pPr>
-      <w:r>
-        <w:rPr>
-          <w:rFonts w:ascii="Consolas" w:hAnsi="Consolas"/>
-          <w:color w:val="C0392B"/>
-          <w:sz w:val="19"/>
-        </w:rPr>
-        <w:t>GOOGLE_CLIENT_ID</w:t>
-      </w:r>
-      <w:r>
-        <w:t>: ステップ1で取得したクライアントID</w:t>
-      </w:r>
-    </w:p>
-    <w:p>
-      <w:pPr>
-        <w:pStyle w:val="ListBullet"/>
-        <w:spacing w:after="50"/>
-      </w:pPr>
-      <w:r>
-        <w:rPr>
-          <w:rFonts w:ascii="Consolas" w:hAnsi="Consolas"/>
-          <w:color w:val="C0392B"/>
-          <w:sz w:val="19"/>
-        </w:rPr>
-        <w:t>GOOGLE_CLIENT_SECRET</w:t>
-      </w:r>
-      <w:r>
-        <w:t>: ステップ1で取得したクライアントシークレット</w:t>
-      </w:r>
-    </w:p>
-    <w:p>
-      <w:pPr>
-        <w:pStyle w:val="ListBullet"/>
-        <w:spacing w:after="50"/>
-      </w:pPr>
-      <w:r>
-        <w:rPr>
-          <w:rFonts w:ascii="Consolas" w:hAnsi="Consolas"/>
-          <w:color w:val="C0392B"/>
-          <w:sz w:val="19"/>
-        </w:rPr>
-        <w:t>NEXTAUTH_SECRET</w:t>
-      </w:r>
-      <w:r>
-        <w:t xml:space="preserve">: 適当な英数字のランダムな文字列（例: </w:t>
-      </w:r>
-      <w:r>
-        <w:rPr>
-          <w:rFonts w:ascii="Consolas" w:hAnsi="Consolas"/>
-          <w:color w:val="C0392B"/>
-          <w:sz w:val="19"/>
-        </w:rPr>
-        <w:t>my-secret-key-12345678</w:t>
-      </w:r>
-      <w:r>
-        <w:t>）</w:t>
-      </w:r>
-    </w:p>
-    <w:p>
-      <w:pPr>
-        <w:pStyle w:val="ListNumber"/>
-        <w:spacing w:after="50"/>
-      </w:pPr>
-      <w:r>
-        <w:rPr>
-          <w:b/>
-        </w:rPr>
-        <w:t>「Deploy」</w:t>
-      </w:r>
-      <w:r>
-        <w:t xml:space="preserve"> をクリックします。約1分であなた専用のURL（例: </w:t>
-      </w:r>
-      <w:r>
-        <w:rPr>
-          <w:rFonts w:ascii="Consolas" w:hAnsi="Consolas"/>
-          <w:color w:val="C0392B"/>
-          <w:sz w:val="19"/>
-        </w:rPr>
-        <w:t>https://your-app-name.vercel.app</w:t>
-      </w:r>
-      <w:r>
-        <w:t>）が発行されます！</w:t>
-      </w:r>
-    </w:p>
-    <w:p>
-      <w:pPr>
-        <w:spacing w:after="80"/>
-      </w:pPr>
     </w:p>
     <w:p>
       <w:pPr>
@@ -899,7 +762,7 @@
           <w:color w:val="374151"/>
           <w:sz w:val="23"/>
         </w:rPr>
-        <w:t>ステップ3: Google Cloud に本番URLを登録（仕上げ）</w:t>
+        <w:t>ステップ3: 読書スタート！</w:t>
       </w:r>
     </w:p>
     <w:p>
@@ -907,113 +770,7 @@
         <w:spacing w:after="90" w:line="288" w:lineRule="auto"/>
       </w:pPr>
       <w:r>
-        <w:t>発行されたVercelのURLでGoogleログインを許可するために、最後の1分設定を行います。</w:t>
-      </w:r>
-    </w:p>
-    <w:p>
-      <w:pPr>
-        <w:pStyle w:val="ListNumber"/>
-        <w:spacing w:after="50"/>
-      </w:pPr>
-      <w:r>
-        <w:rPr>
-          <w:color w:val="1D4ED8"/>
-          <w:u w:val="single"/>
-        </w:rPr>
-        <w:t>Google Cloud Console (認証情報) (https://console.cloud.google.com/apis/credentials)</w:t>
-      </w:r>
-      <w:r>
-        <w:t xml:space="preserve"> を開き、作成した「OAuth 2.0 クライアント ID」をクリックします。</w:t>
-      </w:r>
-    </w:p>
-    <w:p>
-      <w:pPr>
-        <w:pStyle w:val="ListNumber"/>
-        <w:spacing w:after="50"/>
-      </w:pPr>
-      <w:r>
-        <w:rPr>
-          <w:b/>
-        </w:rPr>
-        <w:t>「承認済みの JavaScript 生成元」</w:t>
-      </w:r>
-      <w:r>
-        <w:t xml:space="preserve"> に追加：</w:t>
-      </w:r>
-    </w:p>
-    <w:p>
-      <w:pPr>
-        <w:spacing w:before="60" w:after="120"/>
-        <w:ind w:left="288"/>
-      </w:pPr>
-      <w:r>
-        <w:rPr>
-          <w:rFonts w:ascii="Consolas" w:hAnsi="Consolas"/>
-          <w:color w:val="333333"/>
-          <w:sz w:val="19"/>
-        </w:rPr>
-        <w:t xml:space="preserve">   https://あなたのアプリ名.vercel.app</w:t>
-      </w:r>
-    </w:p>
-    <w:p>
-      <w:pPr>
-        <w:pStyle w:val="ListNumber"/>
-        <w:spacing w:after="50"/>
-      </w:pPr>
-      <w:r>
-        <w:rPr>
-          <w:b/>
-        </w:rPr>
-        <w:t>「承認済みのリダイレクト URI」</w:t>
-      </w:r>
-      <w:r>
-        <w:t xml:space="preserve"> に追加：</w:t>
-      </w:r>
-    </w:p>
-    <w:p>
-      <w:pPr>
-        <w:spacing w:before="60" w:after="120"/>
-        <w:ind w:left="288"/>
-      </w:pPr>
-      <w:r>
-        <w:rPr>
-          <w:rFonts w:ascii="Consolas" w:hAnsi="Consolas"/>
-          <w:color w:val="333333"/>
-          <w:sz w:val="19"/>
-        </w:rPr>
-        <w:t xml:space="preserve">   https://あなたのアプリ名.vercel.app/api/auth/callback/google</w:t>
-      </w:r>
-    </w:p>
-    <w:p>
-      <w:pPr>
-        <w:pStyle w:val="ListNumber"/>
-        <w:spacing w:after="50"/>
-      </w:pPr>
-      <w:r>
-        <w:t xml:space="preserve">最下部の </w:t>
-      </w:r>
-      <w:r>
-        <w:rPr>
-          <w:b/>
-        </w:rPr>
-        <w:t>「保存」</w:t>
-      </w:r>
-      <w:r>
-        <w:t xml:space="preserve"> をクリックします。</w:t>
-      </w:r>
-    </w:p>
-    <w:p>
-      <w:pPr>
-        <w:spacing w:after="90" w:line="288" w:lineRule="auto"/>
-      </w:pPr>
-      <w:r>
-        <w:t xml:space="preserve">🎉 </w:t>
-      </w:r>
-      <w:r>
-        <w:rPr>
-          <w:b/>
-        </w:rPr>
-        <w:t>これでセットアップはすべて完了です！発行されたURLを開いてログインしてください。</w:t>
+        <w:t>選択したフォルダ内の本やサブフォルダ（1巻、2巻...）が一覧表示されます。読みたい本をタップすれば、すぐにストリーミング読書が始まります！</w:t>
       </w:r>
     </w:p>
     <w:p>
@@ -1040,22 +797,21 @@
         <w:spacing w:after="90" w:line="288" w:lineRule="auto"/>
       </w:pPr>
       <w:r>
-        <w:t>ブラウザのアドレスバーを消して、専用アプリのように全画面で読書するための設定です。</w:t>
+        <w:t>ブラウザのアドレスバーを非表示にし、専用アプリのように全画面で読書するための設定です。</w:t>
       </w:r>
     </w:p>
     <w:p>
       <w:pPr>
-        <w:pStyle w:val="ListBullet"/>
-        <w:spacing w:after="50"/>
+        <w:spacing w:before="180" w:after="60"/>
       </w:pPr>
       <w:r>
         <w:rPr>
+          <w:rFonts w:ascii="Yu Gothic" w:hAnsi="Yu Gothic" w:eastAsia="Yu Gothic"/>
           <w:b/>
+          <w:color w:val="374151"/>
+          <w:sz w:val="23"/>
         </w:rPr>
-        <w:t>iPhone / iPad (Safari)</w:t>
-      </w:r>
-      <w:r>
-        <w:t>:</w:t>
+        <w:t>🍎 iPhone / iPad (Safari)</w:t>
       </w:r>
     </w:p>
     <w:p>
@@ -1064,7 +820,17 @@
         <w:spacing w:after="50"/>
       </w:pPr>
       <w:r>
-        <w:t>Safariでご自身のVercelのURLを開きます。</w:t>
+        <w:t xml:space="preserve">Safariで </w:t>
+      </w:r>
+      <w:r>
+        <w:rPr>
+          <w:color w:val="1D4ED8"/>
+          <w:u w:val="single"/>
+        </w:rPr>
+        <w:t>https://cloud-bookreader.vercel.app (https://cloud-bookreader.vercel.app)</w:t>
+      </w:r>
+      <w:r>
+        <w:t xml:space="preserve"> を開きます。</w:t>
       </w:r>
     </w:p>
     <w:p>
@@ -1073,7 +839,7 @@
         <w:spacing w:after="50"/>
       </w:pPr>
       <w:r>
-        <w:t xml:space="preserve">画面下部の </w:t>
+        <w:t xml:space="preserve">画面下部の中央にある </w:t>
       </w:r>
       <w:r>
         <w:rPr>
@@ -1082,7 +848,76 @@
         <w:t>「共有ボタン（四角から上矢印）」</w:t>
       </w:r>
       <w:r>
-        <w:t xml:space="preserve"> をタップ。</w:t>
+        <w:t xml:space="preserve"> をタップします。</w:t>
+      </w:r>
+    </w:p>
+    <w:p>
+      <w:pPr>
+        <w:pStyle w:val="ListNumber"/>
+        <w:spacing w:after="50"/>
+      </w:pPr>
+      <w:r>
+        <w:t xml:space="preserve">メニューから </w:t>
+      </w:r>
+      <w:r>
+        <w:rPr>
+          <w:b/>
+        </w:rPr>
+        <w:t>「ホーム画面に追加」</w:t>
+      </w:r>
+      <w:r>
+        <w:t xml:space="preserve"> を選択します。</w:t>
+      </w:r>
+    </w:p>
+    <w:p>
+      <w:pPr>
+        <w:spacing w:before="180" w:after="60"/>
+      </w:pPr>
+      <w:r>
+        <w:rPr>
+          <w:rFonts w:ascii="Yu Gothic" w:hAnsi="Yu Gothic" w:eastAsia="Yu Gothic"/>
+          <w:b/>
+          <w:color w:val="374151"/>
+          <w:sz w:val="23"/>
+        </w:rPr>
+        <w:t>🤖 Android (Chrome)</w:t>
+      </w:r>
+    </w:p>
+    <w:p>
+      <w:pPr>
+        <w:pStyle w:val="ListNumber"/>
+        <w:spacing w:after="50"/>
+      </w:pPr>
+      <w:r>
+        <w:t xml:space="preserve">Chromeで </w:t>
+      </w:r>
+      <w:r>
+        <w:rPr>
+          <w:color w:val="1D4ED8"/>
+          <w:u w:val="single"/>
+        </w:rPr>
+        <w:t>https://cloud-bookreader.vercel.app (https://cloud-bookreader.vercel.app)</w:t>
+      </w:r>
+      <w:r>
+        <w:t xml:space="preserve"> を開きます。</w:t>
+      </w:r>
+    </w:p>
+    <w:p>
+      <w:pPr>
+        <w:pStyle w:val="ListNumber"/>
+        <w:spacing w:after="50"/>
+      </w:pPr>
+      <w:r>
+        <w:t xml:space="preserve">右上の </w:t>
+      </w:r>
+      <w:r>
+        <w:rPr>
+          <w:b/>
+        </w:rPr>
+        <w:t>「3点メニュー（︙）」</w:t>
+      </w:r>
+      <w:r>
+        <w:t xml:space="preserve"> をタップします。</w:t>
       </w:r>
     </w:p>
     <w:p>
@@ -1094,52 +929,10 @@
         <w:rPr>
           <w:b/>
         </w:rPr>
-        <w:t>「ホーム画面に追加」</w:t>
-      </w:r>
-      <w:r>
-        <w:t xml:space="preserve"> を選択。</w:t>
-      </w:r>
-    </w:p>
-    <w:p>
-      <w:pPr>
-        <w:pStyle w:val="ListBullet"/>
-        <w:spacing w:after="50"/>
-      </w:pPr>
-      <w:r>
-        <w:rPr>
-          <w:b/>
-        </w:rPr>
-        <w:t>Android (Chrome)</w:t>
-      </w:r>
-      <w:r>
-        <w:t>:</w:t>
-      </w:r>
-    </w:p>
-    <w:p>
-      <w:pPr>
-        <w:pStyle w:val="ListNumber"/>
-        <w:spacing w:after="50"/>
-      </w:pPr>
-      <w:r>
-        <w:t>ChromeでURLを開きます。</w:t>
-      </w:r>
-    </w:p>
-    <w:p>
-      <w:pPr>
-        <w:pStyle w:val="ListNumber"/>
-        <w:spacing w:after="50"/>
-      </w:pPr>
-      <w:r>
-        <w:t xml:space="preserve">右上の「3点メニュー」→ </w:t>
-      </w:r>
-      <w:r>
-        <w:rPr>
-          <w:b/>
-        </w:rPr>
         <w:t>「アプリをインストール」</w:t>
       </w:r>
       <w:r>
-        <w:t>（または「ホーム画面に追加」）をタップ。</w:t>
+        <w:t>（または「ホーム画面に追加」）を選択します。</w:t>
       </w:r>
     </w:p>
     <w:p>
@@ -1147,7 +940,16 @@
         <w:spacing w:after="90" w:line="288" w:lineRule="auto"/>
       </w:pPr>
       <w:r>
-        <w:t>ホーム画面にできた「CloudReader」アイコンをタップすると、ネイティブアプリ感覚で読書が楽しめます！</w:t>
+        <w:t xml:space="preserve">ホーム画面に作成された </w:t>
+      </w:r>
+      <w:r>
+        <w:rPr>
+          <w:b/>
+        </w:rPr>
+        <w:t>「CloudReader」</w:t>
+      </w:r>
+      <w:r>
+        <w:t xml:space="preserve"> アイコンをタップするだけで、いつでもワンタップで全画面リーダーが起動します！</w:t>
       </w:r>
     </w:p>
     <w:p>
@@ -1180,7 +982,7 @@
           <w:color w:val="374151"/>
           <w:sz w:val="23"/>
         </w:rPr>
-        <w:t>1. お気に入りの「マンガフォルダ」を本棚トップに固定</w:t>
+        <w:t>1. 1巻から2巻へのスムーズな読み進め</w:t>
       </w:r>
     </w:p>
     <w:p>
@@ -1188,16 +990,25 @@
         <w:spacing w:after="90" w:line="288" w:lineRule="auto"/>
       </w:pPr>
       <w:r>
-        <w:t xml:space="preserve">Googleドライブの階層が深くても、いつも本を入れているフォルダを開いて </w:t>
+        <w:t xml:space="preserve">本を読み終わって左上の </w:t>
       </w:r>
       <w:r>
         <w:rPr>
           <w:b/>
         </w:rPr>
-        <w:t>「このフォルダを本棚トップにする」</w:t>
+        <w:t>「←（戻る）」</w:t>
       </w:r>
       <w:r>
-        <w:t xml:space="preserve"> を押せば、次回以降はそのフォルダが直接本棚として開きます。</w:t>
+        <w:t xml:space="preserve"> を押すと、</w:t>
+      </w:r>
+      <w:r>
+        <w:rPr>
+          <w:b/>
+        </w:rPr>
+        <w:t>直前に開いていたフォルダ階層に自動復帰</w:t>
+      </w:r>
+      <w:r>
+        <w:t xml:space="preserve"> します。トップに戻されることなく、迷わず次の巻を開くことができます。</w:t>
       </w:r>
     </w:p>
     <w:p>
@@ -1211,7 +1022,7 @@
           <w:color w:val="374151"/>
           <w:sz w:val="23"/>
         </w:rPr>
-        <w:t>2. 1巻から2巻へのスムーズな読み進め</w:t>
+        <w:t>2. 「続きから読む」と履歴の整理</w:t>
       </w:r>
     </w:p>
     <w:p>
@@ -1219,16 +1030,16 @@
         <w:spacing w:after="90" w:line="288" w:lineRule="auto"/>
       </w:pPr>
       <w:r>
-        <w:t>本を読み終わって左上の「← 戻る」を押すと、</w:t>
+        <w:t xml:space="preserve">トップ画面には、直近で読んでいる本が最大5件まで進捗率（読書率）付きで並びます。読み終わった本や不要になった履歴は、右側の </w:t>
       </w:r>
       <w:r>
         <w:rPr>
           <w:b/>
         </w:rPr>
-        <w:t>直前に開いていたフォルダ階層に自動復帰</w:t>
+        <w:t>「×ボタン」</w:t>
       </w:r>
       <w:r>
-        <w:t xml:space="preserve"> します。迷わずすぐに次の巻を開くことができます。</w:t>
+        <w:t xml:space="preserve"> でいつでも整理できます。</w:t>
       </w:r>
     </w:p>
     <w:p>
@@ -1242,7 +1053,7 @@
           <w:color w:val="374151"/>
           <w:sz w:val="23"/>
         </w:rPr>
-        <w:t>3. 「続きから読む」と履歴の整理</w:t>
+        <w:t>3. 本棚フォルダの切り替え</w:t>
       </w:r>
     </w:p>
     <w:p>
@@ -1250,16 +1061,16 @@
         <w:spacing w:after="90" w:line="288" w:lineRule="auto"/>
       </w:pPr>
       <w:r>
-        <w:t xml:space="preserve">トップ画面には、直近で読んでいる本が最大5件まで進捗率付きで並びます。読み終わった本や不要になった履歴は、右側の </w:t>
+        <w:t xml:space="preserve">別のフォルダ（小説フォルダなど）を読みたい時は、上部の </w:t>
       </w:r>
       <w:r>
         <w:rPr>
           <w:b/>
         </w:rPr>
-        <w:t>「×ボタン」</w:t>
+        <w:t>「📁 本棚フォルダ変更」</w:t>
       </w:r>
       <w:r>
-        <w:t xml:space="preserve"> でいつでも綺麗に削除できます。</w:t>
+        <w:t xml:space="preserve"> ボタンを押すだけで、いつでも別のフォルダに切り替えられます。</w:t>
       </w:r>
     </w:p>
     <w:p>
@@ -1273,7 +1084,7 @@
           <w:color w:val="374151"/>
           <w:sz w:val="23"/>
         </w:rPr>
-        <w:t>4. 快適なリーダー操作</w:t>
+        <w:t>4. リーダー画面の操作</w:t>
       </w:r>
     </w:p>
     <w:p>
@@ -1347,7 +1158,7 @@
           <w:color w:val="374151"/>
           <w:sz w:val="23"/>
         </w:rPr>
-        <w:t>Q. Googleログイン時に「このアプリは確認されていません」と表示されます</w:t>
+        <w:t>Q. 完全無料で利用できますか？</w:t>
       </w:r>
     </w:p>
     <w:p>
@@ -1360,20 +1171,7 @@
           <w:i/>
           <w:color w:val="4B5563"/>
         </w:rPr>
-        <w:t>個人開発の自作アプリのため表示される標準的な確認画面です。</w:t>
-      </w:r>
-    </w:p>
-    <w:p>
-      <w:pPr>
-        <w:spacing w:before="40" w:after="60"/>
-        <w:ind w:left="288"/>
-      </w:pPr>
-      <w:r>
-        <w:rPr>
-          <w:i/>
-          <w:color w:val="4B5563"/>
-        </w:rPr>
-        <w:t>画面左下の **「詳細」** を押し、**「（安全ではないページ）に移動」** をクリックしてご自身のGoogleアカウントでログインしてください。</w:t>
+        <w:t>はい、完全無料です。利用料金や課金は一切発生しません。</w:t>
       </w:r>
     </w:p>
     <w:p>
@@ -1387,7 +1185,7 @@
           <w:color w:val="374151"/>
           <w:sz w:val="23"/>
         </w:rPr>
-        <w:t>Q. 完全無料でずっと使えますか？</w:t>
+        <w:t>Q. Googleドライブ内のプライベートなファイルを見られる心配はありませんか？</w:t>
       </w:r>
     </w:p>
     <w:p>
@@ -1400,7 +1198,7 @@
           <w:i/>
           <w:color w:val="4B5563"/>
         </w:rPr>
-        <w:t>はい。Google Cloud API の無料枠および Vercel の Hobbyプラン（無料）の範囲内で完全に運用できるため、月額費用やサーバー代は一切かかりません。</w:t>
+        <w:t>一切ありません。Googleの公式安全規格（`drive.file`）に準拠しており、あなたが「本棚」として選択したフォルダ以外のデータ（写真やドキュメントなど）には、アプリ側から一切アクセスできない仕組みになっています。また、ファイルが開発者のサーバーに保存されることもありません。</w:t>
       </w:r>
     </w:p>
     <w:p>
@@ -1414,7 +1212,7 @@
           <w:color w:val="374151"/>
           <w:sz w:val="23"/>
         </w:rPr>
-        <w:t>Q. 他の人に自分のGoogleドライブの中身を見られる心配はありませんか？</w:t>
+        <w:t>Q. ログイン時に「確認されていません」と表示された場合は？</w:t>
       </w:r>
     </w:p>
     <w:p>
@@ -1427,7 +1225,7 @@
           <w:i/>
           <w:color w:val="4B5563"/>
         </w:rPr>
-        <w:t>一切ありません。このアプリはあなた自身のプライベートなVercel環境とGoogle APIでのみ通信するため、開発者を含めた第三者があなたのファイルにアクセスすることは構造上不可能です。</w:t>
+        <w:t>個人開発サービスのため初回のみ表示される場合があります。画面左下の **「詳細」** を押し、**「（安全ではないページ）に移動」** をクリックして進んでいただくことで正常にご利用いただけます。</w:t>
       </w:r>
     </w:p>
     <w:p>
@@ -1440,7 +1238,7 @@
         <w:spacing w:after="90" w:line="288" w:lineRule="auto"/>
       </w:pPr>
       <w:r>
-        <w:t>快適なクラウド読書ライフをお楽しみください！☕📖</w:t>
+        <w:t>お気に入りの自炊本とともに、快適なクラウド読書ライフをお楽しみください！☕📖</w:t>
       </w:r>
     </w:p>
     <w:sectPr>

</xml_diff>

<commit_message>
Update manuals with offline reading guide
</commit_message>
<xml_diff>
--- a/Cloud_BookReader_Manual.docx
+++ b/Cloud_BookReader_Manual.docx
@@ -106,7 +106,7 @@
         <w:rPr>
           <w:b/>
         </w:rPr>
-        <w:t>[https://cloud-bookreader.vercel.app](https://cloud-bookreader.vercel.app)</w:t>
+        <w:t>[https://reader.puzzleout.net](https://reader.puzzleout.net)</w:t>
       </w:r>
     </w:p>
     <w:p>
@@ -186,7 +186,37 @@
         <w:t>「今開いているページだけ」</w:t>
       </w:r>
       <w:r>
-        <w:t xml:space="preserve"> をGoogleドライブから瞬時に取得。端末容量を一切消費せず、開いた瞬間に読書が始まります。</w:t>
+        <w:t xml:space="preserve"> をGoogleドライブから瞬時に取得。端末容量を消費せず、開いた瞬間に読書が始まります。</w:t>
+      </w:r>
+    </w:p>
+    <w:p>
+      <w:pPr>
+        <w:pStyle w:val="ListNumber"/>
+        <w:spacing w:after="50"/>
+      </w:pPr>
+      <w:r>
+        <w:rPr>
+          <w:b/>
+        </w:rPr>
+        <w:t>📥 【新機能】最大5冊までのオフライン保存（機内モード・ギガ節約対応）</w:t>
+      </w:r>
+    </w:p>
+    <w:p>
+      <w:pPr>
+        <w:pStyle w:val="ListBullet"/>
+        <w:spacing w:after="50"/>
+      </w:pPr>
+      <w:r>
+        <w:t>外出先や地下鉄、飛行機の中で読みたい本だけ、</w:t>
+      </w:r>
+      <w:r>
+        <w:rPr>
+          <w:b/>
+        </w:rPr>
+        <w:t>自宅のWi-Fi環境でワンタップ事前ダウンロード（最大5冊・約500MB）</w:t>
+      </w:r>
+      <w:r>
+        <w:t xml:space="preserve"> できます。端末へのアクセス許可ダイアログなどは一切不要で、ブラウザ内部の安全な保管庫に保存され、通信ゼロで爆速読書できます。</w:t>
       </w:r>
     </w:p>
     <w:p>
@@ -359,7 +389,7 @@
         <w:spacing w:after="50"/>
       </w:pPr>
       <w:r>
-        <w:t>Googleの最新セキュリティ（</w:t>
+        <w:t>Googleの公式最新セキュリティ（</w:t>
       </w:r>
       <w:r>
         <w:rPr>
@@ -398,7 +428,7 @@
           <w:color w:val="1D4ED8"/>
           <w:sz w:val="27"/>
         </w:rPr>
-        <w:t>⚠️ ご利用時の注意点・デメリット（通信について）</w:t>
+        <w:t>💡 ストリーミングとオフライン保存の賢い使い分け</w:t>
       </w:r>
     </w:p>
     <w:p>
@@ -406,212 +436,49 @@
         <w:spacing w:after="90" w:line="288" w:lineRule="auto"/>
       </w:pPr>
       <w:r>
-        <w:t xml:space="preserve">本アプリをご利用いただくにあたり、一般的なダウンロード型リーダーアプリとの違いとして </w:t>
+        <w:t>| モード | メリット | こんな時におすすめ |</w:t>
+      </w:r>
+    </w:p>
+    <w:p>
+      <w:pPr>
+        <w:spacing w:after="90" w:line="288" w:lineRule="auto"/>
+      </w:pPr>
+      <w:r>
+        <w:t>| :--- | :--- | :--- |</w:t>
+      </w:r>
+    </w:p>
+    <w:p>
+      <w:pPr>
+        <w:spacing w:after="90" w:line="288" w:lineRule="auto"/>
+      </w:pPr>
+      <w:r>
+        <w:t xml:space="preserve">| </w:t>
       </w:r>
       <w:r>
         <w:rPr>
           <w:b/>
         </w:rPr>
-        <w:t>事前に知っておいていただきたい注意点（デメリット）</w:t>
+        <w:t>⚡ 通常ストリーミング</w:t>
       </w:r>
       <w:r>
-        <w:t xml:space="preserve"> がございます。</w:t>
+        <w:t xml:space="preserve"> | 容量消費ゼロ・待ち時間ゼロ | 自宅やWi-Fi環境、数ページだけの試し読み、何千冊ものライブラリを自由に読みたい時 |</w:t>
       </w:r>
     </w:p>
     <w:p>
       <w:pPr>
-        <w:spacing w:before="180" w:after="60"/>
+        <w:spacing w:after="90" w:line="288" w:lineRule="auto"/>
       </w:pPr>
       <w:r>
-        <w:rPr>
-          <w:rFonts w:ascii="Yu Gothic" w:hAnsi="Yu Gothic" w:eastAsia="Yu Gothic"/>
-          <w:b/>
-          <w:color w:val="374151"/>
-          <w:sz w:val="23"/>
-        </w:rPr>
-        <w:t>📡 読書中はリアルタイムでデータ通信が発生します（オフライン非対応）</w:t>
-      </w:r>
-    </w:p>
-    <w:p>
-      <w:pPr>
-        <w:pStyle w:val="ListBullet"/>
-        <w:spacing w:after="50"/>
-      </w:pPr>
-      <w:r>
-        <w:rPr>
-          <w:b/>
-        </w:rPr>
-        <w:t>一般的なリーダーアプリ</w:t>
-      </w:r>
-      <w:r>
-        <w:t>:</w:t>
-      </w:r>
-    </w:p>
-    <w:p>
-      <w:pPr>
-        <w:pStyle w:val="ListBullet"/>
-        <w:spacing w:after="50"/>
-      </w:pPr>
-      <w:r>
-        <w:t xml:space="preserve">自宅のWi-Fi環境で本を端末に丸ごと事前ダウンロードしておけば、外出中は </w:t>
+        <w:t xml:space="preserve">| </w:t>
       </w:r>
       <w:r>
         <w:rPr>
           <w:b/>
         </w:rPr>
-        <w:t>「完全オフライン（通信量ゼロ・機内モード等）」</w:t>
+        <w:t>📥 オフライン保存（最大5冊）</w:t>
       </w:r>
       <w:r>
-        <w:t xml:space="preserve"> で読書できます。</w:t>
-      </w:r>
-    </w:p>
-    <w:p>
-      <w:pPr>
-        <w:pStyle w:val="ListBullet"/>
-        <w:spacing w:after="50"/>
-      </w:pPr>
-      <w:r>
-        <w:rPr>
-          <w:b/>
-        </w:rPr>
-        <w:t>本アプリ（Cloud BookReader）</w:t>
-      </w:r>
-      <w:r>
-        <w:t>:</w:t>
-      </w:r>
-    </w:p>
-    <w:p>
-      <w:pPr>
-        <w:pStyle w:val="ListBullet"/>
-        <w:spacing w:after="50"/>
-      </w:pPr>
-      <w:r>
-        <w:t xml:space="preserve">端末の空き容量を圧迫せず、事前ダウンロードの待ち時間をなくすために </w:t>
-      </w:r>
-      <w:r>
-        <w:rPr>
-          <w:b/>
-        </w:rPr>
-        <w:t>「読んでいるページだけをGoogleドライブから都度ストリーミング取得する」</w:t>
-      </w:r>
-      <w:r>
-        <w:t xml:space="preserve"> 仕組みを採用しています。</w:t>
-      </w:r>
-    </w:p>
-    <w:p>
-      <w:pPr>
-        <w:pStyle w:val="ListBullet"/>
-        <w:spacing w:after="50"/>
-      </w:pPr>
-      <w:r>
-        <w:t>そのため、</w:t>
-      </w:r>
-      <w:r>
-        <w:rPr>
-          <w:b/>
-        </w:rPr>
-        <w:t>外出先での読書中もページをめくるごとにデータ通信が発生</w:t>
-      </w:r>
-      <w:r>
-        <w:t xml:space="preserve"> します（電波の届かない地下や機内モードでは閲覧できません）。</w:t>
-      </w:r>
-    </w:p>
-    <w:p>
-      <w:pPr>
-        <w:spacing w:before="180" w:after="60"/>
-      </w:pPr>
-      <w:r>
-        <w:rPr>
-          <w:rFonts w:ascii="Yu Gothic" w:hAnsi="Yu Gothic" w:eastAsia="Yu Gothic"/>
-          <w:b/>
-          <w:color w:val="374151"/>
-          <w:sz w:val="23"/>
-        </w:rPr>
-        <w:t>💡 通信量の目安とおすすめの使い分け</w:t>
-      </w:r>
-    </w:p>
-    <w:p>
-      <w:pPr>
-        <w:pStyle w:val="ListBullet"/>
-        <w:spacing w:after="50"/>
-      </w:pPr>
-      <w:r>
-        <w:rPr>
-          <w:b/>
-        </w:rPr>
-        <w:t>通信量について</w:t>
-      </w:r>
-      <w:r>
-        <w:t>:</w:t>
-      </w:r>
-    </w:p>
-    <w:p>
-      <w:pPr>
-        <w:pStyle w:val="ListBullet"/>
-        <w:spacing w:after="50"/>
-      </w:pPr>
-      <w:r>
-        <w:t>当アプリは「開いたページ画像のみ」をピンポイントで取得するため、YouTube等の動画視聴に比べれば通信量は非常に軽量（コミック1冊あたり数十MB程度）ですが、</w:t>
-      </w:r>
-      <w:r>
-        <w:rPr>
-          <w:b/>
-        </w:rPr>
-        <w:t>毎月のスマートフォンのギガ数（通信制限）が気になる方はご注意ください</w:t>
-      </w:r>
-      <w:r>
-        <w:t>。</w:t>
-      </w:r>
-    </w:p>
-    <w:p>
-      <w:pPr>
-        <w:pStyle w:val="ListBullet"/>
-        <w:spacing w:after="50"/>
-      </w:pPr>
-      <w:r>
-        <w:rPr>
-          <w:b/>
-        </w:rPr>
-        <w:t>こんな方におすすめ</w:t>
-      </w:r>
-      <w:r>
-        <w:t>:</w:t>
-      </w:r>
-    </w:p>
-    <w:p>
-      <w:pPr>
-        <w:pStyle w:val="ListBullet"/>
-        <w:spacing w:after="50"/>
-      </w:pPr>
-      <w:r>
-        <w:t xml:space="preserve">⭕ </w:t>
-      </w:r>
-      <w:r>
-        <w:rPr>
-          <w:b/>
-        </w:rPr>
-        <w:t>Cloud BookReader が向いている方</w:t>
-      </w:r>
-      <w:r>
-        <w:t>: 「スマホの容量がカツカツで重い本を何冊も保存できない」「事前ダウンロードなしで気分に合わせてすぐ読みたい」「PCとスマホで続きをシームレスに読みたい」方。</w:t>
-      </w:r>
-    </w:p>
-    <w:p>
-      <w:pPr>
-        <w:pStyle w:val="ListBullet"/>
-        <w:spacing w:after="50"/>
-      </w:pPr>
-      <w:r>
-        <w:t xml:space="preserve">⚠️ </w:t>
-      </w:r>
-      <w:r>
-        <w:rPr>
-          <w:b/>
-        </w:rPr>
-        <w:t>一般的なダウンロード型アプリが向いている方</w:t>
-      </w:r>
-      <w:r>
-        <w:t>: 「飛行機や地下鉄など電波のない場所で読みたい」「外出中はスマートフォンの通信量を1MBも使いたくない」方。</w:t>
+        <w:t xml:space="preserve"> | 完全通信量ゼロ・電波なしOK | 外出前のWi-Fi環境で保存し、地下鉄、飛行機、月末のギガ節約で読みたい時 |</w:t>
       </w:r>
     </w:p>
     <w:p>
@@ -646,7 +513,7 @@
         </w:rPr>
         <w:t>flowchart LR</w:t>
         <w:br/>
-        <w:t xml:space="preserve">    A["① サイトにアクセス&lt;br/&gt;https://cloud-bookreader.vercel.app"] --&gt; B["② Googleでログイン"]</w:t>
+        <w:t xml:space="preserve">    A["① サイトにアクセス&lt;br/&gt;https://reader.puzzleout.net"] --&gt; B["② Googleでログイン"]</w:t>
         <w:br/>
         <w:t xml:space="preserve">    B --&gt; C["③ 本棚フォルダを1つ選択"]</w:t>
         <w:br/>
@@ -680,7 +547,7 @@
           <w:color w:val="1D4ED8"/>
           <w:u w:val="single"/>
         </w:rPr>
-        <w:t>https://cloud-bookreader.vercel.app (https://cloud-bookreader.vercel.app)</w:t>
+        <w:t>https://reader.puzzleout.net (https://reader.puzzleout.net)</w:t>
       </w:r>
       <w:r>
         <w:t xml:space="preserve"> を開きます。</w:t>
@@ -789,6 +656,97 @@
           <w:color w:val="1D4ED8"/>
           <w:sz w:val="27"/>
         </w:rPr>
+        <w:t>📥 オフライン保存（ダウンロード）の使い方</w:t>
+      </w:r>
+    </w:p>
+    <w:p>
+      <w:pPr>
+        <w:pStyle w:val="ListNumber"/>
+        <w:spacing w:after="50"/>
+      </w:pPr>
+      <w:r>
+        <w:t xml:space="preserve">書籍一覧の右側にある </w:t>
+      </w:r>
+      <w:r>
+        <w:rPr>
+          <w:b/>
+        </w:rPr>
+        <w:t>「📥（ダウンロード）」アイコン</w:t>
+      </w:r>
+      <w:r>
+        <w:t xml:space="preserve"> をクリックします。</w:t>
+      </w:r>
+    </w:p>
+    <w:p>
+      <w:pPr>
+        <w:pStyle w:val="ListNumber"/>
+        <w:spacing w:after="50"/>
+      </w:pPr>
+      <w:r>
+        <w:t>数秒〜十数秒でダウンロードが完了し、</w:t>
+      </w:r>
+      <w:r>
+        <w:rPr>
+          <w:b/>
+        </w:rPr>
+        <w:t>「✅ 保存済」</w:t>
+      </w:r>
+      <w:r>
+        <w:t xml:space="preserve"> バッジに変わります。</w:t>
+      </w:r>
+    </w:p>
+    <w:p>
+      <w:pPr>
+        <w:pStyle w:val="ListNumber"/>
+        <w:spacing w:after="50"/>
+      </w:pPr>
+      <w:r>
+        <w:t>保存した本は、</w:t>
+      </w:r>
+      <w:r>
+        <w:rPr>
+          <w:b/>
+        </w:rPr>
+        <w:t>電波のない場所（機内モードやオフライン環境）でも通信量ゼロ・爆速</w:t>
+      </w:r>
+      <w:r>
+        <w:t xml:space="preserve"> で開いて読書できます。</w:t>
+      </w:r>
+    </w:p>
+    <w:p>
+      <w:pPr>
+        <w:pStyle w:val="ListNumber"/>
+        <w:spacing w:after="50"/>
+      </w:pPr>
+      <w:r>
+        <w:t xml:space="preserve">本棚上部の </w:t>
+      </w:r>
+      <w:r>
+        <w:rPr>
+          <w:b/>
+        </w:rPr>
+        <w:t>「保存リストを見る」</w:t>
+      </w:r>
+      <w:r>
+        <w:t xml:space="preserve"> から、保存中の本の一覧や合計容量の確認、不要になった本の削除（ゴミ箱アイコン）がいつでも行えます。</w:t>
+      </w:r>
+    </w:p>
+    <w:p>
+      <w:pPr>
+        <w:spacing w:after="80"/>
+      </w:pPr>
+    </w:p>
+    <w:p>
+      <w:pPr>
+        <w:spacing w:before="240" w:after="100"/>
+      </w:pPr>
+      <w:r>
+        <w:rPr>
+          <w:rFonts w:ascii="Yu Gothic" w:hAnsi="Yu Gothic" w:eastAsia="Yu Gothic"/>
+          <w:b/>
+          <w:color w:val="1D4ED8"/>
+          <w:sz w:val="27"/>
+        </w:rPr>
         <w:t>📱 スマホ・タブレットでアプリ化する（PWA設定）</w:t>
       </w:r>
     </w:p>
@@ -827,7 +785,7 @@
           <w:color w:val="1D4ED8"/>
           <w:u w:val="single"/>
         </w:rPr>
-        <w:t>https://cloud-bookreader.vercel.app (https://cloud-bookreader.vercel.app)</w:t>
+        <w:t>https://reader.puzzleout.net (https://reader.puzzleout.net)</w:t>
       </w:r>
       <w:r>
         <w:t xml:space="preserve"> を開きます。</w:t>
@@ -896,7 +854,7 @@
           <w:color w:val="1D4ED8"/>
           <w:u w:val="single"/>
         </w:rPr>
-        <w:t>https://cloud-bookreader.vercel.app (https://cloud-bookreader.vercel.app)</w:t>
+        <w:t>https://reader.puzzleout.net (https://reader.puzzleout.net)</w:t>
       </w:r>
       <w:r>
         <w:t xml:space="preserve"> を開きます。</w:t>
@@ -950,182 +908,6 @@
       </w:r>
       <w:r>
         <w:t xml:space="preserve"> アイコンをタップするだけで、いつでもワンタップで全画面リーダーが起動します！</w:t>
-      </w:r>
-    </w:p>
-    <w:p>
-      <w:pPr>
-        <w:spacing w:after="80"/>
-      </w:pPr>
-    </w:p>
-    <w:p>
-      <w:pPr>
-        <w:spacing w:before="240" w:after="100"/>
-      </w:pPr>
-      <w:r>
-        <w:rPr>
-          <w:rFonts w:ascii="Yu Gothic" w:hAnsi="Yu Gothic" w:eastAsia="Yu Gothic"/>
-          <w:b/>
-          <w:color w:val="1D4ED8"/>
-          <w:sz w:val="27"/>
-        </w:rPr>
-        <w:t>💡 便利な機能と操作マニュアル</w:t>
-      </w:r>
-    </w:p>
-    <w:p>
-      <w:pPr>
-        <w:spacing w:before="180" w:after="60"/>
-      </w:pPr>
-      <w:r>
-        <w:rPr>
-          <w:rFonts w:ascii="Yu Gothic" w:hAnsi="Yu Gothic" w:eastAsia="Yu Gothic"/>
-          <w:b/>
-          <w:color w:val="374151"/>
-          <w:sz w:val="23"/>
-        </w:rPr>
-        <w:t>1. 1巻から2巻へのスムーズな読み進め</w:t>
-      </w:r>
-    </w:p>
-    <w:p>
-      <w:pPr>
-        <w:spacing w:after="90" w:line="288" w:lineRule="auto"/>
-      </w:pPr>
-      <w:r>
-        <w:t xml:space="preserve">本を読み終わって左上の </w:t>
-      </w:r>
-      <w:r>
-        <w:rPr>
-          <w:b/>
-        </w:rPr>
-        <w:t>「←（戻る）」</w:t>
-      </w:r>
-      <w:r>
-        <w:t xml:space="preserve"> を押すと、</w:t>
-      </w:r>
-      <w:r>
-        <w:rPr>
-          <w:b/>
-        </w:rPr>
-        <w:t>直前に開いていたフォルダ階層に自動復帰</w:t>
-      </w:r>
-      <w:r>
-        <w:t xml:space="preserve"> します。トップに戻されることなく、迷わず次の巻を開くことができます。</w:t>
-      </w:r>
-    </w:p>
-    <w:p>
-      <w:pPr>
-        <w:spacing w:before="180" w:after="60"/>
-      </w:pPr>
-      <w:r>
-        <w:rPr>
-          <w:rFonts w:ascii="Yu Gothic" w:hAnsi="Yu Gothic" w:eastAsia="Yu Gothic"/>
-          <w:b/>
-          <w:color w:val="374151"/>
-          <w:sz w:val="23"/>
-        </w:rPr>
-        <w:t>2. 「続きから読む」と履歴の整理</w:t>
-      </w:r>
-    </w:p>
-    <w:p>
-      <w:pPr>
-        <w:spacing w:after="90" w:line="288" w:lineRule="auto"/>
-      </w:pPr>
-      <w:r>
-        <w:t xml:space="preserve">トップ画面には、直近で読んでいる本が最大5件まで進捗率（読書率）付きで並びます。読み終わった本や不要になった履歴は、右側の </w:t>
-      </w:r>
-      <w:r>
-        <w:rPr>
-          <w:b/>
-        </w:rPr>
-        <w:t>「×ボタン」</w:t>
-      </w:r>
-      <w:r>
-        <w:t xml:space="preserve"> でいつでも整理できます。</w:t>
-      </w:r>
-    </w:p>
-    <w:p>
-      <w:pPr>
-        <w:spacing w:before="180" w:after="60"/>
-      </w:pPr>
-      <w:r>
-        <w:rPr>
-          <w:rFonts w:ascii="Yu Gothic" w:hAnsi="Yu Gothic" w:eastAsia="Yu Gothic"/>
-          <w:b/>
-          <w:color w:val="374151"/>
-          <w:sz w:val="23"/>
-        </w:rPr>
-        <w:t>3. 本棚フォルダの切り替え</w:t>
-      </w:r>
-    </w:p>
-    <w:p>
-      <w:pPr>
-        <w:spacing w:after="90" w:line="288" w:lineRule="auto"/>
-      </w:pPr>
-      <w:r>
-        <w:t xml:space="preserve">別のフォルダ（小説フォルダなど）を読みたい時は、上部の </w:t>
-      </w:r>
-      <w:r>
-        <w:rPr>
-          <w:b/>
-        </w:rPr>
-        <w:t>「📁 本棚フォルダ変更」</w:t>
-      </w:r>
-      <w:r>
-        <w:t xml:space="preserve"> ボタンを押すだけで、いつでも別のフォルダに切り替えられます。</w:t>
-      </w:r>
-    </w:p>
-    <w:p>
-      <w:pPr>
-        <w:spacing w:before="180" w:after="60"/>
-      </w:pPr>
-      <w:r>
-        <w:rPr>
-          <w:rFonts w:ascii="Yu Gothic" w:hAnsi="Yu Gothic" w:eastAsia="Yu Gothic"/>
-          <w:b/>
-          <w:color w:val="374151"/>
-          <w:sz w:val="23"/>
-        </w:rPr>
-        <w:t>4. リーダー画面の操作</w:t>
-      </w:r>
-    </w:p>
-    <w:p>
-      <w:pPr>
-        <w:pStyle w:val="ListBullet"/>
-        <w:spacing w:after="50"/>
-      </w:pPr>
-      <w:r>
-        <w:rPr>
-          <w:b/>
-        </w:rPr>
-        <w:t>ページめくり</w:t>
-      </w:r>
-      <w:r>
-        <w:t xml:space="preserve">: 画面の右半分タップ（または </w:t>
-      </w:r>
-      <w:r>
-        <w:rPr>
-          <w:rFonts w:ascii="Consolas" w:hAnsi="Consolas"/>
-          <w:color w:val="C0392B"/>
-          <w:sz w:val="19"/>
-        </w:rPr>
-        <w:t>→</w:t>
-      </w:r>
-      <w:r>
-        <w:t xml:space="preserve"> キー / スワイプ）で次ページ、左半分タップで前ページ。</w:t>
-      </w:r>
-    </w:p>
-    <w:p>
-      <w:pPr>
-        <w:pStyle w:val="ListBullet"/>
-        <w:spacing w:after="50"/>
-      </w:pPr>
-      <w:r>
-        <w:rPr>
-          <w:b/>
-        </w:rPr>
-        <w:t>メニュー表示</w:t>
-      </w:r>
-      <w:r>
-        <w:t>: 画面の中央をタップすると、上下のツールバー（目次・しおり・表示切替・明るさ等）が表示されます。</w:t>
       </w:r>
     </w:p>
     <w:p>
@@ -1212,7 +994,7 @@
           <w:color w:val="374151"/>
           <w:sz w:val="23"/>
         </w:rPr>
-        <w:t>Q. ログイン時に「確認されていません」と表示された場合は？</w:t>
+        <w:t>Q. オフライン保存でスマホの容量を圧迫しませんか？</w:t>
       </w:r>
     </w:p>
     <w:p>
@@ -1225,7 +1007,7 @@
           <w:i/>
           <w:color w:val="4B5563"/>
         </w:rPr>
-        <w:t>個人開発サービスのため初回のみ表示される場合があります。画面左下の **「詳細」** を押し、**「（安全ではないページ）に移動」** をクリックして進んでいただくことで正常にご利用いただけます。</w:t>
+        <w:t>最大5冊（約500MB程度）に制限されているため、スマートフォンの容量を圧迫することはありません。読み終わったらゴミ箱アイコンですぐに削除して空き容量を戻せます。</w:t>
       </w:r>
     </w:p>
     <w:p>

</xml_diff>

<commit_message>
Update manuals with accurate security scope descriptions
</commit_message>
<xml_diff>
--- a/Cloud_BookReader_Manual.docx
+++ b/Cloud_BookReader_Manual.docx
@@ -380,7 +380,7 @@
         <w:rPr>
           <w:b/>
         </w:rPr>
-        <w:t>🛡️ あなたの本棚フォルダ以外には一切アクセスしない安全設計</w:t>
+        <w:t>🛡️ 読み取り専用 ＋ アプリ専用隠し領域の安全設計</w:t>
       </w:r>
     </w:p>
     <w:p>
@@ -389,7 +389,7 @@
         <w:spacing w:after="50"/>
       </w:pPr>
       <w:r>
-        <w:t>Googleの公式最新セキュリティ（</w:t>
+        <w:t>マンガや書籍は「読み取り専用（</w:t>
       </w:r>
       <w:r>
         <w:rPr>
@@ -397,19 +397,21 @@
           <w:color w:val="C0392B"/>
           <w:sz w:val="19"/>
         </w:rPr>
-        <w:t>drive.file</w:t>
+        <w:t>drive.readonly</w:t>
       </w:r>
       <w:r>
-        <w:t xml:space="preserve"> スコープ）を採用。あなたが「本棚」として指定したフォルダ以外（プライベートな写真や仕事の書類など）には </w:t>
+        <w:t>）」で取得し、しおりや進捗はGoogleドライブ内の「アプリ専用隠し領域（</w:t>
       </w:r>
       <w:r>
         <w:rPr>
-          <w:b/>
+          <w:rFonts w:ascii="Consolas" w:hAnsi="Consolas"/>
+          <w:color w:val="C0392B"/>
+          <w:sz w:val="19"/>
         </w:rPr>
-        <w:t>システム上一切アクセスできない安心設計</w:t>
+        <w:t>drive.appdata</w:t>
       </w:r>
       <w:r>
-        <w:t xml:space="preserve"> です。</w:t>
+        <w:t>）」にのみ保存。あなたのファイルを編集・削除することはシステム上絶対にできない安心設計です。</w:t>
       </w:r>
     </w:p>
     <w:p>

</xml_diff>

<commit_message>
Update manuals with self-host deployment and disclaimer guides
</commit_message>
<xml_diff>
--- a/Cloud_BookReader_Manual.docx
+++ b/Cloud_BookReader_Manual.docx
@@ -13,7 +13,7 @@
           <w:color w:val="111827"/>
           <w:sz w:val="34"/>
         </w:rPr>
-        <w:t>【完全無料】Googleドライブの自炊マンガ・書籍を全デバイスで爆速ストリーミング！「Cloud BookReader」の使い方ガイド</w:t>
+        <w:t>【完全無料・自分専用】Googleドライブの自炊マンガ・書籍を全デバイスで爆速ストリーミング！「Cloud BookReader」導入＆操作マニュアル</w:t>
       </w:r>
     </w:p>
     <w:p>
@@ -30,7 +30,7 @@
         <w:t>ダウンロード待ち時間ゼロ・端末の容量消費ゼロ</w:t>
       </w:r>
       <w:r>
-        <w:t xml:space="preserve"> で快適に読めるWebリーダーサービス </w:t>
+        <w:t xml:space="preserve"> で快適に読めるクラウドWebリーダー </w:t>
       </w:r>
       <w:r>
         <w:rPr>
@@ -39,7 +39,7 @@
         <w:t>「Cloud BookReader」</w:t>
       </w:r>
       <w:r>
-        <w:t xml:space="preserve"> を公開しました！</w:t>
+        <w:t xml:space="preserve"> のご紹介です。</w:t>
       </w:r>
     </w:p>
     <w:p>
@@ -61,19 +61,159 @@
     </w:p>
     <w:p>
       <w:pPr>
+        <w:spacing w:after="80"/>
+      </w:pPr>
+    </w:p>
+    <w:p>
+      <w:pPr>
+        <w:spacing w:before="240" w:after="100"/>
+      </w:pPr>
+      <w:r>
+        <w:rPr>
+          <w:rFonts w:ascii="Yu Gothic" w:hAnsi="Yu Gothic" w:eastAsia="Yu Gothic"/>
+          <w:b/>
+          <w:color w:val="1D4ED8"/>
+          <w:sz w:val="27"/>
+        </w:rPr>
+        <w:t>🛡️ なぜ「自分専用（セルフホスト）」なのか？</w:t>
+      </w:r>
+    </w:p>
+    <w:p>
+      <w:pPr>
         <w:spacing w:after="90" w:line="288" w:lineRule="auto"/>
       </w:pPr>
       <w:r>
-        <w:t>面倒なアプリのインストールやアカウント登録、API設定などは一切不要。</w:t>
+        <w:t xml:space="preserve">本アプリは、誰でも </w:t>
       </w:r>
       <w:r>
         <w:rPr>
           <w:b/>
         </w:rPr>
-        <w:t>Googleアカウントでログインして自分の本棚フォルダを選ぶだけ（約10秒）</w:t>
+        <w:t>無料のVercelサーバー ＋ ご自身のGoogle Cloudキー</w:t>
       </w:r>
       <w:r>
-        <w:t xml:space="preserve"> で、誰でも今すぐ無料で利用できます。</w:t>
+        <w:t xml:space="preserve"> を使って、</w:t>
+      </w:r>
+      <w:r>
+        <w:rPr>
+          <w:b/>
+        </w:rPr>
+        <w:t>「誰にも邪魔されない完全プライベートな自分専用リーダー」</w:t>
+      </w:r>
+      <w:r>
+        <w:t xml:space="preserve"> を約5分で立ち上げられるように設計されています。</w:t>
+      </w:r>
+    </w:p>
+    <w:p>
+      <w:pPr>
+        <w:spacing w:before="180" w:after="60"/>
+      </w:pPr>
+      <w:r>
+        <w:rPr>
+          <w:rFonts w:ascii="Yu Gothic" w:hAnsi="Yu Gothic" w:eastAsia="Yu Gothic"/>
+          <w:b/>
+          <w:color w:val="374151"/>
+          <w:sz w:val="23"/>
+        </w:rPr>
+        <w:t>🌟 自分専用環境（セルフホスト）のメリット</w:t>
+      </w:r>
+    </w:p>
+    <w:p>
+      <w:pPr>
+        <w:pStyle w:val="ListNumber"/>
+        <w:spacing w:after="50"/>
+      </w:pPr>
+      <w:r>
+        <w:rPr>
+          <w:b/>
+        </w:rPr>
+        <w:t>🔒 最高峰のプライバシー保護</w:t>
+      </w:r>
+      <w:r>
+        <w:t>:</w:t>
+      </w:r>
+    </w:p>
+    <w:p>
+      <w:pPr>
+        <w:pStyle w:val="ListBullet"/>
+        <w:spacing w:after="50"/>
+      </w:pPr>
+      <w:r>
+        <w:t>あなたのGoogleドライブデータにアクセスできるのは「あなた自身」だけです。第三者のサーバーにデータが渡るリスクは一切ありません。</w:t>
+      </w:r>
+    </w:p>
+    <w:p>
+      <w:pPr>
+        <w:pStyle w:val="ListNumber"/>
+        <w:spacing w:after="50"/>
+      </w:pPr>
+      <w:r>
+        <w:rPr>
+          <w:b/>
+        </w:rPr>
+        <w:t>♾️ 人数制限・通信制限なし</w:t>
+      </w:r>
+      <w:r>
+        <w:t>:</w:t>
+      </w:r>
+    </w:p>
+    <w:p>
+      <w:pPr>
+        <w:pStyle w:val="ListBullet"/>
+        <w:spacing w:after="50"/>
+      </w:pPr>
+      <w:r>
+        <w:t>他のユーザーと枠を共有しないため、一生涯完全無料で無制限に利用し続けられます。</w:t>
+      </w:r>
+    </w:p>
+    <w:p>
+      <w:pPr>
+        <w:pStyle w:val="ListNumber"/>
+        <w:spacing w:after="50"/>
+      </w:pPr>
+      <w:r>
+        <w:rPr>
+          <w:b/>
+        </w:rPr>
+        <w:t>📥 最大5冊までのオフライン保存（Wi-Fi事前ダウンロード）</w:t>
+      </w:r>
+      <w:r>
+        <w:t>:</w:t>
+      </w:r>
+    </w:p>
+    <w:p>
+      <w:pPr>
+        <w:pStyle w:val="ListBullet"/>
+        <w:spacing w:after="50"/>
+      </w:pPr>
+      <w:r>
+        <w:t>外出先や地下鉄・飛行機で読みたい本だけ、自宅のWi-Fiでワンタップ保存（通信量ゼロ・機内モード対応）。</w:t>
+      </w:r>
+    </w:p>
+    <w:p>
+      <w:pPr>
+        <w:spacing w:before="40" w:after="60"/>
+        <w:ind w:left="288"/>
+      </w:pPr>
+      <w:r>
+        <w:rPr>
+          <w:i/>
+          <w:color w:val="4B5563"/>
+        </w:rPr>
+        <w:t>**⚠️ ご利用にあたって（免責事項）**</w:t>
+      </w:r>
+    </w:p>
+    <w:p>
+      <w:pPr>
+        <w:spacing w:before="40" w:after="60"/>
+        <w:ind w:left="288"/>
+      </w:pPr>
+      <w:r>
+        <w:rPr>
+          <w:i/>
+          <w:color w:val="4B5563"/>
+        </w:rPr>
+        <w:t>本サービスはオープンソースの個人利用向けツールです。Googleドライブ内の書籍ファイルは「読み取り専用」で安全に取得され、サーバー上にデータが保存・収集されることはありません。利用規約および免責事項をご確認のうえ、自己責任にてご利用ください。</w:t>
       </w:r>
     </w:p>
     <w:p>
@@ -92,7 +232,362 @@
           <w:color w:val="1D4ED8"/>
           <w:sz w:val="27"/>
         </w:rPr>
-        <w:t>🌐 サービスURL（今すぐ無料で使えます）</w:t>
+        <w:t>🚀 【約5分】自分専用リーダーの立ち上げ手順（完全図解）</w:t>
+      </w:r>
+    </w:p>
+    <w:p>
+      <w:pPr>
+        <w:spacing w:before="60" w:after="120"/>
+        <w:ind w:left="288"/>
+      </w:pPr>
+      <w:r>
+        <w:rPr>
+          <w:rFonts w:ascii="Consolas" w:hAnsi="Consolas"/>
+          <w:color w:val="333333"/>
+          <w:sz w:val="19"/>
+        </w:rPr>
+        <w:t>flowchart LR</w:t>
+        <w:br/>
+        <w:t xml:space="preserve">    A["① Google Cloudで&lt;br/&gt;無料APIキーを取得"] --&gt; B["② 『Deploy to Vercel』&lt;br/&gt;ボタンでデプロイ"]</w:t>
+        <w:br/>
+        <w:t xml:space="preserve">    B --&gt; C["③ リダイレクトURIを&lt;br/&gt;登録して完了！"]</w:t>
+        <w:br/>
+        <w:t xml:space="preserve">    C --&gt; D["🎉 あなた専用の&lt;br/&gt;爆速リーダーが完成！"]</w:t>
+      </w:r>
+    </w:p>
+    <w:p>
+      <w:pPr>
+        <w:spacing w:before="180" w:after="60"/>
+      </w:pPr>
+      <w:r>
+        <w:rPr>
+          <w:rFonts w:ascii="Yu Gothic" w:hAnsi="Yu Gothic" w:eastAsia="Yu Gothic"/>
+          <w:b/>
+          <w:color w:val="374151"/>
+          <w:sz w:val="23"/>
+        </w:rPr>
+        <w:t>ステップ1: Google Cloud で無料APIキーを取得（約3分）</w:t>
+      </w:r>
+    </w:p>
+    <w:p>
+      <w:pPr>
+        <w:pStyle w:val="ListNumber"/>
+        <w:spacing w:after="50"/>
+      </w:pPr>
+      <w:r>
+        <w:rPr>
+          <w:color w:val="1D4ED8"/>
+          <w:u w:val="single"/>
+        </w:rPr>
+        <w:t>Google Cloud Console (https://console.cloud.google.com/)</w:t>
+      </w:r>
+      <w:r>
+        <w:t xml:space="preserve"> にログインし、新しいプロジェクト（例: </w:t>
+      </w:r>
+      <w:r>
+        <w:rPr>
+          <w:rFonts w:ascii="Consolas" w:hAnsi="Consolas"/>
+          <w:color w:val="C0392B"/>
+          <w:sz w:val="19"/>
+        </w:rPr>
+        <w:t>My-BookReader</w:t>
+      </w:r>
+      <w:r>
+        <w:t>）を作成します。</w:t>
+      </w:r>
+    </w:p>
+    <w:p>
+      <w:pPr>
+        <w:pStyle w:val="ListNumber"/>
+        <w:spacing w:after="50"/>
+      </w:pPr>
+      <w:r>
+        <w:t xml:space="preserve">左メニュー </w:t>
+      </w:r>
+      <w:r>
+        <w:rPr>
+          <w:b/>
+        </w:rPr>
+        <w:t>「APIとサービス」→「ライブラリ」</w:t>
+      </w:r>
+      <w:r>
+        <w:t xml:space="preserve"> を開き、</w:t>
+      </w:r>
+      <w:r>
+        <w:rPr>
+          <w:b/>
+        </w:rPr>
+        <w:t>`Google Drive API`</w:t>
+      </w:r>
+      <w:r>
+        <w:t xml:space="preserve"> と </w:t>
+      </w:r>
+      <w:r>
+        <w:rPr>
+          <w:b/>
+        </w:rPr>
+        <w:t>`Google Picker API`</w:t>
+      </w:r>
+      <w:r>
+        <w:t xml:space="preserve"> をそれぞれ検索して </w:t>
+      </w:r>
+      <w:r>
+        <w:rPr>
+          <w:b/>
+        </w:rPr>
+        <w:t>「有効にする」</w:t>
+      </w:r>
+      <w:r>
+        <w:t xml:space="preserve"> をクリックします。</w:t>
+      </w:r>
+    </w:p>
+    <w:p>
+      <w:pPr>
+        <w:pStyle w:val="ListNumber"/>
+        <w:spacing w:after="50"/>
+      </w:pPr>
+      <w:r>
+        <w:t xml:space="preserve">左メニュー </w:t>
+      </w:r>
+      <w:r>
+        <w:rPr>
+          <w:b/>
+        </w:rPr>
+        <w:t>「OAuth 同意画面」</w:t>
+      </w:r>
+      <w:r>
+        <w:t xml:space="preserve"> を開き、以下を設定します：</w:t>
+      </w:r>
+    </w:p>
+    <w:p>
+      <w:pPr>
+        <w:pStyle w:val="ListBullet"/>
+        <w:spacing w:after="50"/>
+      </w:pPr>
+      <w:r>
+        <w:rPr>
+          <w:b/>
+        </w:rPr>
+        <w:t>User Type</w:t>
+      </w:r>
+      <w:r>
+        <w:t>: 「外部」を選択して作成</w:t>
+      </w:r>
+    </w:p>
+    <w:p>
+      <w:pPr>
+        <w:pStyle w:val="ListBullet"/>
+        <w:spacing w:after="50"/>
+      </w:pPr>
+      <w:r>
+        <w:rPr>
+          <w:b/>
+        </w:rPr>
+        <w:t>アプリ名</w:t>
+      </w:r>
+      <w:r>
+        <w:t xml:space="preserve">: </w:t>
+      </w:r>
+      <w:r>
+        <w:rPr>
+          <w:rFonts w:ascii="Consolas" w:hAnsi="Consolas"/>
+          <w:color w:val="C0392B"/>
+          <w:sz w:val="19"/>
+        </w:rPr>
+        <w:t>Cloud BookReader</w:t>
+      </w:r>
+    </w:p>
+    <w:p>
+      <w:pPr>
+        <w:pStyle w:val="ListBullet"/>
+        <w:spacing w:after="50"/>
+      </w:pPr>
+      <w:r>
+        <w:rPr>
+          <w:b/>
+        </w:rPr>
+        <w:t>ユーザーサポートメール / デベロッパーの連絡先</w:t>
+      </w:r>
+      <w:r>
+        <w:t>: ご自身のGmailアドレス</w:t>
+      </w:r>
+    </w:p>
+    <w:p>
+      <w:pPr>
+        <w:pStyle w:val="ListBullet"/>
+        <w:spacing w:after="50"/>
+      </w:pPr>
+      <w:r>
+        <w:rPr>
+          <w:b/>
+        </w:rPr>
+        <w:t>スコープ</w:t>
+      </w:r>
+      <w:r>
+        <w:t xml:space="preserve">: </w:t>
+      </w:r>
+      <w:r>
+        <w:rPr>
+          <w:rFonts w:ascii="Consolas" w:hAnsi="Consolas"/>
+          <w:color w:val="C0392B"/>
+          <w:sz w:val="19"/>
+        </w:rPr>
+        <w:t>.../auth/drive.readonly</w:t>
+      </w:r>
+      <w:r>
+        <w:t xml:space="preserve"> と </w:t>
+      </w:r>
+      <w:r>
+        <w:rPr>
+          <w:rFonts w:ascii="Consolas" w:hAnsi="Consolas"/>
+          <w:color w:val="C0392B"/>
+          <w:sz w:val="19"/>
+        </w:rPr>
+        <w:t>.../auth/drive.appdata</w:t>
+      </w:r>
+      <w:r>
+        <w:t xml:space="preserve"> を追加</w:t>
+      </w:r>
+    </w:p>
+    <w:p>
+      <w:pPr>
+        <w:pStyle w:val="ListBullet"/>
+        <w:spacing w:after="50"/>
+      </w:pPr>
+      <w:r>
+        <w:rPr>
+          <w:b/>
+        </w:rPr>
+        <w:t>テストユーザー</w:t>
+      </w:r>
+      <w:r>
+        <w:t>: ご自身のGmailアドレスを追加して保存</w:t>
+      </w:r>
+    </w:p>
+    <w:p>
+      <w:pPr>
+        <w:pStyle w:val="ListNumber"/>
+        <w:spacing w:after="50"/>
+      </w:pPr>
+      <w:r>
+        <w:t xml:space="preserve">左メニュー </w:t>
+      </w:r>
+      <w:r>
+        <w:rPr>
+          <w:b/>
+        </w:rPr>
+        <w:t>「認証情報」→「＋認証情報を作成」→「OAuth クライアント ID」</w:t>
+      </w:r>
+      <w:r>
+        <w:t xml:space="preserve"> を選択します：</w:t>
+      </w:r>
+    </w:p>
+    <w:p>
+      <w:pPr>
+        <w:pStyle w:val="ListBullet"/>
+        <w:spacing w:after="50"/>
+      </w:pPr>
+      <w:r>
+        <w:rPr>
+          <w:b/>
+        </w:rPr>
+        <w:t>アプリケーションの種類</w:t>
+      </w:r>
+      <w:r>
+        <w:t>: 「ウェブ アプリケーション」</w:t>
+      </w:r>
+    </w:p>
+    <w:p>
+      <w:pPr>
+        <w:pStyle w:val="ListBullet"/>
+        <w:spacing w:after="50"/>
+      </w:pPr>
+      <w:r>
+        <w:rPr>
+          <w:b/>
+        </w:rPr>
+        <w:t>名前</w:t>
+      </w:r>
+      <w:r>
+        <w:t xml:space="preserve">: </w:t>
+      </w:r>
+      <w:r>
+        <w:rPr>
+          <w:rFonts w:ascii="Consolas" w:hAnsi="Consolas"/>
+          <w:color w:val="C0392B"/>
+          <w:sz w:val="19"/>
+        </w:rPr>
+        <w:t>Cloud BookReader Client</w:t>
+      </w:r>
+    </w:p>
+    <w:p>
+      <w:pPr>
+        <w:pStyle w:val="ListBullet"/>
+        <w:spacing w:after="50"/>
+      </w:pPr>
+      <w:r>
+        <w:rPr>
+          <w:b/>
+        </w:rPr>
+        <w:t>「作成」</w:t>
+      </w:r>
+      <w:r>
+        <w:t xml:space="preserve"> を押すと、画面に </w:t>
+      </w:r>
+      <w:r>
+        <w:rPr>
+          <w:b/>
+        </w:rPr>
+        <w:t>「クライアント ID」</w:t>
+      </w:r>
+      <w:r>
+        <w:t xml:space="preserve"> と </w:t>
+      </w:r>
+      <w:r>
+        <w:rPr>
+          <w:b/>
+        </w:rPr>
+        <w:t>「クライアント シークレット」</w:t>
+      </w:r>
+      <w:r>
+        <w:t xml:space="preserve"> が表示されます（後で使うのでコピーしておきます）。</w:t>
+      </w:r>
+    </w:p>
+    <w:p>
+      <w:pPr>
+        <w:spacing w:after="80"/>
+      </w:pPr>
+    </w:p>
+    <w:p>
+      <w:pPr>
+        <w:spacing w:before="180" w:after="60"/>
+      </w:pPr>
+      <w:r>
+        <w:rPr>
+          <w:rFonts w:ascii="Yu Gothic" w:hAnsi="Yu Gothic" w:eastAsia="Yu Gothic"/>
+          <w:b/>
+          <w:color w:val="374151"/>
+          <w:sz w:val="23"/>
+        </w:rPr>
+        <w:t>ステップ2: Vercel にワンクリックでデプロイ（約2分）</w:t>
+      </w:r>
+    </w:p>
+    <w:p>
+      <w:pPr>
+        <w:pStyle w:val="ListNumber"/>
+        <w:spacing w:after="50"/>
+      </w:pPr>
+      <w:r>
+        <w:t xml:space="preserve">以下の </w:t>
+      </w:r>
+      <w:r>
+        <w:rPr>
+          <w:b/>
+        </w:rPr>
+        <w:t>「Deploy to Vercel」</w:t>
+      </w:r>
+      <w:r>
+        <w:t xml:space="preserve"> ボタンをクリックします：</w:t>
       </w:r>
     </w:p>
     <w:p>
@@ -100,13 +595,308 @@
         <w:spacing w:after="90" w:line="288" w:lineRule="auto"/>
       </w:pPr>
       <w:r>
-        <w:t xml:space="preserve">👉 </w:t>
+        <w:rPr>
+          <w:color w:val="1D4ED8"/>
+          <w:u w:val="single"/>
+        </w:rPr>
+        <w:t>![Deploy with Vercel (https://vercel.com/button)</w:t>
+      </w:r>
+      <w:r>
+        <w:t>](https://vercel.com/new/clone?repository-url=https%3A%2F%2Fgithub.com%2Fryo22-jp%2FCloud-Bookreader&amp;env=GOOGLE_CLIENT_ID,GOOGLE_CLIENT_SECRET,NEXTAUTH_SECRET,NEXTAUTH_URL&amp;envDescription=Google%20Cloud%20Console%E3%81%A7%E5%8F%96%E5%BE%97%E3%81%97%E3%81%9F%E8%A8%AD%E5%AE%9A%E5%80%A4%E3%82%92%E5%85%A5%E5%8A%9B%E3%81%97%E3%81%A6%E3%81%8F%E3%81%A0%E3%81%95%E3%81%84&amp;project-name=my-cloud-bookreader)</w:t>
+      </w:r>
+    </w:p>
+    <w:p>
+      <w:pPr>
+        <w:pStyle w:val="ListNumber"/>
+        <w:spacing w:after="50"/>
+      </w:pPr>
+      <w:r>
+        <w:t>Vercel（無料アカウント）にログインし、GitHubリポジトリの作成先（ご自身のアカウント）を選択します。</w:t>
+      </w:r>
+    </w:p>
+    <w:p>
+      <w:pPr>
+        <w:pStyle w:val="ListNumber"/>
+        <w:spacing w:after="50"/>
+      </w:pPr>
+      <w:r>
+        <w:rPr>
+          <w:b/>
+        </w:rPr>
+        <w:t>Environment Variables（環境変数）</w:t>
+      </w:r>
+      <w:r>
+        <w:t xml:space="preserve"> の入力欄が表示されるので、以下を入力します：</w:t>
+      </w:r>
+    </w:p>
+    <w:p>
+      <w:pPr>
+        <w:spacing w:after="90" w:line="288" w:lineRule="auto"/>
+      </w:pPr>
+      <w:r>
+        <w:t>| 環境変数名 | 入力する値 |</w:t>
+      </w:r>
+    </w:p>
+    <w:p>
+      <w:pPr>
+        <w:spacing w:after="90" w:line="288" w:lineRule="auto"/>
+      </w:pPr>
+      <w:r>
+        <w:t>| :--- | :--- |</w:t>
+      </w:r>
+    </w:p>
+    <w:p>
+      <w:pPr>
+        <w:spacing w:after="90" w:line="288" w:lineRule="auto"/>
+      </w:pPr>
+      <w:r>
+        <w:t xml:space="preserve">| </w:t>
       </w:r>
       <w:r>
         <w:rPr>
           <w:b/>
         </w:rPr>
-        <w:t>[https://reader.puzzleout.net](https://reader.puzzleout.net)</w:t>
+        <w:t>`GOOGLE_CLIENT_ID`</w:t>
+      </w:r>
+      <w:r>
+        <w:t xml:space="preserve"> | ステップ1でコピーしたクライアントID |</w:t>
+      </w:r>
+    </w:p>
+    <w:p>
+      <w:pPr>
+        <w:spacing w:after="90" w:line="288" w:lineRule="auto"/>
+      </w:pPr>
+      <w:r>
+        <w:t xml:space="preserve">| </w:t>
+      </w:r>
+      <w:r>
+        <w:rPr>
+          <w:b/>
+        </w:rPr>
+        <w:t>`GOOGLE_CLIENT_SECRET`</w:t>
+      </w:r>
+      <w:r>
+        <w:t xml:space="preserve"> | ステップ1でコピーしたクライアントシークレット |</w:t>
+      </w:r>
+    </w:p>
+    <w:p>
+      <w:pPr>
+        <w:spacing w:after="90" w:line="288" w:lineRule="auto"/>
+      </w:pPr>
+      <w:r>
+        <w:t xml:space="preserve">| </w:t>
+      </w:r>
+      <w:r>
+        <w:rPr>
+          <w:b/>
+        </w:rPr>
+        <w:t>`NEXTAUTH_SECRET`</w:t>
+      </w:r>
+      <w:r>
+        <w:t xml:space="preserve"> | ランダムな英数字32文字以上（例: </w:t>
+      </w:r>
+      <w:r>
+        <w:rPr>
+          <w:rFonts w:ascii="Consolas" w:hAnsi="Consolas"/>
+          <w:color w:val="C0392B"/>
+          <w:sz w:val="19"/>
+        </w:rPr>
+        <w:t>mysecretkey1234567890abcdefghijklmn</w:t>
+      </w:r>
+      <w:r>
+        <w:t>） |</w:t>
+      </w:r>
+    </w:p>
+    <w:p>
+      <w:pPr>
+        <w:spacing w:after="90" w:line="288" w:lineRule="auto"/>
+      </w:pPr>
+      <w:r>
+        <w:t xml:space="preserve">| </w:t>
+      </w:r>
+      <w:r>
+        <w:rPr>
+          <w:b/>
+        </w:rPr>
+        <w:t>`NEXTAUTH_URL`</w:t>
+      </w:r>
+      <w:r>
+        <w:t xml:space="preserve"> | </w:t>
+      </w:r>
+      <w:r>
+        <w:rPr>
+          <w:rFonts w:ascii="Consolas" w:hAnsi="Consolas"/>
+          <w:color w:val="C0392B"/>
+          <w:sz w:val="19"/>
+        </w:rPr>
+        <w:t>https://my-cloud-bookreader.vercel.app</w:t>
+      </w:r>
+      <w:r>
+        <w:t>（※仮でOK。デプロイ後に確定URLを入れます） |</w:t>
+      </w:r>
+    </w:p>
+    <w:p>
+      <w:pPr>
+        <w:pStyle w:val="ListNumber"/>
+        <w:spacing w:after="50"/>
+      </w:pPr>
+      <w:r>
+        <w:rPr>
+          <w:b/>
+        </w:rPr>
+        <w:t>「Deploy」</w:t>
+      </w:r>
+      <w:r>
+        <w:t xml:space="preserve"> ボタンを押します。約1分でデプロイが完了し、あなた専用のURL（例: </w:t>
+      </w:r>
+      <w:r>
+        <w:rPr>
+          <w:rFonts w:ascii="Consolas" w:hAnsi="Consolas"/>
+          <w:color w:val="C0392B"/>
+          <w:sz w:val="19"/>
+        </w:rPr>
+        <w:t>https://my-cloud-bookreader.vercel.app</w:t>
+      </w:r>
+      <w:r>
+        <w:t>）が発行されます！</w:t>
+      </w:r>
+    </w:p>
+    <w:p>
+      <w:pPr>
+        <w:spacing w:after="80"/>
+      </w:pPr>
+    </w:p>
+    <w:p>
+      <w:pPr>
+        <w:spacing w:before="180" w:after="60"/>
+      </w:pPr>
+      <w:r>
+        <w:rPr>
+          <w:rFonts w:ascii="Yu Gothic" w:hAnsi="Yu Gothic" w:eastAsia="Yu Gothic"/>
+          <w:b/>
+          <w:color w:val="374151"/>
+          <w:sz w:val="23"/>
+        </w:rPr>
+        <w:t>ステップ3: Google Cloud にURLを登録して完成！</w:t>
+      </w:r>
+    </w:p>
+    <w:p>
+      <w:pPr>
+        <w:pStyle w:val="ListNumber"/>
+        <w:spacing w:after="50"/>
+      </w:pPr>
+      <w:r>
+        <w:t xml:space="preserve">再び </w:t>
+      </w:r>
+      <w:r>
+        <w:rPr>
+          <w:color w:val="1D4ED8"/>
+          <w:u w:val="single"/>
+        </w:rPr>
+        <w:t>Google Cloud Console (認証情報) (https://console.cloud.google.com/apis/credentials)</w:t>
+      </w:r>
+      <w:r>
+        <w:t xml:space="preserve"> を開き、作成した「OAuth 2.0 クライアント ID」をクリックします。</w:t>
+      </w:r>
+    </w:p>
+    <w:p>
+      <w:pPr>
+        <w:pStyle w:val="ListNumber"/>
+        <w:spacing w:after="50"/>
+      </w:pPr>
+      <w:r>
+        <w:t>以下を追加して保存します：</w:t>
+      </w:r>
+    </w:p>
+    <w:p>
+      <w:pPr>
+        <w:pStyle w:val="ListBullet"/>
+        <w:spacing w:after="50"/>
+      </w:pPr>
+      <w:r>
+        <w:rPr>
+          <w:b/>
+        </w:rPr>
+        <w:t>承認済みの JavaScript 生成元</w:t>
+      </w:r>
+      <w:r>
+        <w:t xml:space="preserve">: </w:t>
+      </w:r>
+      <w:r>
+        <w:rPr>
+          <w:rFonts w:ascii="Consolas" w:hAnsi="Consolas"/>
+          <w:color w:val="C0392B"/>
+          <w:sz w:val="19"/>
+        </w:rPr>
+        <w:t>https://発行されたあなた専用のURL</w:t>
+      </w:r>
+    </w:p>
+    <w:p>
+      <w:pPr>
+        <w:pStyle w:val="ListBullet"/>
+        <w:spacing w:after="50"/>
+      </w:pPr>
+      <w:r>
+        <w:rPr>
+          <w:b/>
+        </w:rPr>
+        <w:t>承認済みのリダイレクト URI</w:t>
+      </w:r>
+      <w:r>
+        <w:t xml:space="preserve">: </w:t>
+      </w:r>
+      <w:r>
+        <w:rPr>
+          <w:rFonts w:ascii="Consolas" w:hAnsi="Consolas"/>
+          <w:color w:val="C0392B"/>
+          <w:sz w:val="19"/>
+        </w:rPr>
+        <w:t>https://発行されたあなた専用のURL/api/auth/callback/google</w:t>
+      </w:r>
+    </w:p>
+    <w:p>
+      <w:pPr>
+        <w:pStyle w:val="ListNumber"/>
+        <w:spacing w:after="50"/>
+      </w:pPr>
+      <w:r>
+        <w:t>Vercelの「Settings」→「Environment Variables」で、</w:t>
+      </w:r>
+      <w:r>
+        <w:rPr>
+          <w:rFonts w:ascii="Consolas" w:hAnsi="Consolas"/>
+          <w:color w:val="C0392B"/>
+          <w:sz w:val="19"/>
+        </w:rPr>
+        <w:t>NEXTAUTH_URL</w:t>
+      </w:r>
+      <w:r>
+        <w:t xml:space="preserve"> を </w:t>
+      </w:r>
+      <w:r>
+        <w:rPr>
+          <w:rFonts w:ascii="Consolas" w:hAnsi="Consolas"/>
+          <w:color w:val="C0392B"/>
+          <w:sz w:val="19"/>
+        </w:rPr>
+        <w:t>https://発行されたあなた専用のURL</w:t>
+      </w:r>
+      <w:r>
+        <w:t xml:space="preserve"> に更新し、再デプロイ（Redeploy）します。</w:t>
+      </w:r>
+    </w:p>
+    <w:p>
+      <w:pPr>
+        <w:spacing w:after="90" w:line="288" w:lineRule="auto"/>
+      </w:pPr>
+      <w:r>
+        <w:t xml:space="preserve">🎉 </w:t>
+      </w:r>
+      <w:r>
+        <w:rPr>
+          <w:b/>
+        </w:rPr>
+        <w:t>これですべて完了です！発行されたURLを開いてGoogleログインすれば、あなた専用のリーダーが一生涯無料で動きます！</w:t>
       </w:r>
     </w:p>
     <w:p>
@@ -125,24 +915,7 @@
           <w:color w:val="1D4ED8"/>
           <w:sz w:val="27"/>
         </w:rPr>
-        <w:t>📖 Cloud BookReader とは？</w:t>
-      </w:r>
-    </w:p>
-    <w:p>
-      <w:pPr>
-        <w:spacing w:after="90" w:line="288" w:lineRule="auto"/>
-      </w:pPr>
-      <w:r>
-        <w:t xml:space="preserve">従来の電子書籍リーダーアプリのように </w:t>
-      </w:r>
-      <w:r>
-        <w:rPr>
-          <w:b/>
-        </w:rPr>
-        <w:t>「何百メガもある本をスマホに丸ごとダウンロードして空き容量を圧迫する」</w:t>
-      </w:r>
-      <w:r>
-        <w:t xml:space="preserve"> 必要はもうありません。</w:t>
+        <w:t>📖 読書機能・操作マニュアル</w:t>
       </w:r>
     </w:p>
     <w:p>
@@ -156,281 +929,7 @@
           <w:color w:val="374151"/>
           <w:sz w:val="23"/>
         </w:rPr>
-        <w:t>✨ 主な特徴</w:t>
-      </w:r>
-    </w:p>
-    <w:p>
-      <w:pPr>
-        <w:pStyle w:val="ListNumber"/>
-        <w:spacing w:after="50"/>
-      </w:pPr>
-      <w:r>
-        <w:rPr>
-          <w:b/>
-        </w:rPr>
-        <w:t>⚡ ダウンロード待ち0秒（HTTP Range Request ストリーミング技術）</w:t>
-      </w:r>
-    </w:p>
-    <w:p>
-      <w:pPr>
-        <w:pStyle w:val="ListBullet"/>
-        <w:spacing w:after="50"/>
-      </w:pPr>
-      <w:r>
-        <w:t>500MBを超える高画質PDFやZIPマンガでも、</w:t>
-      </w:r>
-      <w:r>
-        <w:rPr>
-          <w:b/>
-        </w:rPr>
-        <w:t>「今開いているページだけ」</w:t>
-      </w:r>
-      <w:r>
-        <w:t xml:space="preserve"> をGoogleドライブから瞬時に取得。端末容量を消費せず、開いた瞬間に読書が始まります。</w:t>
-      </w:r>
-    </w:p>
-    <w:p>
-      <w:pPr>
-        <w:pStyle w:val="ListNumber"/>
-        <w:spacing w:after="50"/>
-      </w:pPr>
-      <w:r>
-        <w:rPr>
-          <w:b/>
-        </w:rPr>
-        <w:t>📥 【新機能】最大5冊までのオフライン保存（機内モード・ギガ節約対応）</w:t>
-      </w:r>
-    </w:p>
-    <w:p>
-      <w:pPr>
-        <w:pStyle w:val="ListBullet"/>
-        <w:spacing w:after="50"/>
-      </w:pPr>
-      <w:r>
-        <w:t>外出先や地下鉄、飛行機の中で読みたい本だけ、</w:t>
-      </w:r>
-      <w:r>
-        <w:rPr>
-          <w:b/>
-        </w:rPr>
-        <w:t>自宅のWi-Fi環境でワンタップ事前ダウンロード（最大5冊・約500MB）</w:t>
-      </w:r>
-      <w:r>
-        <w:t xml:space="preserve"> できます。端末へのアクセス許可ダイアログなどは一切不要で、ブラウザ内部の安全な保管庫に保存され、通信ゼロで爆速読書できます。</w:t>
-      </w:r>
-    </w:p>
-    <w:p>
-      <w:pPr>
-        <w:pStyle w:val="ListNumber"/>
-        <w:spacing w:after="50"/>
-      </w:pPr>
-      <w:r>
-        <w:rPr>
-          <w:b/>
-        </w:rPr>
-        <w:t>🔄 クラウドしおり・進捗・表紙の完全自動同期</w:t>
-      </w:r>
-    </w:p>
-    <w:p>
-      <w:pPr>
-        <w:pStyle w:val="ListBullet"/>
-        <w:spacing w:after="50"/>
-      </w:pPr>
-      <w:r>
-        <w:t>読んだページ、読了率、自動生成された軽量表紙サムネイルは、Googleドライブの専用隠し領域（</w:t>
-      </w:r>
-      <w:r>
-        <w:rPr>
-          <w:rFonts w:ascii="Consolas" w:hAnsi="Consolas"/>
-          <w:color w:val="C0392B"/>
-          <w:sz w:val="19"/>
-        </w:rPr>
-        <w:t>appDataFolder</w:t>
-      </w:r>
-      <w:r>
-        <w:t>）に自動保存。PC・スマホ・タブレット間で自動同期されます。</w:t>
-      </w:r>
-    </w:p>
-    <w:p>
-      <w:pPr>
-        <w:pStyle w:val="ListNumber"/>
-        <w:spacing w:after="50"/>
-      </w:pPr>
-      <w:r>
-        <w:rPr>
-          <w:b/>
-        </w:rPr>
-        <w:t>📚 幅広いファイル形式に対応</w:t>
-      </w:r>
-    </w:p>
-    <w:p>
-      <w:pPr>
-        <w:pStyle w:val="ListBullet"/>
-        <w:spacing w:after="50"/>
-      </w:pPr>
-      <w:r>
-        <w:rPr>
-          <w:b/>
-        </w:rPr>
-        <w:t>PDF</w:t>
-      </w:r>
-      <w:r>
-        <w:t>: 高速ベクター描画、単ページ/見開き、右開き/左開き対応。</w:t>
-      </w:r>
-    </w:p>
-    <w:p>
-      <w:pPr>
-        <w:pStyle w:val="ListBullet"/>
-        <w:spacing w:after="50"/>
-      </w:pPr>
-      <w:r>
-        <w:rPr>
-          <w:b/>
-        </w:rPr>
-        <w:t>ZIP / CBZ</w:t>
-      </w:r>
-      <w:r>
-        <w:t>: マンガの見開き自動合成、超軽量ストリーミング展開。</w:t>
-      </w:r>
-    </w:p>
-    <w:p>
-      <w:pPr>
-        <w:pStyle w:val="ListBullet"/>
-        <w:spacing w:after="50"/>
-      </w:pPr>
-      <w:r>
-        <w:rPr>
-          <w:b/>
-        </w:rPr>
-        <w:t>EPUB</w:t>
-      </w:r>
-      <w:r>
-        <w:t>: 縦書き/横書き、文字サイズ変更、目次ジャンプ対応。</w:t>
-      </w:r>
-    </w:p>
-    <w:p>
-      <w:pPr>
-        <w:pStyle w:val="ListNumber"/>
-        <w:spacing w:after="50"/>
-      </w:pPr>
-      <w:r>
-        <w:rPr>
-          <w:b/>
-        </w:rPr>
-        <w:t>📱 PWA対応（全画面ネイティブアプリ化）</w:t>
-      </w:r>
-    </w:p>
-    <w:p>
-      <w:pPr>
-        <w:pStyle w:val="ListBullet"/>
-        <w:spacing w:after="50"/>
-      </w:pPr>
-      <w:r>
-        <w:t>iPhoneやAndroidのホーム画面に追加するだけで、アドレスバーのない全画面アプリとして起動します。</w:t>
-      </w:r>
-    </w:p>
-    <w:p>
-      <w:pPr>
-        <w:pStyle w:val="ListNumber"/>
-        <w:spacing w:after="50"/>
-      </w:pPr>
-      <w:r>
-        <w:rPr>
-          <w:b/>
-        </w:rPr>
-        <w:t>🎨 目に優しい2つの読書空間</w:t>
-      </w:r>
-    </w:p>
-    <w:p>
-      <w:pPr>
-        <w:pStyle w:val="ListBullet"/>
-        <w:spacing w:after="50"/>
-      </w:pPr>
-      <w:r>
-        <w:rPr>
-          <w:b/>
-        </w:rPr>
-        <w:t>Midnight（木造書斎・ダーク）</w:t>
-      </w:r>
-      <w:r>
-        <w:t>: 夜間の読書に最適な落ち着いたウッドトーン。</w:t>
-      </w:r>
-    </w:p>
-    <w:p>
-      <w:pPr>
-        <w:pStyle w:val="ListBullet"/>
-        <w:spacing w:after="50"/>
-      </w:pPr>
-      <w:r>
-        <w:rPr>
-          <w:b/>
-        </w:rPr>
-        <w:t>Paper（和紙ミニマル・ライト）</w:t>
-      </w:r>
-      <w:r>
-        <w:t>: 自然光に馴染む優しい和紙トーン。</w:t>
-      </w:r>
-    </w:p>
-    <w:p>
-      <w:pPr>
-        <w:pStyle w:val="ListNumber"/>
-        <w:spacing w:after="50"/>
-      </w:pPr>
-      <w:r>
-        <w:rPr>
-          <w:b/>
-        </w:rPr>
-        <w:t>🛡️ 読み取り専用 ＋ アプリ専用隠し領域の安全設計</w:t>
-      </w:r>
-    </w:p>
-    <w:p>
-      <w:pPr>
-        <w:pStyle w:val="ListBullet"/>
-        <w:spacing w:after="50"/>
-      </w:pPr>
-      <w:r>
-        <w:t>マンガや書籍は「読み取り専用（</w:t>
-      </w:r>
-      <w:r>
-        <w:rPr>
-          <w:rFonts w:ascii="Consolas" w:hAnsi="Consolas"/>
-          <w:color w:val="C0392B"/>
-          <w:sz w:val="19"/>
-        </w:rPr>
-        <w:t>drive.readonly</w:t>
-      </w:r>
-      <w:r>
-        <w:t>）」で取得し、しおりや進捗はGoogleドライブ内の「アプリ専用隠し領域（</w:t>
-      </w:r>
-      <w:r>
-        <w:rPr>
-          <w:rFonts w:ascii="Consolas" w:hAnsi="Consolas"/>
-          <w:color w:val="C0392B"/>
-          <w:sz w:val="19"/>
-        </w:rPr>
-        <w:t>drive.appdata</w:t>
-      </w:r>
-      <w:r>
-        <w:t>）」にのみ保存。あなたのファイルを編集・削除することはシステム上絶対にできない安心設計です。</w:t>
-      </w:r>
-    </w:p>
-    <w:p>
-      <w:pPr>
-        <w:spacing w:after="80"/>
-      </w:pPr>
-    </w:p>
-    <w:p>
-      <w:pPr>
-        <w:spacing w:before="240" w:after="100"/>
-      </w:pPr>
-      <w:r>
-        <w:rPr>
-          <w:rFonts w:ascii="Yu Gothic" w:hAnsi="Yu Gothic" w:eastAsia="Yu Gothic"/>
-          <w:b/>
-          <w:color w:val="1D4ED8"/>
-          <w:sz w:val="27"/>
-        </w:rPr>
-        <w:t>💡 ストリーミングとオフライン保存の賢い使い分け</w:t>
+        <w:t>1. 本棚フォルダの選択</w:t>
       </w:r>
     </w:p>
     <w:p>
@@ -438,88 +937,16 @@
         <w:spacing w:after="90" w:line="288" w:lineRule="auto"/>
       </w:pPr>
       <w:r>
-        <w:t>| モード | メリット | こんな時におすすめ |</w:t>
-      </w:r>
-    </w:p>
-    <w:p>
-      <w:pPr>
-        <w:spacing w:after="90" w:line="288" w:lineRule="auto"/>
-      </w:pPr>
-      <w:r>
-        <w:t>| :--- | :--- | :--- |</w:t>
-      </w:r>
-    </w:p>
-    <w:p>
-      <w:pPr>
-        <w:spacing w:after="90" w:line="288" w:lineRule="auto"/>
-      </w:pPr>
-      <w:r>
-        <w:t xml:space="preserve">| </w:t>
+        <w:t xml:space="preserve">トップ画面中央の </w:t>
       </w:r>
       <w:r>
         <w:rPr>
           <w:b/>
         </w:rPr>
-        <w:t>⚡ 通常ストリーミング</w:t>
+        <w:t>「Googleドライブから本棚フォルダを選択」</w:t>
       </w:r>
       <w:r>
-        <w:t xml:space="preserve"> | 容量消費ゼロ・待ち時間ゼロ | 自宅やWi-Fi環境、数ページだけの試し読み、何千冊ものライブラリを自由に読みたい時 |</w:t>
-      </w:r>
-    </w:p>
-    <w:p>
-      <w:pPr>
-        <w:spacing w:after="90" w:line="288" w:lineRule="auto"/>
-      </w:pPr>
-      <w:r>
-        <w:t xml:space="preserve">| </w:t>
-      </w:r>
-      <w:r>
-        <w:rPr>
-          <w:b/>
-        </w:rPr>
-        <w:t>📥 オフライン保存（最大5冊）</w:t>
-      </w:r>
-      <w:r>
-        <w:t xml:space="preserve"> | 完全通信量ゼロ・電波なしOK | 外出前のWi-Fi環境で保存し、地下鉄、飛行機、月末のギガ節約で読みたい時 |</w:t>
-      </w:r>
-    </w:p>
-    <w:p>
-      <w:pPr>
-        <w:spacing w:after="80"/>
-      </w:pPr>
-    </w:p>
-    <w:p>
-      <w:pPr>
-        <w:spacing w:before="240" w:after="100"/>
-      </w:pPr>
-      <w:r>
-        <w:rPr>
-          <w:rFonts w:ascii="Yu Gothic" w:hAnsi="Yu Gothic" w:eastAsia="Yu Gothic"/>
-          <w:b/>
-          <w:color w:val="1D4ED8"/>
-          <w:sz w:val="27"/>
-        </w:rPr>
-        <w:t>🚀 かんたん3ステップ！使い方ガイド（所要時間：10秒）</w:t>
-      </w:r>
-    </w:p>
-    <w:p>
-      <w:pPr>
-        <w:spacing w:before="60" w:after="120"/>
-        <w:ind w:left="288"/>
-      </w:pPr>
-      <w:r>
-        <w:rPr>
-          <w:rFonts w:ascii="Consolas" w:hAnsi="Consolas"/>
-          <w:color w:val="333333"/>
-          <w:sz w:val="19"/>
-        </w:rPr>
-        <w:t>flowchart LR</w:t>
-        <w:br/>
-        <w:t xml:space="preserve">    A["① サイトにアクセス&lt;br/&gt;https://reader.puzzleout.net"] --&gt; B["② Googleでログイン"]</w:t>
-        <w:br/>
-        <w:t xml:space="preserve">    B --&gt; C["③ 本棚フォルダを1つ選択"]</w:t>
-        <w:br/>
-        <w:t xml:space="preserve">    C --&gt; D["🎉 いつでもどこでも&lt;br/&gt;快適読書スタート！"]</w:t>
+        <w:t xml:space="preserve"> を押し、マンガや自炊本が入っているフォルダを指定します。フォルダ配下の書籍・サブフォルダが即座に一覧表示されます。</w:t>
       </w:r>
     </w:p>
     <w:p>
@@ -533,41 +960,52 @@
           <w:color w:val="374151"/>
           <w:sz w:val="23"/>
         </w:rPr>
-        <w:t>ステップ1: サイトにアクセスしてログイン</w:t>
+        <w:t>2. 📥 オフライン保存（最大5冊）の使い方</w:t>
       </w:r>
     </w:p>
     <w:p>
       <w:pPr>
-        <w:pStyle w:val="ListNumber"/>
+        <w:pStyle w:val="ListBullet"/>
         <w:spacing w:after="50"/>
       </w:pPr>
       <w:r>
-        <w:t xml:space="preserve">ブラウザで </w:t>
+        <w:t xml:space="preserve">各書籍の右側にある </w:t>
       </w:r>
       <w:r>
         <w:rPr>
-          <w:color w:val="1D4ED8"/>
-          <w:u w:val="single"/>
+          <w:b/>
         </w:rPr>
-        <w:t>https://reader.puzzleout.net (https://reader.puzzleout.net)</w:t>
+        <w:t>「📥（ダウンロード）」</w:t>
       </w:r>
       <w:r>
-        <w:t xml:space="preserve"> を開きます。</w:t>
+        <w:t xml:space="preserve"> アイコンを押すと、ブラウザ内部の安全な保管庫に本が丸ごとキャッシュされます。</w:t>
       </w:r>
     </w:p>
     <w:p>
       <w:pPr>
-        <w:pStyle w:val="ListNumber"/>
+        <w:pStyle w:val="ListBullet"/>
         <w:spacing w:after="50"/>
       </w:pPr>
+      <w:r>
+        <w:t>保存された本は、</w:t>
+      </w:r>
       <w:r>
         <w:rPr>
           <w:b/>
         </w:rPr>
-        <w:t>「Googleアカウントでログイン」</w:t>
+        <w:t>機内モードや地下鉄など電波のない場所でも通信量ゼロ・待ち時間ゼロ</w:t>
       </w:r>
       <w:r>
-        <w:t xml:space="preserve"> をクリックし、ご自身のGoogleアカウントを選択してログインします。</w:t>
+        <w:t xml:space="preserve"> で読書できます。</w:t>
+      </w:r>
+    </w:p>
+    <w:p>
+      <w:pPr>
+        <w:pStyle w:val="ListBullet"/>
+        <w:spacing w:after="50"/>
+      </w:pPr>
+      <w:r>
+        <w:t>不要になった本は「保存リストを見る」からゴミ箱アイコンですぐに削除できます。</w:t>
       </w:r>
     </w:p>
     <w:p>
@@ -581,335 +1019,46 @@
           <w:color w:val="374151"/>
           <w:sz w:val="23"/>
         </w:rPr>
-        <w:t>ステップ2: 本棚にするフォルダを選択（初回のみ）</w:t>
+        <w:t>3. スマートフォンでのアプリ化（PWA設定）</w:t>
       </w:r>
     </w:p>
     <w:p>
       <w:pPr>
-        <w:pStyle w:val="ListNumber"/>
-        <w:spacing w:after="50"/>
-      </w:pPr>
-      <w:r>
-        <w:t xml:space="preserve">画面中央の </w:t>
-      </w:r>
-      <w:r>
-        <w:rPr>
-          <w:b/>
-        </w:rPr>
-        <w:t>「Googleドライブから本棚フォルダを選択」</w:t>
-      </w:r>
-      <w:r>
-        <w:t xml:space="preserve"> ボタンをクリックします。</w:t>
-      </w:r>
-    </w:p>
-    <w:p>
-      <w:pPr>
-        <w:pStyle w:val="ListNumber"/>
-        <w:spacing w:after="50"/>
-      </w:pPr>
-      <w:r>
-        <w:t xml:space="preserve">Google公式のフォルダ選択画面が開きますので、マンガや書籍が入っている </w:t>
-      </w:r>
-      <w:r>
-        <w:rPr>
-          <w:b/>
-        </w:rPr>
-        <w:t>「マンガ」や「自炊本」フォルダを選択して「選択」</w:t>
-      </w:r>
-      <w:r>
-        <w:t xml:space="preserve"> を押します。</w:t>
-      </w:r>
-    </w:p>
-    <w:p>
-      <w:pPr>
-        <w:spacing w:before="180" w:after="60"/>
-      </w:pPr>
-      <w:r>
-        <w:rPr>
-          <w:rFonts w:ascii="Yu Gothic" w:hAnsi="Yu Gothic" w:eastAsia="Yu Gothic"/>
-          <w:b/>
-          <w:color w:val="374151"/>
-          <w:sz w:val="23"/>
-        </w:rPr>
-        <w:t>ステップ3: 読書スタート！</w:t>
-      </w:r>
-    </w:p>
-    <w:p>
-      <w:pPr>
-        <w:spacing w:after="90" w:line="288" w:lineRule="auto"/>
-      </w:pPr>
-      <w:r>
-        <w:t>選択したフォルダ内の本やサブフォルダ（1巻、2巻...）が一覧表示されます。読みたい本をタップすれば、すぐにストリーミング読書が始まります！</w:t>
-      </w:r>
-    </w:p>
-    <w:p>
-      <w:pPr>
-        <w:spacing w:after="80"/>
-      </w:pPr>
-    </w:p>
-    <w:p>
-      <w:pPr>
-        <w:spacing w:before="240" w:after="100"/>
-      </w:pPr>
-      <w:r>
-        <w:rPr>
-          <w:rFonts w:ascii="Yu Gothic" w:hAnsi="Yu Gothic" w:eastAsia="Yu Gothic"/>
-          <w:b/>
-          <w:color w:val="1D4ED8"/>
-          <w:sz w:val="27"/>
-        </w:rPr>
-        <w:t>📥 オフライン保存（ダウンロード）の使い方</w:t>
-      </w:r>
-    </w:p>
-    <w:p>
-      <w:pPr>
-        <w:pStyle w:val="ListNumber"/>
-        <w:spacing w:after="50"/>
-      </w:pPr>
-      <w:r>
-        <w:t xml:space="preserve">書籍一覧の右側にある </w:t>
-      </w:r>
-      <w:r>
-        <w:rPr>
-          <w:b/>
-        </w:rPr>
-        <w:t>「📥（ダウンロード）」アイコン</w:t>
-      </w:r>
-      <w:r>
-        <w:t xml:space="preserve"> をクリックします。</w:t>
-      </w:r>
-    </w:p>
-    <w:p>
-      <w:pPr>
-        <w:pStyle w:val="ListNumber"/>
-        <w:spacing w:after="50"/>
-      </w:pPr>
-      <w:r>
-        <w:t>数秒〜十数秒でダウンロードが完了し、</w:t>
-      </w:r>
-      <w:r>
-        <w:rPr>
-          <w:b/>
-        </w:rPr>
-        <w:t>「✅ 保存済」</w:t>
-      </w:r>
-      <w:r>
-        <w:t xml:space="preserve"> バッジに変わります。</w:t>
-      </w:r>
-    </w:p>
-    <w:p>
-      <w:pPr>
-        <w:pStyle w:val="ListNumber"/>
-        <w:spacing w:after="50"/>
-      </w:pPr>
-      <w:r>
-        <w:t>保存した本は、</w:t>
-      </w:r>
-      <w:r>
-        <w:rPr>
-          <w:b/>
-        </w:rPr>
-        <w:t>電波のない場所（機内モードやオフライン環境）でも通信量ゼロ・爆速</w:t>
-      </w:r>
-      <w:r>
-        <w:t xml:space="preserve"> で開いて読書できます。</w:t>
-      </w:r>
-    </w:p>
-    <w:p>
-      <w:pPr>
-        <w:pStyle w:val="ListNumber"/>
-        <w:spacing w:after="50"/>
-      </w:pPr>
-      <w:r>
-        <w:t xml:space="preserve">本棚上部の </w:t>
-      </w:r>
-      <w:r>
-        <w:rPr>
-          <w:b/>
-        </w:rPr>
-        <w:t>「保存リストを見る」</w:t>
-      </w:r>
-      <w:r>
-        <w:t xml:space="preserve"> から、保存中の本の一覧や合計容量の確認、不要になった本の削除（ゴミ箱アイコン）がいつでも行えます。</w:t>
-      </w:r>
-    </w:p>
-    <w:p>
-      <w:pPr>
-        <w:spacing w:after="80"/>
-      </w:pPr>
-    </w:p>
-    <w:p>
-      <w:pPr>
-        <w:spacing w:before="240" w:after="100"/>
-      </w:pPr>
-      <w:r>
-        <w:rPr>
-          <w:rFonts w:ascii="Yu Gothic" w:hAnsi="Yu Gothic" w:eastAsia="Yu Gothic"/>
-          <w:b/>
-          <w:color w:val="1D4ED8"/>
-          <w:sz w:val="27"/>
-        </w:rPr>
-        <w:t>📱 スマホ・タブレットでアプリ化する（PWA設定）</w:t>
-      </w:r>
-    </w:p>
-    <w:p>
-      <w:pPr>
-        <w:spacing w:after="90" w:line="288" w:lineRule="auto"/>
-      </w:pPr>
-      <w:r>
-        <w:t>ブラウザのアドレスバーを非表示にし、専用アプリのように全画面で読書するための設定です。</w:t>
-      </w:r>
-    </w:p>
-    <w:p>
-      <w:pPr>
-        <w:spacing w:before="180" w:after="60"/>
-      </w:pPr>
-      <w:r>
-        <w:rPr>
-          <w:rFonts w:ascii="Yu Gothic" w:hAnsi="Yu Gothic" w:eastAsia="Yu Gothic"/>
-          <w:b/>
-          <w:color w:val="374151"/>
-          <w:sz w:val="23"/>
-        </w:rPr>
-        <w:t>🍎 iPhone / iPad (Safari)</w:t>
-      </w:r>
-    </w:p>
-    <w:p>
-      <w:pPr>
-        <w:pStyle w:val="ListNumber"/>
-        <w:spacing w:after="50"/>
-      </w:pPr>
-      <w:r>
-        <w:t xml:space="preserve">Safariで </w:t>
-      </w:r>
-      <w:r>
-        <w:rPr>
-          <w:color w:val="1D4ED8"/>
-          <w:u w:val="single"/>
-        </w:rPr>
-        <w:t>https://reader.puzzleout.net (https://reader.puzzleout.net)</w:t>
-      </w:r>
-      <w:r>
-        <w:t xml:space="preserve"> を開きます。</w:t>
-      </w:r>
-    </w:p>
-    <w:p>
-      <w:pPr>
-        <w:pStyle w:val="ListNumber"/>
-        <w:spacing w:after="50"/>
-      </w:pPr>
-      <w:r>
-        <w:t xml:space="preserve">画面下部の中央にある </w:t>
-      </w:r>
-      <w:r>
-        <w:rPr>
-          <w:b/>
-        </w:rPr>
-        <w:t>「共有ボタン（四角から上矢印）」</w:t>
-      </w:r>
-      <w:r>
-        <w:t xml:space="preserve"> をタップします。</w:t>
-      </w:r>
-    </w:p>
-    <w:p>
-      <w:pPr>
-        <w:pStyle w:val="ListNumber"/>
-        <w:spacing w:after="50"/>
-      </w:pPr>
-      <w:r>
-        <w:t xml:space="preserve">メニューから </w:t>
-      </w:r>
-      <w:r>
-        <w:rPr>
-          <w:b/>
-        </w:rPr>
-        <w:t>「ホーム画面に追加」</w:t>
-      </w:r>
-      <w:r>
-        <w:t xml:space="preserve"> を選択します。</w:t>
-      </w:r>
-    </w:p>
-    <w:p>
-      <w:pPr>
-        <w:spacing w:before="180" w:after="60"/>
-      </w:pPr>
-      <w:r>
-        <w:rPr>
-          <w:rFonts w:ascii="Yu Gothic" w:hAnsi="Yu Gothic" w:eastAsia="Yu Gothic"/>
-          <w:b/>
-          <w:color w:val="374151"/>
-          <w:sz w:val="23"/>
-        </w:rPr>
-        <w:t>🤖 Android (Chrome)</w:t>
-      </w:r>
-    </w:p>
-    <w:p>
-      <w:pPr>
-        <w:pStyle w:val="ListNumber"/>
-        <w:spacing w:after="50"/>
-      </w:pPr>
-      <w:r>
-        <w:t xml:space="preserve">Chromeで </w:t>
-      </w:r>
-      <w:r>
-        <w:rPr>
-          <w:color w:val="1D4ED8"/>
-          <w:u w:val="single"/>
-        </w:rPr>
-        <w:t>https://reader.puzzleout.net (https://reader.puzzleout.net)</w:t>
-      </w:r>
-      <w:r>
-        <w:t xml:space="preserve"> を開きます。</w:t>
-      </w:r>
-    </w:p>
-    <w:p>
-      <w:pPr>
-        <w:pStyle w:val="ListNumber"/>
-        <w:spacing w:after="50"/>
-      </w:pPr>
-      <w:r>
-        <w:t xml:space="preserve">右上の </w:t>
-      </w:r>
-      <w:r>
-        <w:rPr>
-          <w:b/>
-        </w:rPr>
-        <w:t>「3点メニュー（︙）」</w:t>
-      </w:r>
-      <w:r>
-        <w:t xml:space="preserve"> をタップします。</w:t>
-      </w:r>
-    </w:p>
-    <w:p>
-      <w:pPr>
-        <w:pStyle w:val="ListNumber"/>
+        <w:pStyle w:val="ListBullet"/>
         <w:spacing w:after="50"/>
       </w:pPr>
       <w:r>
         <w:rPr>
           <w:b/>
         </w:rPr>
-        <w:t>「アプリをインストール」</w:t>
+        <w:t>iPhone / iPad (Safari)</w:t>
       </w:r>
       <w:r>
-        <w:t>（または「ホーム画面に追加」）を選択します。</w:t>
+        <w:t>: 画面下の共有ボタン →「ホーム画面に追加」</w:t>
       </w:r>
     </w:p>
     <w:p>
       <w:pPr>
-        <w:spacing w:after="90" w:line="288" w:lineRule="auto"/>
+        <w:pStyle w:val="ListBullet"/>
+        <w:spacing w:after="50"/>
       </w:pPr>
-      <w:r>
-        <w:t xml:space="preserve">ホーム画面に作成された </w:t>
-      </w:r>
       <w:r>
         <w:rPr>
           <w:b/>
         </w:rPr>
-        <w:t>「CloudReader」</w:t>
+        <w:t>Android (Chrome)</w:t>
       </w:r>
       <w:r>
-        <w:t xml:space="preserve"> アイコンをタップするだけで、いつでもワンタップで全画面リーダーが起動します！</w:t>
+        <w:t>: 右上メニュー「︙」→「アプリをインストール」</w:t>
+      </w:r>
+    </w:p>
+    <w:p>
+      <w:pPr>
+        <w:pStyle w:val="ListBullet"/>
+        <w:spacing w:after="50"/>
+      </w:pPr>
+      <w:r>
+        <w:t>ホーム画面にアイコンが作成され、全画面専用アプリとして起動します。</w:t>
       </w:r>
     </w:p>
     <w:p>
@@ -942,7 +1091,7 @@
           <w:color w:val="374151"/>
           <w:sz w:val="23"/>
         </w:rPr>
-        <w:t>Q. 完全無料で利用できますか？</w:t>
+        <w:t>Q. 本当に完全無料で使い続けられますか？</w:t>
       </w:r>
     </w:p>
     <w:p>
@@ -955,7 +1104,7 @@
           <w:i/>
           <w:color w:val="4B5563"/>
         </w:rPr>
-        <w:t>はい、完全無料です。利用料金や課金は一切発生しません。</w:t>
+        <w:t>はい。Google Cloud も Vercel も無料枠が非常に大きく、個人での読書用途であれば料金が発生することは一切ありません。</w:t>
       </w:r>
     </w:p>
     <w:p>
@@ -969,7 +1118,7 @@
           <w:color w:val="374151"/>
           <w:sz w:val="23"/>
         </w:rPr>
-        <w:t>Q. Googleドライブ内のプライベートなファイルを見られる心配はありませんか？</w:t>
+        <w:t>Q. スマホの容量を消費しませんか？</w:t>
       </w:r>
     </w:p>
     <w:p>
@@ -982,34 +1131,7 @@
           <w:i/>
           <w:color w:val="4B5563"/>
         </w:rPr>
-        <w:t>一切ありません。Googleの公式安全規格（`drive.file`）に準拠しており、あなたが「本棚」として選択したフォルダ以外のデータ（写真やドキュメントなど）には、アプリ側から一切アクセスできない仕組みになっています。また、ファイルが開発者のサーバーに保存されることもありません。</w:t>
-      </w:r>
-    </w:p>
-    <w:p>
-      <w:pPr>
-        <w:spacing w:before="180" w:after="60"/>
-      </w:pPr>
-      <w:r>
-        <w:rPr>
-          <w:rFonts w:ascii="Yu Gothic" w:hAnsi="Yu Gothic" w:eastAsia="Yu Gothic"/>
-          <w:b/>
-          <w:color w:val="374151"/>
-          <w:sz w:val="23"/>
-        </w:rPr>
-        <w:t>Q. オフライン保存でスマホの容量を圧迫しませんか？</w:t>
-      </w:r>
-    </w:p>
-    <w:p>
-      <w:pPr>
-        <w:spacing w:before="40" w:after="60"/>
-        <w:ind w:left="288"/>
-      </w:pPr>
-      <w:r>
-        <w:rPr>
-          <w:i/>
-          <w:color w:val="4B5563"/>
-        </w:rPr>
-        <w:t>最大5冊（約500MB程度）に制限されているため、スマートフォンの容量を圧迫することはありません。読み終わったらゴミ箱アイコンですぐに削除して空き容量を戻せます。</w:t>
+        <w:t>通常ストリーミング時は端末容量を1MBも消費しません。オフライン保存時のみ指定した本（最大5冊・約500MB）が一時保存されますが、読み終わったらワンタップで削除して空き容量を戻せます。</w:t>
       </w:r>
     </w:p>
     <w:p>
@@ -1022,7 +1144,7 @@
         <w:spacing w:after="90" w:line="288" w:lineRule="auto"/>
       </w:pPr>
       <w:r>
-        <w:t>お気に入りの自炊本とともに、快適なクラウド読書ライフをお楽しみください！☕📖</w:t>
+        <w:t>あなただけの専用クラウド本棚で、快適な自炊読書ライフをお楽しみください！☕📖</w:t>
       </w:r>
     </w:p>
     <w:sectPr>

</xml_diff>

<commit_message>
Update manuals with open source transparency and security audit methods
</commit_message>
<xml_diff>
--- a/Cloud_BookReader_Manual.docx
+++ b/Cloud_BookReader_Manual.docx
@@ -188,6 +188,127 @@
       </w:pPr>
       <w:r>
         <w:t>外出先や地下鉄・飛行機で読みたい本だけ、自宅のWi-Fiでワンタップ保存（通信量ゼロ・機内モード対応）。</w:t>
+      </w:r>
+    </w:p>
+    <w:p>
+      <w:pPr>
+        <w:spacing w:after="80"/>
+      </w:pPr>
+    </w:p>
+    <w:p>
+      <w:pPr>
+        <w:spacing w:before="240" w:after="100"/>
+      </w:pPr>
+      <w:r>
+        <w:rPr>
+          <w:rFonts w:ascii="Yu Gothic" w:hAnsi="Yu Gothic" w:eastAsia="Yu Gothic"/>
+          <w:b/>
+          <w:color w:val="1D4ED8"/>
+          <w:sz w:val="27"/>
+        </w:rPr>
+        <w:t>🔍 アプリの信頼性と透明性（ソースコードの確認方法）</w:t>
+      </w:r>
+    </w:p>
+    <w:p>
+      <w:pPr>
+        <w:spacing w:after="90" w:line="288" w:lineRule="auto"/>
+      </w:pPr>
+      <w:r>
+        <w:t xml:space="preserve">「自分のGoogleドライブを連携しても本当に安全か？」を誰もが自身の目で検証できるよう、本アプリは </w:t>
+      </w:r>
+      <w:r>
+        <w:rPr>
+          <w:b/>
+        </w:rPr>
+        <w:t>完全なオープン性・透明性</w:t>
+      </w:r>
+      <w:r>
+        <w:t xml:space="preserve"> を担保しています。</w:t>
+      </w:r>
+    </w:p>
+    <w:p>
+      <w:pPr>
+        <w:spacing w:before="180" w:after="60"/>
+      </w:pPr>
+      <w:r>
+        <w:rPr>
+          <w:rFonts w:ascii="Yu Gothic" w:hAnsi="Yu Gothic" w:eastAsia="Yu Gothic"/>
+          <w:b/>
+          <w:color w:val="374151"/>
+          <w:sz w:val="23"/>
+        </w:rPr>
+        <w:t>1. 全ソースコードをGitHubで完全公開</w:t>
+      </w:r>
+    </w:p>
+    <w:p>
+      <w:pPr>
+        <w:spacing w:after="90" w:line="288" w:lineRule="auto"/>
+      </w:pPr>
+      <w:r>
+        <w:t xml:space="preserve">本アプリのプログラムコードは、すべて </w:t>
+      </w:r>
+      <w:r>
+        <w:rPr>
+          <w:color w:val="1D4ED8"/>
+          <w:u w:val="single"/>
+        </w:rPr>
+        <w:t>GitHubリポジトリ（オープンソース） (https://github.com/ryo22-jp/Cloud-Bookreader)</w:t>
+      </w:r>
+      <w:r>
+        <w:t xml:space="preserve"> で公開されています。バックドアや不正なデータ送信処理が含まれていないことを、誰でも1行残らず確認できます。</w:t>
+      </w:r>
+    </w:p>
+    <w:p>
+      <w:pPr>
+        <w:spacing w:before="180" w:after="60"/>
+      </w:pPr>
+      <w:r>
+        <w:rPr>
+          <w:rFonts w:ascii="Yu Gothic" w:hAnsi="Yu Gothic" w:eastAsia="Yu Gothic"/>
+          <w:b/>
+          <w:color w:val="374151"/>
+          <w:sz w:val="23"/>
+        </w:rPr>
+        <w:t>2. ソースコードから直接ビルド（改ざん不能）</w:t>
+      </w:r>
+    </w:p>
+    <w:p>
+      <w:pPr>
+        <w:spacing w:after="90" w:line="288" w:lineRule="auto"/>
+      </w:pPr>
+      <w:r>
+        <w:t>「Deploy to Vercel」ボタンを押すと、GitHub上の公開コードがそのままあなた自身のGitHubアカウントに複製（Fork）され、そこから自動ビルドされます。開発者が裏で別のプログラムを差し挟む余地は一切ありません。</w:t>
+      </w:r>
+    </w:p>
+    <w:p>
+      <w:pPr>
+        <w:spacing w:before="180" w:after="60"/>
+      </w:pPr>
+      <w:r>
+        <w:rPr>
+          <w:rFonts w:ascii="Yu Gothic" w:hAnsi="Yu Gothic" w:eastAsia="Yu Gothic"/>
+          <w:b/>
+          <w:color w:val="374151"/>
+          <w:sz w:val="23"/>
+        </w:rPr>
+        <w:t>3. ブラウザ（F12）で通信先をいつでも検証可能</w:t>
+      </w:r>
+    </w:p>
+    <w:p>
+      <w:pPr>
+        <w:spacing w:after="90" w:line="288" w:lineRule="auto"/>
+      </w:pPr>
+      <w:r>
+        <w:t>ブラウザの開発者ツール（F12）の「Network（ネットワーク）」タブを開くことで、</w:t>
+      </w:r>
+      <w:r>
+        <w:rPr>
+          <w:b/>
+        </w:rPr>
+        <w:t>「通信相手がGoogle公式サーバー（`googleapis.com`）とあなた自身のVercelサーバーのみであること」</w:t>
+      </w:r>
+      <w:r>
+        <w:t xml:space="preserve"> をリアルタイムに直接確認できます。</w:t>
       </w:r>
     </w:p>
     <w:p>

</xml_diff>

<commit_message>
Update official guide URL to puzzleout.net/cloud-book-reader
</commit_message>
<xml_diff>
--- a/Cloud_BookReader_Manual.docx
+++ b/Cloud_BookReader_Manual.docx
@@ -57,6 +57,30 @@
       </w:r>
       <w:r>
         <w:t xml:space="preserve"> できます。</w:t>
+      </w:r>
+    </w:p>
+    <w:p>
+      <w:pPr>
+        <w:spacing w:after="90" w:line="288" w:lineRule="auto"/>
+      </w:pPr>
+      <w:r>
+        <w:t xml:space="preserve">📖 </w:t>
+      </w:r>
+      <w:r>
+        <w:rPr>
+          <w:b/>
+        </w:rPr>
+        <w:t>公式紹介記事URL</w:t>
+      </w:r>
+      <w:r>
+        <w:t xml:space="preserve">: </w:t>
+      </w:r>
+      <w:r>
+        <w:rPr>
+          <w:color w:val="1D4ED8"/>
+          <w:u w:val="single"/>
+        </w:rPr>
+        <w:t>https://puzzleout.net/cloud-book-reader (https://puzzleout.net/cloud-book-reader)</w:t>
       </w:r>
     </w:p>
     <w:p>

</xml_diff>

<commit_message>
Add OneDrive and Home NAS setup guide page and update manuals
</commit_message>
<xml_diff>
--- a/Cloud_BookReader_Manual.docx
+++ b/Cloud_BookReader_Manual.docx
@@ -13,7 +13,7 @@
           <w:color w:val="111827"/>
           <w:sz w:val="34"/>
         </w:rPr>
-        <w:t>【完全無料・自分専用】Googleドライブの自炊マンガ・書籍を全デバイスで爆速ストリーミング！「Cloud BookReader」導入＆操作マニュアル</w:t>
+        <w:t>【完全無料・マルチクラウド対応】Google Drive / OneDrive / 自宅NASの自炊本を全デバイスで爆速ストリーミング！「Cloud BookReader」導入＆操作マニュアル</w:t>
       </w:r>
     </w:p>
     <w:p>
@@ -21,7 +21,7 @@
         <w:spacing w:after="90" w:line="288" w:lineRule="auto"/>
       </w:pPr>
       <w:r>
-        <w:t>Googleドライブに保存してある自炊マンガや電子書籍（PDF / ZIP / CBZ / EPUB）を、</w:t>
+        <w:t>Google Drive、Microsoft OneDrive、およびご自宅のNAS（Synology、QNAP、Nextcloud等）に保存してある自炊マンガや電子書籍（PDF / ZIP / CBZ / EPUB）を、</w:t>
       </w:r>
       <w:r>
         <w:rPr>
@@ -85,6 +85,116 @@
     </w:p>
     <w:p>
       <w:pPr>
+        <w:spacing w:after="90" w:line="288" w:lineRule="auto"/>
+      </w:pPr>
+      <w:r>
+        <w:t xml:space="preserve">🌐 </w:t>
+      </w:r>
+      <w:r>
+        <w:rPr>
+          <w:b/>
+        </w:rPr>
+        <w:t>OneDrive ＆ 自宅NAS 設定Webガイド</w:t>
+      </w:r>
+      <w:r>
+        <w:t xml:space="preserve">: </w:t>
+      </w:r>
+      <w:r>
+        <w:rPr>
+          <w:color w:val="1D4ED8"/>
+          <w:u w:val="single"/>
+        </w:rPr>
+        <w:t>https://cloud-bookreader.vercel.app/guide (https://cloud-bookreader.vercel.app/guide)</w:t>
+      </w:r>
+    </w:p>
+    <w:p>
+      <w:pPr>
+        <w:spacing w:after="80"/>
+      </w:pPr>
+    </w:p>
+    <w:p>
+      <w:pPr>
+        <w:spacing w:before="240" w:after="100"/>
+      </w:pPr>
+      <w:r>
+        <w:rPr>
+          <w:rFonts w:ascii="Yu Gothic" w:hAnsi="Yu Gothic" w:eastAsia="Yu Gothic"/>
+          <w:b/>
+          <w:color w:val="1D4ED8"/>
+          <w:sz w:val="27"/>
+        </w:rPr>
+        <w:t>🌟 対応ストレージと特徴</w:t>
+      </w:r>
+    </w:p>
+    <w:p>
+      <w:pPr>
+        <w:spacing w:after="90" w:line="288" w:lineRule="auto"/>
+      </w:pPr>
+      <w:r>
+        <w:t>| ストレージ | おすすめユーザー | 特徴 |</w:t>
+      </w:r>
+    </w:p>
+    <w:p>
+      <w:pPr>
+        <w:spacing w:after="90" w:line="288" w:lineRule="auto"/>
+      </w:pPr>
+      <w:r>
+        <w:t>| :--- | :--- | :--- |</w:t>
+      </w:r>
+    </w:p>
+    <w:p>
+      <w:pPr>
+        <w:spacing w:after="90" w:line="288" w:lineRule="auto"/>
+      </w:pPr>
+      <w:r>
+        <w:t xml:space="preserve">| </w:t>
+      </w:r>
+      <w:r>
+        <w:rPr>
+          <w:b/>
+        </w:rPr>
+        <w:t>🔴 Google Drive</w:t>
+      </w:r>
+      <w:r>
+        <w:t xml:space="preserve"> | すべてのGoogleユーザー | アプリ設定・しおりを専用隠し領域に自動同期 |</w:t>
+      </w:r>
+    </w:p>
+    <w:p>
+      <w:pPr>
+        <w:spacing w:after="90" w:line="288" w:lineRule="auto"/>
+      </w:pPr>
+      <w:r>
+        <w:t xml:space="preserve">| </w:t>
+      </w:r>
+      <w:r>
+        <w:rPr>
+          <w:b/>
+        </w:rPr>
+        <w:t>🔵 Microsoft OneDrive</w:t>
+      </w:r>
+      <w:r>
+        <w:t xml:space="preserve"> | Microsoft 365 ユーザー | 1TBの大容量をフル活用。Graph API による爆速ストリーミング |</w:t>
+      </w:r>
+    </w:p>
+    <w:p>
+      <w:pPr>
+        <w:spacing w:after="90" w:line="288" w:lineRule="auto"/>
+      </w:pPr>
+      <w:r>
+        <w:t xml:space="preserve">| </w:t>
+      </w:r>
+      <w:r>
+        <w:rPr>
+          <w:b/>
+        </w:rPr>
+        <w:t>🏠 自宅NAS (WebDAV)</w:t>
+      </w:r>
+      <w:r>
+        <w:t xml:space="preserve"> | 自炊ヘビーユーザー | Synology / QNAP 等のテラバイト級ハードディスクに直結。容量無制限 |</w:t>
+      </w:r>
+    </w:p>
+    <w:p>
+      <w:pPr>
         <w:spacing w:after="80"/>
       </w:pPr>
     </w:p>
@@ -113,7 +223,7 @@
         <w:rPr>
           <w:b/>
         </w:rPr>
-        <w:t>無料のVercelサーバー ＋ ご自身のGoogle Cloudキー</w:t>
+        <w:t>無料のVercelサーバー ＋ ご自身のAPIキー</w:t>
       </w:r>
       <w:r>
         <w:t xml:space="preserve"> を使って、</w:t>
@@ -163,7 +273,7 @@
         <w:spacing w:after="50"/>
       </w:pPr>
       <w:r>
-        <w:t>あなたのGoogleドライブデータにアクセスできるのは「あなた自身」だけです。第三者のサーバーにデータが渡るリスクは一切ありません。</w:t>
+        <w:t>あなたのクラウドやNASデータにアクセスできるのは「あなた自身」だけです。第三者のサーバーにデータが渡るリスクは一切ありません。</w:t>
       </w:r>
     </w:p>
     <w:p>
@@ -238,7 +348,7 @@
         <w:spacing w:after="90" w:line="288" w:lineRule="auto"/>
       </w:pPr>
       <w:r>
-        <w:t xml:space="preserve">「自分のGoogleドライブを連携しても本当に安全か？」を誰もが自身の目で検証できるよう、本アプリは </w:t>
+        <w:t xml:space="preserve">「自分のクラウドやNASを連携しても本当に安全か？」を誰もが自身の目で検証できるよう、本アプリは </w:t>
       </w:r>
       <w:r>
         <w:rPr>
@@ -252,24 +362,17 @@
     </w:p>
     <w:p>
       <w:pPr>
-        <w:spacing w:before="180" w:after="60"/>
+        <w:pStyle w:val="ListNumber"/>
+        <w:spacing w:after="50"/>
       </w:pPr>
       <w:r>
         <w:rPr>
-          <w:rFonts w:ascii="Yu Gothic" w:hAnsi="Yu Gothic" w:eastAsia="Yu Gothic"/>
           <w:b/>
-          <w:color w:val="374151"/>
-          <w:sz w:val="23"/>
         </w:rPr>
-        <w:t>1. 全ソースコードをGitHubで完全公開</w:t>
+        <w:t>全ソースコードをGitHubで完全公開</w:t>
       </w:r>
-    </w:p>
-    <w:p>
-      <w:pPr>
-        <w:spacing w:after="90" w:line="288" w:lineRule="auto"/>
-      </w:pPr>
       <w:r>
-        <w:t xml:space="preserve">本アプリのプログラムコードは、すべて </w:t>
+        <w:t xml:space="preserve">: すべてのプログラムコードは </w:t>
       </w:r>
       <w:r>
         <w:rPr>
@@ -279,60 +382,37 @@
         <w:t>GitHubリポジトリ（オープンソース） (https://github.com/ryo22-jp/Cloud-Bookreader)</w:t>
       </w:r>
       <w:r>
-        <w:t xml:space="preserve"> で公開されています。バックドアや不正なデータ送信処理が含まれていないことを、誰でも1行残らず確認できます。</w:t>
+        <w:t xml:space="preserve"> で公開されており、バックドアや不正なデータ送信がないことを1行残らず確認できます。</w:t>
       </w:r>
     </w:p>
     <w:p>
       <w:pPr>
-        <w:spacing w:before="180" w:after="60"/>
+        <w:pStyle w:val="ListNumber"/>
+        <w:spacing w:after="50"/>
       </w:pPr>
       <w:r>
         <w:rPr>
-          <w:rFonts w:ascii="Yu Gothic" w:hAnsi="Yu Gothic" w:eastAsia="Yu Gothic"/>
           <w:b/>
-          <w:color w:val="374151"/>
-          <w:sz w:val="23"/>
         </w:rPr>
-        <w:t>2. ソースコードから直接ビルド（改ざん不能）</w:t>
+        <w:t>ソースコードから直接ビルド（改ざん不能）</w:t>
+      </w:r>
+      <w:r>
+        <w:t>: 「Deploy to Vercel」でGitHub上のコードがあなたのGitHubに複製され自動ビルドされるため、開発者が裏で別のコードを差し挟む余地はありません。</w:t>
       </w:r>
     </w:p>
     <w:p>
       <w:pPr>
-        <w:spacing w:after="90" w:line="288" w:lineRule="auto"/>
+        <w:pStyle w:val="ListNumber"/>
+        <w:spacing w:after="50"/>
       </w:pPr>
-      <w:r>
-        <w:t>「Deploy to Vercel」ボタンを押すと、GitHub上の公開コードがそのままあなた自身のGitHubアカウントに複製（Fork）され、そこから自動ビルドされます。開発者が裏で別のプログラムを差し挟む余地は一切ありません。</w:t>
-      </w:r>
-    </w:p>
-    <w:p>
-      <w:pPr>
-        <w:spacing w:before="180" w:after="60"/>
-      </w:pPr>
-      <w:r>
-        <w:rPr>
-          <w:rFonts w:ascii="Yu Gothic" w:hAnsi="Yu Gothic" w:eastAsia="Yu Gothic"/>
-          <w:b/>
-          <w:color w:val="374151"/>
-          <w:sz w:val="23"/>
-        </w:rPr>
-        <w:t>3. ブラウザ（F12）で通信先をいつでも検証可能</w:t>
-      </w:r>
-    </w:p>
-    <w:p>
-      <w:pPr>
-        <w:spacing w:after="90" w:line="288" w:lineRule="auto"/>
-      </w:pPr>
-      <w:r>
-        <w:t>ブラウザの開発者ツール（F12）の「Network（ネットワーク）」タブを開くことで、</w:t>
-      </w:r>
       <w:r>
         <w:rPr>
           <w:b/>
         </w:rPr>
-        <w:t>「通信相手がGoogle公式サーバー（`googleapis.com`）とあなた自身のVercelサーバーのみであること」</w:t>
+        <w:t>ブラウザ（F12）で通信先をいつでも検証可能</w:t>
       </w:r>
       <w:r>
-        <w:t xml:space="preserve"> をリアルタイムに直接確認できます。</w:t>
+        <w:t>: 開発者ツールの「Network」タブから、通信相手が「公式クラウドAPI／自宅NAS」と「あなた自身のVercelサーバー」のみであることを直接確認できます。</w:t>
       </w:r>
     </w:p>
     <w:p>
@@ -358,7 +438,7 @@
           <w:i/>
           <w:color w:val="4B5563"/>
         </w:rPr>
-        <w:t>本サービスはオープンソースの個人利用向けツールです。Googleドライブ内の書籍ファイルは「読み取り専用」で安全に取得され、サーバー上にデータが保存・収集されることはありません。利用規約および免責事項をご確認のうえ、自己責任にてご利用ください。</w:t>
+        <w:t>本サービスはオープンソースの個人利用向けツールです。ファイルは「読み取り専用」で安全に取得され、サーバー上にデータが保存・収集されることはありません。利用規約および免責事項をご確認のうえ、自己責任にてご利用ください。</w:t>
       </w:r>
     </w:p>
     <w:p>
@@ -377,27 +457,7 @@
           <w:color w:val="1D4ED8"/>
           <w:sz w:val="27"/>
         </w:rPr>
-        <w:t>🚀 【約5分】自分専用リーダーの立ち上げ手順（完全図解）</w:t>
-      </w:r>
-    </w:p>
-    <w:p>
-      <w:pPr>
-        <w:spacing w:before="60" w:after="120"/>
-        <w:ind w:left="288"/>
-      </w:pPr>
-      <w:r>
-        <w:rPr>
-          <w:rFonts w:ascii="Consolas" w:hAnsi="Consolas"/>
-          <w:color w:val="333333"/>
-          <w:sz w:val="19"/>
-        </w:rPr>
-        <w:t>flowchart LR</w:t>
-        <w:br/>
-        <w:t xml:space="preserve">    A["① Google Cloudで&lt;br/&gt;無料APIキーを取得"] --&gt; B["② 『Deploy to Vercel』&lt;br/&gt;ボタンでデプロイ"]</w:t>
-        <w:br/>
-        <w:t xml:space="preserve">    B --&gt; C["③ リダイレクトURIを&lt;br/&gt;登録して完了！"]</w:t>
-        <w:br/>
-        <w:t xml:space="preserve">    C --&gt; D["🎉 あなた専用の&lt;br/&gt;爆速リーダーが完成！"]</w:t>
+        <w:t>🔵 Microsoft OneDrive の設定手順</w:t>
       </w:r>
     </w:p>
     <w:p>
@@ -411,7 +471,38 @@
           <w:color w:val="374151"/>
           <w:sz w:val="23"/>
         </w:rPr>
-        <w:t>ステップ1: Google Cloud で無料APIキーを取得（約3分）</w:t>
+        <w:t>一般利用の場合</w:t>
+      </w:r>
+    </w:p>
+    <w:p>
+      <w:pPr>
+        <w:spacing w:after="90" w:line="288" w:lineRule="auto"/>
+      </w:pPr>
+      <w:r>
+        <w:t xml:space="preserve">トップページの </w:t>
+      </w:r>
+      <w:r>
+        <w:rPr>
+          <w:b/>
+        </w:rPr>
+        <w:t>「OneDrive でログイン」</w:t>
+      </w:r>
+      <w:r>
+        <w:t xml:space="preserve"> ボタンをクリックし、お使いの Microsoft アカウントでサインインするだけです。本棚画面でアプリ内フォルダピッカーから本棚フォルダを選択してください。</w:t>
+      </w:r>
+    </w:p>
+    <w:p>
+      <w:pPr>
+        <w:spacing w:before="180" w:after="60"/>
+      </w:pPr>
+      <w:r>
+        <w:rPr>
+          <w:rFonts w:ascii="Yu Gothic" w:hAnsi="Yu Gothic" w:eastAsia="Yu Gothic"/>
+          <w:b/>
+          <w:color w:val="374151"/>
+          <w:sz w:val="23"/>
+        </w:rPr>
+        <w:t>セルフホスト（Vercel）で独自キーを設定する場合</w:t>
       </w:r>
     </w:p>
     <w:p>
@@ -424,10 +515,28 @@
           <w:color w:val="1D4ED8"/>
           <w:u w:val="single"/>
         </w:rPr>
-        <w:t>Google Cloud Console (https://console.cloud.google.com/)</w:t>
+        <w:t>Azure Portal (アプリの登録) (https://portal.azure.com/#view/Microsoft_AAD_RegisteredApps/ApplicationsListBlade)</w:t>
       </w:r>
       <w:r>
-        <w:t xml:space="preserve"> にログインし、新しいプロジェクト（例: </w:t>
+        <w:t xml:space="preserve"> で「新規登録」。</w:t>
+      </w:r>
+    </w:p>
+    <w:p>
+      <w:pPr>
+        <w:pStyle w:val="ListBullet"/>
+        <w:spacing w:after="50"/>
+      </w:pPr>
+      <w:r>
+        <w:t>アカウントの種類: 「任意の組織ディレクトリ内のアカウントと、個人用の Microsoft アカウント」</w:t>
+      </w:r>
+    </w:p>
+    <w:p>
+      <w:pPr>
+        <w:pStyle w:val="ListBullet"/>
+        <w:spacing w:after="50"/>
+      </w:pPr>
+      <w:r>
+        <w:t xml:space="preserve">リダイレクト URI: </w:t>
       </w:r>
       <w:r>
         <w:rPr>
@@ -435,10 +544,7 @@
           <w:color w:val="C0392B"/>
           <w:sz w:val="19"/>
         </w:rPr>
-        <w:t>My-BookReader</w:t>
-      </w:r>
-      <w:r>
-        <w:t>）を作成します。</w:t>
+        <w:t>https://your-domain.vercel.app/api/auth/callback/azure-ad</w:t>
       </w:r>
     </w:p>
     <w:p>
@@ -447,43 +553,40 @@
         <w:spacing w:after="50"/>
       </w:pPr>
       <w:r>
-        <w:t xml:space="preserve">左メニュー </w:t>
+        <w:t xml:space="preserve">「API のアクセス許可」で </w:t>
       </w:r>
       <w:r>
         <w:rPr>
-          <w:b/>
+          <w:rFonts w:ascii="Consolas" w:hAnsi="Consolas"/>
+          <w:color w:val="C0392B"/>
+          <w:sz w:val="19"/>
         </w:rPr>
-        <w:t>「APIとサービス」→「ライブラリ」</w:t>
+        <w:t>Files.Read</w:t>
       </w:r>
       <w:r>
-        <w:t xml:space="preserve"> を開き、</w:t>
+        <w:t>、</w:t>
       </w:r>
       <w:r>
         <w:rPr>
-          <w:b/>
+          <w:rFonts w:ascii="Consolas" w:hAnsi="Consolas"/>
+          <w:color w:val="C0392B"/>
+          <w:sz w:val="19"/>
         </w:rPr>
-        <w:t>`Google Drive API`</w:t>
+        <w:t>Files.ReadWrite.AppFolder</w:t>
       </w:r>
       <w:r>
-        <w:t xml:space="preserve"> と </w:t>
+        <w:t>、</w:t>
       </w:r>
       <w:r>
         <w:rPr>
-          <w:b/>
+          <w:rFonts w:ascii="Consolas" w:hAnsi="Consolas"/>
+          <w:color w:val="C0392B"/>
+          <w:sz w:val="19"/>
         </w:rPr>
-        <w:t>`Google Picker API`</w:t>
+        <w:t>offline_access</w:t>
       </w:r>
       <w:r>
-        <w:t xml:space="preserve"> をそれぞれ検索して </w:t>
-      </w:r>
-      <w:r>
-        <w:rPr>
-          <w:b/>
-        </w:rPr>
-        <w:t>「有効にする」</w:t>
-      </w:r>
-      <w:r>
-        <w:t xml:space="preserve"> をクリックします。</w:t>
+        <w:t xml:space="preserve"> を追加。</w:t>
       </w:r>
     </w:p>
     <w:p>
@@ -492,46 +595,7 @@
         <w:spacing w:after="50"/>
       </w:pPr>
       <w:r>
-        <w:t xml:space="preserve">左メニュー </w:t>
-      </w:r>
-      <w:r>
-        <w:rPr>
-          <w:b/>
-        </w:rPr>
-        <w:t>「OAuth 同意画面」</w:t>
-      </w:r>
-      <w:r>
-        <w:t xml:space="preserve"> を開き、以下を設定します：</w:t>
-      </w:r>
-    </w:p>
-    <w:p>
-      <w:pPr>
-        <w:pStyle w:val="ListBullet"/>
-        <w:spacing w:after="50"/>
-      </w:pPr>
-      <w:r>
-        <w:rPr>
-          <w:b/>
-        </w:rPr>
-        <w:t>User Type</w:t>
-      </w:r>
-      <w:r>
-        <w:t>: 「外部」を選択して作成</w:t>
-      </w:r>
-    </w:p>
-    <w:p>
-      <w:pPr>
-        <w:pStyle w:val="ListBullet"/>
-        <w:spacing w:after="50"/>
-      </w:pPr>
-      <w:r>
-        <w:rPr>
-          <w:b/>
-        </w:rPr>
-        <w:t>アプリ名</w:t>
-      </w:r>
-      <w:r>
-        <w:t xml:space="preserve">: </w:t>
+        <w:t xml:space="preserve">クライアントシークレットを発行し、Vercel の環境変数に </w:t>
       </w:r>
       <w:r>
         <w:rPr>
@@ -539,37 +603,10 @@
           <w:color w:val="C0392B"/>
           <w:sz w:val="19"/>
         </w:rPr>
-        <w:t>Cloud BookReader</w:t>
-      </w:r>
-    </w:p>
-    <w:p>
-      <w:pPr>
-        <w:pStyle w:val="ListBullet"/>
-        <w:spacing w:after="50"/>
-      </w:pPr>
-      <w:r>
-        <w:rPr>
-          <w:b/>
-        </w:rPr>
-        <w:t>ユーザーサポートメール / デベロッパーの連絡先</w:t>
+        <w:t>AZURE_AD_CLIENT_ID</w:t>
       </w:r>
       <w:r>
-        <w:t>: ご自身のGmailアドレス</w:t>
-      </w:r>
-    </w:p>
-    <w:p>
-      <w:pPr>
-        <w:pStyle w:val="ListBullet"/>
-        <w:spacing w:after="50"/>
-      </w:pPr>
-      <w:r>
-        <w:rPr>
-          <w:b/>
-        </w:rPr>
-        <w:t>スコープ</w:t>
-      </w:r>
-      <w:r>
-        <w:t xml:space="preserve">: </w:t>
+        <w:t>、</w:t>
       </w:r>
       <w:r>
         <w:rPr>
@@ -577,10 +614,10 @@
           <w:color w:val="C0392B"/>
           <w:sz w:val="19"/>
         </w:rPr>
-        <w:t>.../auth/drive.readonly</w:t>
+        <w:t>AZURE_AD_CLIENT_SECRET</w:t>
       </w:r>
       <w:r>
-        <w:t xml:space="preserve"> と </w:t>
+        <w:t>、</w:t>
       </w:r>
       <w:r>
         <w:rPr>
@@ -588,120 +625,30 @@
           <w:color w:val="C0392B"/>
           <w:sz w:val="19"/>
         </w:rPr>
-        <w:t>.../auth/drive.appdata</w:t>
+        <w:t>AZURE_AD_TENANT_ID=common</w:t>
       </w:r>
       <w:r>
-        <w:t xml:space="preserve"> を追加</w:t>
-      </w:r>
-    </w:p>
-    <w:p>
-      <w:pPr>
-        <w:pStyle w:val="ListBullet"/>
-        <w:spacing w:after="50"/>
-      </w:pPr>
-      <w:r>
-        <w:rPr>
-          <w:b/>
-        </w:rPr>
-        <w:t>テストユーザー</w:t>
-      </w:r>
-      <w:r>
-        <w:t>: ご自身のGmailアドレスを追加して保存</w:t>
-      </w:r>
-    </w:p>
-    <w:p>
-      <w:pPr>
-        <w:pStyle w:val="ListNumber"/>
-        <w:spacing w:after="50"/>
-      </w:pPr>
-      <w:r>
-        <w:t xml:space="preserve">左メニュー </w:t>
-      </w:r>
-      <w:r>
-        <w:rPr>
-          <w:b/>
-        </w:rPr>
-        <w:t>「認証情報」→「＋認証情報を作成」→「OAuth クライアント ID」</w:t>
-      </w:r>
-      <w:r>
-        <w:t xml:space="preserve"> を選択します：</w:t>
-      </w:r>
-    </w:p>
-    <w:p>
-      <w:pPr>
-        <w:pStyle w:val="ListBullet"/>
-        <w:spacing w:after="50"/>
-      </w:pPr>
-      <w:r>
-        <w:rPr>
-          <w:b/>
-        </w:rPr>
-        <w:t>アプリケーションの種類</w:t>
-      </w:r>
-      <w:r>
-        <w:t>: 「ウェブ アプリケーション」</w:t>
-      </w:r>
-    </w:p>
-    <w:p>
-      <w:pPr>
-        <w:pStyle w:val="ListBullet"/>
-        <w:spacing w:after="50"/>
-      </w:pPr>
-      <w:r>
-        <w:rPr>
-          <w:b/>
-        </w:rPr>
-        <w:t>名前</w:t>
-      </w:r>
-      <w:r>
-        <w:t xml:space="preserve">: </w:t>
-      </w:r>
-      <w:r>
-        <w:rPr>
-          <w:rFonts w:ascii="Consolas" w:hAnsi="Consolas"/>
-          <w:color w:val="C0392B"/>
-          <w:sz w:val="19"/>
-        </w:rPr>
-        <w:t>Cloud BookReader Client</w:t>
-      </w:r>
-    </w:p>
-    <w:p>
-      <w:pPr>
-        <w:pStyle w:val="ListBullet"/>
-        <w:spacing w:after="50"/>
-      </w:pPr>
-      <w:r>
-        <w:rPr>
-          <w:b/>
-        </w:rPr>
-        <w:t>「作成」</w:t>
-      </w:r>
-      <w:r>
-        <w:t xml:space="preserve"> を押すと、画面に </w:t>
-      </w:r>
-      <w:r>
-        <w:rPr>
-          <w:b/>
-        </w:rPr>
-        <w:t>「クライアント ID」</w:t>
-      </w:r>
-      <w:r>
-        <w:t xml:space="preserve"> と </w:t>
-      </w:r>
-      <w:r>
-        <w:rPr>
-          <w:b/>
-        </w:rPr>
-        <w:t>「クライアント シークレット」</w:t>
-      </w:r>
-      <w:r>
-        <w:t xml:space="preserve"> が表示されます（後で使うのでコピーしておきます）。</w:t>
+        <w:t xml:space="preserve"> を設定して再デプロイ。</w:t>
       </w:r>
     </w:p>
     <w:p>
       <w:pPr>
         <w:spacing w:after="80"/>
       </w:pPr>
+    </w:p>
+    <w:p>
+      <w:pPr>
+        <w:spacing w:before="240" w:after="100"/>
+      </w:pPr>
+      <w:r>
+        <w:rPr>
+          <w:rFonts w:ascii="Yu Gothic" w:hAnsi="Yu Gothic" w:eastAsia="Yu Gothic"/>
+          <w:b/>
+          <w:color w:val="1D4ED8"/>
+          <w:sz w:val="27"/>
+        </w:rPr>
+        <w:t>🏠 自宅NAS（WebDAV）の設定・接続手順</w:t>
+      </w:r>
     </w:p>
     <w:p>
       <w:pPr>
@@ -714,7 +661,22 @@
           <w:color w:val="374151"/>
           <w:sz w:val="23"/>
         </w:rPr>
-        <w:t>ステップ2: Vercel にワンクリックでデプロイ（約2分）</w:t>
+        <w:t>1. NAS側のWebDAVサーバー有効化</w:t>
+      </w:r>
+    </w:p>
+    <w:p>
+      <w:pPr>
+        <w:pStyle w:val="ListBullet"/>
+        <w:spacing w:after="50"/>
+      </w:pPr>
+      <w:r>
+        <w:rPr>
+          <w:b/>
+        </w:rPr>
+        <w:t>Synology NAS</w:t>
+      </w:r>
+      <w:r>
+        <w:t>:</w:t>
       </w:r>
     </w:p>
     <w:p>
@@ -723,40 +685,16 @@
         <w:spacing w:after="50"/>
       </w:pPr>
       <w:r>
-        <w:t xml:space="preserve">以下の </w:t>
+        <w:t xml:space="preserve">パッケージセンターから </w:t>
       </w:r>
       <w:r>
         <w:rPr>
           <w:b/>
         </w:rPr>
-        <w:t>「Deploy to Vercel」</w:t>
+        <w:t>「WebDAV Server」</w:t>
       </w:r>
       <w:r>
-        <w:t xml:space="preserve"> ボタンをクリックします：</w:t>
-      </w:r>
-    </w:p>
-    <w:p>
-      <w:pPr>
-        <w:spacing w:after="90" w:line="288" w:lineRule="auto"/>
-      </w:pPr>
-      <w:r>
-        <w:rPr>
-          <w:color w:val="1D4ED8"/>
-          <w:u w:val="single"/>
-        </w:rPr>
-        <w:t>![Deploy with Vercel (https://vercel.com/button)</w:t>
-      </w:r>
-      <w:r>
-        <w:t>](https://vercel.com/new/clone?repository-url=https%3A%2F%2Fgithub.com%2Fryo22-jp%2FCloud-Bookreader&amp;env=GOOGLE_CLIENT_ID,GOOGLE_CLIENT_SECRET,NEXTAUTH_SECRET,NEXTAUTH_URL&amp;envDescription=Google%20Cloud%20Console%E3%81%A7%E5%8F%96%E5%BE%97%E3%81%97%E3%81%9F%E8%A8%AD%E5%AE%9A%E5%80%A4%E3%82%92%E5%85%A5%E5%8A%9B%E3%81%97%E3%81%A6%E3%81%8F%E3%81%A0%E3%81%95%E3%81%84&amp;project-name=my-cloud-bookreader)</w:t>
-      </w:r>
-    </w:p>
-    <w:p>
-      <w:pPr>
-        <w:pStyle w:val="ListNumber"/>
-        <w:spacing w:after="50"/>
-      </w:pPr>
-      <w:r>
-        <w:t>Vercel（無料アカウント）にログインし、GitHubリポジトリの作成先（ご自身のアカウント）を選択します。</w:t>
+        <w:t xml:space="preserve"> をインストール。</w:t>
       </w:r>
     </w:p>
     <w:p>
@@ -768,77 +706,19 @@
         <w:rPr>
           <w:b/>
         </w:rPr>
-        <w:t>Environment Variables（環境変数）</w:t>
+        <w:t>「HTTPS を有効にする (ポート: 5006)」</w:t>
       </w:r>
       <w:r>
-        <w:t xml:space="preserve"> の入力欄が表示されるので、以下を入力します：</w:t>
+        <w:t>（推奨）にチェックを入れて適用。</w:t>
       </w:r>
     </w:p>
     <w:p>
       <w:pPr>
-        <w:spacing w:after="90" w:line="288" w:lineRule="auto"/>
+        <w:pStyle w:val="ListNumber"/>
+        <w:spacing w:after="50"/>
       </w:pPr>
       <w:r>
-        <w:t>| 環境変数名 | 入力する値 |</w:t>
-      </w:r>
-    </w:p>
-    <w:p>
-      <w:pPr>
-        <w:spacing w:after="90" w:line="288" w:lineRule="auto"/>
-      </w:pPr>
-      <w:r>
-        <w:t>| :--- | :--- |</w:t>
-      </w:r>
-    </w:p>
-    <w:p>
-      <w:pPr>
-        <w:spacing w:after="90" w:line="288" w:lineRule="auto"/>
-      </w:pPr>
-      <w:r>
-        <w:t xml:space="preserve">| </w:t>
-      </w:r>
-      <w:r>
-        <w:rPr>
-          <w:b/>
-        </w:rPr>
-        <w:t>`GOOGLE_CLIENT_ID`</w:t>
-      </w:r>
-      <w:r>
-        <w:t xml:space="preserve"> | ステップ1でコピーしたクライアントID |</w:t>
-      </w:r>
-    </w:p>
-    <w:p>
-      <w:pPr>
-        <w:spacing w:after="90" w:line="288" w:lineRule="auto"/>
-      </w:pPr>
-      <w:r>
-        <w:t xml:space="preserve">| </w:t>
-      </w:r>
-      <w:r>
-        <w:rPr>
-          <w:b/>
-        </w:rPr>
-        <w:t>`GOOGLE_CLIENT_SECRET`</w:t>
-      </w:r>
-      <w:r>
-        <w:t xml:space="preserve"> | ステップ1でコピーしたクライアントシークレット |</w:t>
-      </w:r>
-    </w:p>
-    <w:p>
-      <w:pPr>
-        <w:spacing w:after="90" w:line="288" w:lineRule="auto"/>
-      </w:pPr>
-      <w:r>
-        <w:t xml:space="preserve">| </w:t>
-      </w:r>
-      <w:r>
-        <w:rPr>
-          <w:b/>
-        </w:rPr>
-        <w:t>`NEXTAUTH_SECRET`</w:t>
-      </w:r>
-      <w:r>
-        <w:t xml:space="preserve"> | ランダムな英数字32文字以上（例: </w:t>
+        <w:t xml:space="preserve">接続URL例: </w:t>
       </w:r>
       <w:r>
         <w:rPr>
@@ -846,38 +726,40 @@
           <w:color w:val="C0392B"/>
           <w:sz w:val="19"/>
         </w:rPr>
-        <w:t>mysecretkey1234567890abcdefghijklmn</w:t>
-      </w:r>
-      <w:r>
-        <w:t>） |</w:t>
+        <w:t>https://your-nas.synology.me:5006</w:t>
       </w:r>
     </w:p>
     <w:p>
       <w:pPr>
-        <w:spacing w:after="90" w:line="288" w:lineRule="auto"/>
+        <w:pStyle w:val="ListBullet"/>
+        <w:spacing w:after="50"/>
       </w:pPr>
       <w:r>
-        <w:t xml:space="preserve">| </w:t>
+        <w:rPr>
+          <w:b/>
+        </w:rPr>
+        <w:t>QNAP NAS</w:t>
+      </w:r>
+      <w:r>
+        <w:t>:</w:t>
+      </w:r>
+    </w:p>
+    <w:p>
+      <w:pPr>
+        <w:pStyle w:val="ListNumber"/>
+        <w:spacing w:after="50"/>
+      </w:pPr>
+      <w:r>
+        <w:t xml:space="preserve">コントロールパネル →「アプリケーション」→ </w:t>
       </w:r>
       <w:r>
         <w:rPr>
           <w:b/>
         </w:rPr>
-        <w:t>`NEXTAUTH_URL`</w:t>
+        <w:t>「WebDAV」</w:t>
       </w:r>
       <w:r>
-        <w:t xml:space="preserve"> | </w:t>
-      </w:r>
-      <w:r>
-        <w:rPr>
-          <w:rFonts w:ascii="Consolas" w:hAnsi="Consolas"/>
-          <w:color w:val="C0392B"/>
-          <w:sz w:val="19"/>
-        </w:rPr>
-        <w:t>https://my-cloud-bookreader.vercel.app</w:t>
-      </w:r>
-      <w:r>
-        <w:t>（※仮でOK。デプロイ後に確定URLを入れます） |</w:t>
+        <w:t xml:space="preserve"> を開く。</w:t>
       </w:r>
     </w:p>
     <w:p>
@@ -889,10 +771,19 @@
         <w:rPr>
           <w:b/>
         </w:rPr>
-        <w:t>「Deploy」</w:t>
+        <w:t>「WebDAV を有効にする」</w:t>
       </w:r>
       <w:r>
-        <w:t xml:space="preserve"> ボタンを押します。約1分でデプロイが完了し、あなた専用のURL（例: </w:t>
+        <w:t>（ポート: 5001等）にチェックを入れて適用。</w:t>
+      </w:r>
+    </w:p>
+    <w:p>
+      <w:pPr>
+        <w:pStyle w:val="ListNumber"/>
+        <w:spacing w:after="50"/>
+      </w:pPr>
+      <w:r>
+        <w:t xml:space="preserve">接続URL例: </w:t>
       </w:r>
       <w:r>
         <w:rPr>
@@ -900,16 +791,52 @@
           <w:color w:val="C0392B"/>
           <w:sz w:val="19"/>
         </w:rPr>
-        <w:t>https://my-cloud-bookreader.vercel.app</w:t>
-      </w:r>
-      <w:r>
-        <w:t>）が発行されます！</w:t>
+        <w:t>https://your-nas.myqnapcloud.com:5001</w:t>
       </w:r>
     </w:p>
     <w:p>
       <w:pPr>
-        <w:spacing w:after="80"/>
+        <w:pStyle w:val="ListBullet"/>
+        <w:spacing w:after="50"/>
       </w:pPr>
+      <w:r>
+        <w:rPr>
+          <w:b/>
+        </w:rPr>
+        <w:t>Nextcloud / ownCloud</w:t>
+      </w:r>
+      <w:r>
+        <w:t>:</w:t>
+      </w:r>
+    </w:p>
+    <w:p>
+      <w:pPr>
+        <w:pStyle w:val="ListNumber"/>
+        <w:spacing w:after="50"/>
+      </w:pPr>
+      <w:r>
+        <w:t xml:space="preserve">Web画面左下の「ファイル設定」に表示される </w:t>
+      </w:r>
+      <w:r>
+        <w:rPr>
+          <w:b/>
+        </w:rPr>
+        <w:t>WebDAV URL</w:t>
+      </w:r>
+      <w:r>
+        <w:t xml:space="preserve">（例: </w:t>
+      </w:r>
+      <w:r>
+        <w:rPr>
+          <w:rFonts w:ascii="Consolas" w:hAnsi="Consolas"/>
+          <w:color w:val="C0392B"/>
+          <w:sz w:val="19"/>
+        </w:rPr>
+        <w:t>https://your-nextcloud.com/remote.php/dav/files/username/</w:t>
+      </w:r>
+      <w:r>
+        <w:t>）をコピー。</w:t>
+      </w:r>
     </w:p>
     <w:p>
       <w:pPr>
@@ -922,35 +849,7 @@
           <w:color w:val="374151"/>
           <w:sz w:val="23"/>
         </w:rPr>
-        <w:t>ステップ3: Google Cloud にURLを登録して完成！</w:t>
-      </w:r>
-    </w:p>
-    <w:p>
-      <w:pPr>
-        <w:pStyle w:val="ListNumber"/>
-        <w:spacing w:after="50"/>
-      </w:pPr>
-      <w:r>
-        <w:t xml:space="preserve">再び </w:t>
-      </w:r>
-      <w:r>
-        <w:rPr>
-          <w:color w:val="1D4ED8"/>
-          <w:u w:val="single"/>
-        </w:rPr>
-        <w:t>Google Cloud Console (認証情報) (https://console.cloud.google.com/apis/credentials)</w:t>
-      </w:r>
-      <w:r>
-        <w:t xml:space="preserve"> を開き、作成した「OAuth 2.0 クライアント ID」をクリックします。</w:t>
-      </w:r>
-    </w:p>
-    <w:p>
-      <w:pPr>
-        <w:pStyle w:val="ListNumber"/>
-        <w:spacing w:after="50"/>
-      </w:pPr>
-      <w:r>
-        <w:t>以下を追加して保存します：</w:t>
+        <w:t>2. 外出先からの接続について</w:t>
       </w:r>
     </w:p>
     <w:p>
@@ -962,10 +861,10 @@
         <w:rPr>
           <w:b/>
         </w:rPr>
-        <w:t>承認済みの JavaScript 生成元</w:t>
+        <w:t>自宅Wi-Fi内のみで読む場合</w:t>
       </w:r>
       <w:r>
-        <w:t xml:space="preserve">: </w:t>
+        <w:t xml:space="preserve">: ローカルIP（例: </w:t>
       </w:r>
       <w:r>
         <w:rPr>
@@ -973,7 +872,10 @@
           <w:color w:val="C0392B"/>
           <w:sz w:val="19"/>
         </w:rPr>
-        <w:t>https://発行されたあなた専用のURL</w:t>
+        <w:t>http://192.168.1.100:5005</w:t>
+      </w:r>
+      <w:r>
+        <w:t>）でOK。</w:t>
       </w:r>
     </w:p>
     <w:p>
@@ -985,18 +887,24 @@
         <w:rPr>
           <w:b/>
         </w:rPr>
-        <w:t>承認済みのリダイレクト URI</w:t>
+        <w:t>外出先から読む場合</w:t>
       </w:r>
       <w:r>
-        <w:t xml:space="preserve">: </w:t>
+        <w:t>: NASのDDNS（Synology DDNS / myQNAPcloud）を設定してルーターのWebDAVポート（5006等）を開放するか、Tailscale や Cloudflare Tunnel 等をご利用ください。</w:t>
       </w:r>
+    </w:p>
+    <w:p>
+      <w:pPr>
+        <w:spacing w:before="180" w:after="60"/>
+      </w:pPr>
       <w:r>
         <w:rPr>
-          <w:rFonts w:ascii="Consolas" w:hAnsi="Consolas"/>
-          <w:color w:val="C0392B"/>
-          <w:sz w:val="19"/>
+          <w:rFonts w:ascii="Yu Gothic" w:hAnsi="Yu Gothic" w:eastAsia="Yu Gothic"/>
+          <w:b/>
+          <w:color w:val="374151"/>
+          <w:sz w:val="23"/>
         </w:rPr>
-        <w:t>https://発行されたあなた専用のURL/api/auth/callback/google</w:t>
+        <w:t>3. アプリでの接続</w:t>
       </w:r>
     </w:p>
     <w:p>
@@ -1005,7 +913,34 @@
         <w:spacing w:after="50"/>
       </w:pPr>
       <w:r>
-        <w:t>Vercelの「Settings」→「Environment Variables」で、</w:t>
+        <w:t xml:space="preserve">トップ画面の </w:t>
+      </w:r>
+      <w:r>
+        <w:rPr>
+          <w:b/>
+        </w:rPr>
+        <w:t>「自宅NAS (WebDAV) で接続」</w:t>
+      </w:r>
+      <w:r>
+        <w:t xml:space="preserve"> をクリック。</w:t>
+      </w:r>
+    </w:p>
+    <w:p>
+      <w:pPr>
+        <w:pStyle w:val="ListNumber"/>
+        <w:spacing w:after="50"/>
+      </w:pPr>
+      <w:r>
+        <w:t>サーバーURL、ユーザー名、パスワードを入力して「NASに接続」。</w:t>
+      </w:r>
+    </w:p>
+    <w:p>
+      <w:pPr>
+        <w:pStyle w:val="ListNumber"/>
+        <w:spacing w:after="50"/>
+      </w:pPr>
+      <w:r>
+        <w:t xml:space="preserve">フォルダ選択で、自炊本が入っている共有フォルダ（例: </w:t>
       </w:r>
       <w:r>
         <w:rPr>
@@ -1013,35 +948,10 @@
           <w:color w:val="C0392B"/>
           <w:sz w:val="19"/>
         </w:rPr>
-        <w:t>NEXTAUTH_URL</w:t>
+        <w:t>/volume1/manga</w:t>
       </w:r>
       <w:r>
-        <w:t xml:space="preserve"> を </w:t>
-      </w:r>
-      <w:r>
-        <w:rPr>
-          <w:rFonts w:ascii="Consolas" w:hAnsi="Consolas"/>
-          <w:color w:val="C0392B"/>
-          <w:sz w:val="19"/>
-        </w:rPr>
-        <w:t>https://発行されたあなた専用のURL</w:t>
-      </w:r>
-      <w:r>
-        <w:t xml:space="preserve"> に更新し、再デプロイ（Redeploy）します。</w:t>
-      </w:r>
-    </w:p>
-    <w:p>
-      <w:pPr>
-        <w:spacing w:after="90" w:line="288" w:lineRule="auto"/>
-      </w:pPr>
-      <w:r>
-        <w:t xml:space="preserve">🎉 </w:t>
-      </w:r>
-      <w:r>
-        <w:rPr>
-          <w:b/>
-        </w:rPr>
-        <w:t>これですべて完了です！発行されたURLを開いてGoogleログインすれば、あなた専用のリーダーが一生涯無料で動きます！</w:t>
+        <w:t>）を指定すれば完了！</w:t>
       </w:r>
     </w:p>
     <w:p>
@@ -1074,7 +984,7 @@
           <w:color w:val="374151"/>
           <w:sz w:val="23"/>
         </w:rPr>
-        <w:t>1. 本棚フォルダの選択</w:t>
+        <w:t>1. ⚡ HTTP Range Request 爆速ストリーミング</w:t>
       </w:r>
     </w:p>
     <w:p>
@@ -1082,16 +992,7 @@
         <w:spacing w:after="90" w:line="288" w:lineRule="auto"/>
       </w:pPr>
       <w:r>
-        <w:t xml:space="preserve">トップ画面中央の </w:t>
-      </w:r>
-      <w:r>
-        <w:rPr>
-          <w:b/>
-        </w:rPr>
-        <w:t>「Googleドライブから本棚フォルダを選択」</w:t>
-      </w:r>
-      <w:r>
-        <w:t xml:space="preserve"> を押し、マンガや自炊本が入っているフォルダを指定します。フォルダ配下の書籍・サブフォルダが即座に一覧表示されます。</w:t>
+        <w:t>500MBを超える大容量ZIPやPDFでも、今開くページだけを瞬時にダウンロード。端末容量ゼロ・待ち時間ゼロで読書できます。</w:t>
       </w:r>
     </w:p>
     <w:p>
@@ -1105,52 +1006,24 @@
           <w:color w:val="374151"/>
           <w:sz w:val="23"/>
         </w:rPr>
-        <w:t>2. 📥 オフライン保存（最大5冊）の使い方</w:t>
+        <w:t>2. 📥 オフライン保存（最大5冊）</w:t>
       </w:r>
     </w:p>
     <w:p>
       <w:pPr>
-        <w:pStyle w:val="ListBullet"/>
-        <w:spacing w:after="50"/>
+        <w:spacing w:after="90" w:line="288" w:lineRule="auto"/>
       </w:pPr>
       <w:r>
-        <w:t xml:space="preserve">各書籍の右側にある </w:t>
+        <w:t xml:space="preserve">書籍行の </w:t>
       </w:r>
       <w:r>
         <w:rPr>
           <w:b/>
         </w:rPr>
-        <w:t>「📥（ダウンロード）」</w:t>
+        <w:t>「📥 アイコン」</w:t>
       </w:r>
       <w:r>
-        <w:t xml:space="preserve"> アイコンを押すと、ブラウザ内部の安全な保管庫に本が丸ごとキャッシュされます。</w:t>
-      </w:r>
-    </w:p>
-    <w:p>
-      <w:pPr>
-        <w:pStyle w:val="ListBullet"/>
-        <w:spacing w:after="50"/>
-      </w:pPr>
-      <w:r>
-        <w:t>保存された本は、</w:t>
-      </w:r>
-      <w:r>
-        <w:rPr>
-          <w:b/>
-        </w:rPr>
-        <w:t>機内モードや地下鉄など電波のない場所でも通信量ゼロ・待ち時間ゼロ</w:t>
-      </w:r>
-      <w:r>
-        <w:t xml:space="preserve"> で読書できます。</w:t>
-      </w:r>
-    </w:p>
-    <w:p>
-      <w:pPr>
-        <w:pStyle w:val="ListBullet"/>
-        <w:spacing w:after="50"/>
-      </w:pPr>
-      <w:r>
-        <w:t>不要になった本は「保存リストを見る」からゴミ箱アイコンですぐに削除できます。</w:t>
+        <w:t xml:space="preserve"> でワンタップ保存。地下鉄や機内モードなど電波のない環境でも完全通信ゼロで爆速読書できます。</w:t>
       </w:r>
     </w:p>
     <w:p>
@@ -1164,7 +1037,7 @@
           <w:color w:val="374151"/>
           <w:sz w:val="23"/>
         </w:rPr>
-        <w:t>3. スマートフォンでのアプリ化（PWA設定）</w:t>
+        <w:t>3. 📱 スマートフォンでのアプリ化（PWA設定）</w:t>
       </w:r>
     </w:p>
     <w:p>
@@ -1199,88 +1072,6 @@
     </w:p>
     <w:p>
       <w:pPr>
-        <w:pStyle w:val="ListBullet"/>
-        <w:spacing w:after="50"/>
-      </w:pPr>
-      <w:r>
-        <w:t>ホーム画面にアイコンが作成され、全画面専用アプリとして起動します。</w:t>
-      </w:r>
-    </w:p>
-    <w:p>
-      <w:pPr>
-        <w:spacing w:after="80"/>
-      </w:pPr>
-    </w:p>
-    <w:p>
-      <w:pPr>
-        <w:spacing w:before="240" w:after="100"/>
-      </w:pPr>
-      <w:r>
-        <w:rPr>
-          <w:rFonts w:ascii="Yu Gothic" w:hAnsi="Yu Gothic" w:eastAsia="Yu Gothic"/>
-          <w:b/>
-          <w:color w:val="1D4ED8"/>
-          <w:sz w:val="27"/>
-        </w:rPr>
-        <w:t>❓ よくある質問（FAQ）</w:t>
-      </w:r>
-    </w:p>
-    <w:p>
-      <w:pPr>
-        <w:spacing w:before="180" w:after="60"/>
-      </w:pPr>
-      <w:r>
-        <w:rPr>
-          <w:rFonts w:ascii="Yu Gothic" w:hAnsi="Yu Gothic" w:eastAsia="Yu Gothic"/>
-          <w:b/>
-          <w:color w:val="374151"/>
-          <w:sz w:val="23"/>
-        </w:rPr>
-        <w:t>Q. 本当に完全無料で使い続けられますか？</w:t>
-      </w:r>
-    </w:p>
-    <w:p>
-      <w:pPr>
-        <w:spacing w:before="40" w:after="60"/>
-        <w:ind w:left="288"/>
-      </w:pPr>
-      <w:r>
-        <w:rPr>
-          <w:i/>
-          <w:color w:val="4B5563"/>
-        </w:rPr>
-        <w:t>はい。Google Cloud も Vercel も無料枠が非常に大きく、個人での読書用途であれば料金が発生することは一切ありません。</w:t>
-      </w:r>
-    </w:p>
-    <w:p>
-      <w:pPr>
-        <w:spacing w:before="180" w:after="60"/>
-      </w:pPr>
-      <w:r>
-        <w:rPr>
-          <w:rFonts w:ascii="Yu Gothic" w:hAnsi="Yu Gothic" w:eastAsia="Yu Gothic"/>
-          <w:b/>
-          <w:color w:val="374151"/>
-          <w:sz w:val="23"/>
-        </w:rPr>
-        <w:t>Q. スマホの容量を消費しませんか？</w:t>
-      </w:r>
-    </w:p>
-    <w:p>
-      <w:pPr>
-        <w:spacing w:before="40" w:after="60"/>
-        <w:ind w:left="288"/>
-      </w:pPr>
-      <w:r>
-        <w:rPr>
-          <w:i/>
-          <w:color w:val="4B5563"/>
-        </w:rPr>
-        <w:t>通常ストリーミング時は端末容量を1MBも消費しません。オフライン保存時のみ指定した本（最大5冊・約500MB）が一時保存されますが、読み終わったらワンタップで削除して空き容量を戻せます。</w:t>
-      </w:r>
-    </w:p>
-    <w:p>
-      <w:pPr>
         <w:spacing w:after="80"/>
       </w:pPr>
     </w:p>
@@ -1289,7 +1080,7 @@
         <w:spacing w:after="90" w:line="288" w:lineRule="auto"/>
       </w:pPr>
       <w:r>
-        <w:t>あなただけの専用クラウド本棚で、快適な自炊読書ライフをお楽しみください！☕📖</w:t>
+        <w:t>あなただけの専用クラウド＆NAS本棚で、快適な自炊読書ライフをお楽しみください！☕📖</w:t>
       </w:r>
     </w:p>
     <w:sectPr>

</xml_diff>